<commit_message>
feat: add demo of letter of offer
- Added a mock version of the letter of offer generation that can be exported as both a word document and pdf
- Added a docker-compose for the Gotenberg service for document conversions
</commit_message>
<xml_diff>
--- a/apps/api/src/modules/applications/templates/arf-contract-facility-loo.docx
+++ b/apps/api/src/modules/applications/templates/arf-contract-facility-loo.docx
@@ -1,6 +1,6 @@
 
 <file path=word/document.xml><?xml version="1.0" encoding="utf-8"?>
-<w:document xmlns:mc="http://schemas.openxmlformats.org/markup-compatibility/2006" xmlns:r="http://schemas.openxmlformats.org/officeDocument/2006/relationships" xmlns:w="http://schemas.openxmlformats.org/wordprocessingml/2006/main" xmlns:w14="http://schemas.microsoft.com/office/word/2010/wordml" mc:Ignorable="w14 w15 w16se w16cid w16 w16cex w16sdtdh w16sdtfl w16du wp14">
+<w:document xmlns:wpc="http://schemas.microsoft.com/office/word/2010/wordprocessingCanvas" xmlns:cx="http://schemas.microsoft.com/office/drawing/2014/chartex" xmlns:cx1="http://schemas.microsoft.com/office/drawing/2015/9/8/chartex" xmlns:cx2="http://schemas.microsoft.com/office/drawing/2015/10/21/chartex" xmlns:cx3="http://schemas.microsoft.com/office/drawing/2016/5/9/chartex" xmlns:cx4="http://schemas.microsoft.com/office/drawing/2016/5/10/chartex" xmlns:cx5="http://schemas.microsoft.com/office/drawing/2016/5/11/chartex" xmlns:cx6="http://schemas.microsoft.com/office/drawing/2016/5/12/chartex" xmlns:cx7="http://schemas.microsoft.com/office/drawing/2016/5/13/chartex" xmlns:cx8="http://schemas.microsoft.com/office/drawing/2016/5/14/chartex" xmlns:mc="http://schemas.openxmlformats.org/markup-compatibility/2006" xmlns:aink="http://schemas.microsoft.com/office/drawing/2016/ink" xmlns:am3d="http://schemas.microsoft.com/office/drawing/2017/model3d" xmlns:o="urn:schemas-microsoft-com:office:office" xmlns:oel="http://schemas.microsoft.com/office/2019/extlst" xmlns:r="http://schemas.openxmlformats.org/officeDocument/2006/relationships" xmlns:m="http://schemas.openxmlformats.org/officeDocument/2006/math" xmlns:v="urn:schemas-microsoft-com:vml" xmlns:wp14="http://schemas.microsoft.com/office/word/2010/wordprocessingDrawing" xmlns:wp="http://schemas.openxmlformats.org/drawingml/2006/wordprocessingDrawing" xmlns:w10="urn:schemas-microsoft-com:office:word" xmlns:w="http://schemas.openxmlformats.org/wordprocessingml/2006/main" xmlns:w14="http://schemas.microsoft.com/office/word/2010/wordml" xmlns:w15="http://schemas.microsoft.com/office/word/2012/wordml" xmlns:w16cei="http://schemas.microsoft.com/office/word/2026/wordml/cei" xmlns:w16cex="http://schemas.microsoft.com/office/word/2018/wordml/cex" xmlns:w16cid="http://schemas.microsoft.com/office/word/2016/wordml/cid" xmlns:w16="http://schemas.microsoft.com/office/word/2018/wordml" xmlns:w16du="http://schemas.microsoft.com/office/word/2023/wordml/word16du" xmlns:w16sdtdh="http://schemas.microsoft.com/office/word/2020/wordml/sdtdatahash" xmlns:w16sdtfl="http://schemas.microsoft.com/office/word/2024/wordml/sdtformatlock" xmlns:w16se="http://schemas.microsoft.com/office/word/2015/wordml/symex" xmlns:wpg="http://schemas.microsoft.com/office/word/2010/wordprocessingGroup" xmlns:wpi="http://schemas.microsoft.com/office/word/2010/wordprocessingInk" xmlns:wne="http://schemas.microsoft.com/office/word/2006/wordml" xmlns:wps="http://schemas.microsoft.com/office/word/2010/wordprocessingShape" mc:Ignorable="w14 w15 w16se w16cid w16 w16cex w16sdtdh w16sdtfl w16du wp14">
   <w:body>
     <w:p>
       <w:pPr>
@@ -39,7 +39,25 @@
           <w:szCs w:val="20"/>
           <w:highlight w:val="yellow"/>
         </w:rPr>
-        <w:t>{issuer_id}</w:t>
+        <w:t>{</w:t>
+      </w:r>
+      <w:proofErr w:type="spellStart"/>
+      <w:r>
+        <w:rPr>
+          <w:sz w:val="20"/>
+          <w:szCs w:val="20"/>
+          <w:highlight w:val="yellow"/>
+        </w:rPr>
+        <w:t>issuer_id</w:t>
+      </w:r>
+      <w:proofErr w:type="spellEnd"/>
+      <w:r>
+        <w:rPr>
+          <w:sz w:val="20"/>
+          <w:szCs w:val="20"/>
+          <w:highlight w:val="yellow"/>
+        </w:rPr>
+        <w:t>}</w:t>
       </w:r>
     </w:p>
     <w:p>
@@ -79,7 +97,25 @@
           <w:szCs w:val="20"/>
           <w:highlight w:val="yellow"/>
         </w:rPr>
-        <w:t>{our_reference}</w:t>
+        <w:t>{</w:t>
+      </w:r>
+      <w:proofErr w:type="spellStart"/>
+      <w:r>
+        <w:rPr>
+          <w:sz w:val="20"/>
+          <w:szCs w:val="20"/>
+          <w:highlight w:val="yellow"/>
+        </w:rPr>
+        <w:t>our_reference</w:t>
+      </w:r>
+      <w:proofErr w:type="spellEnd"/>
+      <w:r>
+        <w:rPr>
+          <w:sz w:val="20"/>
+          <w:szCs w:val="20"/>
+          <w:highlight w:val="yellow"/>
+        </w:rPr>
+        <w:t>}</w:t>
       </w:r>
     </w:p>
     <w:p>
@@ -126,7 +162,25 @@
           <w:szCs w:val="20"/>
           <w:highlight w:val="yellow"/>
         </w:rPr>
-        <w:t>{letter_date}</w:t>
+        <w:t>{</w:t>
+      </w:r>
+      <w:proofErr w:type="spellStart"/>
+      <w:r>
+        <w:rPr>
+          <w:sz w:val="20"/>
+          <w:szCs w:val="20"/>
+          <w:highlight w:val="yellow"/>
+        </w:rPr>
+        <w:t>letter_date</w:t>
+      </w:r>
+      <w:proofErr w:type="spellEnd"/>
+      <w:r>
+        <w:rPr>
+          <w:sz w:val="20"/>
+          <w:szCs w:val="20"/>
+          <w:highlight w:val="yellow"/>
+        </w:rPr>
+        <w:t>}</w:t>
       </w:r>
     </w:p>
     <w:p>
@@ -190,7 +244,27 @@
           <w:szCs w:val="20"/>
           <w:highlight w:val="yellow"/>
         </w:rPr>
-        <w:t>{issuer_name}</w:t>
+        <w:t>{</w:t>
+      </w:r>
+      <w:proofErr w:type="spellStart"/>
+      <w:r>
+        <w:rPr>
+          <w:b/>
+          <w:sz w:val="20"/>
+          <w:szCs w:val="20"/>
+          <w:highlight w:val="yellow"/>
+        </w:rPr>
+        <w:t>issuer_name</w:t>
+      </w:r>
+      <w:proofErr w:type="spellEnd"/>
+      <w:r>
+        <w:rPr>
+          <w:b/>
+          <w:sz w:val="20"/>
+          <w:szCs w:val="20"/>
+          <w:highlight w:val="yellow"/>
+        </w:rPr>
+        <w:t>}</w:t>
       </w:r>
     </w:p>
     <w:p>
@@ -210,7 +284,27 @@
           <w:szCs w:val="20"/>
           <w:highlight w:val="yellow"/>
         </w:rPr>
-        <w:t>{issuer_registration_number}</w:t>
+        <w:t>{</w:t>
+      </w:r>
+      <w:proofErr w:type="spellStart"/>
+      <w:r>
+        <w:rPr>
+          <w:b/>
+          <w:sz w:val="20"/>
+          <w:szCs w:val="20"/>
+          <w:highlight w:val="yellow"/>
+        </w:rPr>
+        <w:t>issuer_registration_number</w:t>
+      </w:r>
+      <w:proofErr w:type="spellEnd"/>
+      <w:r>
+        <w:rPr>
+          <w:b/>
+          <w:sz w:val="20"/>
+          <w:szCs w:val="20"/>
+          <w:highlight w:val="yellow"/>
+        </w:rPr>
+        <w:t>}</w:t>
       </w:r>
     </w:p>
     <w:p>
@@ -227,7 +321,25 @@
           <w:szCs w:val="20"/>
           <w:highlight w:val="yellow"/>
         </w:rPr>
-        <w:t>{issuer_address}</w:t>
+        <w:t>{</w:t>
+      </w:r>
+      <w:proofErr w:type="spellStart"/>
+      <w:r>
+        <w:rPr>
+          <w:sz w:val="20"/>
+          <w:szCs w:val="20"/>
+          <w:highlight w:val="yellow"/>
+        </w:rPr>
+        <w:t>issuer_address</w:t>
+      </w:r>
+      <w:proofErr w:type="spellEnd"/>
+      <w:r>
+        <w:rPr>
+          <w:sz w:val="20"/>
+          <w:szCs w:val="20"/>
+          <w:highlight w:val="yellow"/>
+        </w:rPr>
+        <w:t>}</w:t>
       </w:r>
     </w:p>
     <w:p>
@@ -276,7 +388,25 @@
           <w:szCs w:val="20"/>
           <w:highlight w:val="yellow"/>
         </w:rPr>
-        <w:t>{attention_name}</w:t>
+        <w:t>{</w:t>
+      </w:r>
+      <w:proofErr w:type="spellStart"/>
+      <w:r>
+        <w:rPr>
+          <w:sz w:val="20"/>
+          <w:szCs w:val="20"/>
+          <w:highlight w:val="yellow"/>
+        </w:rPr>
+        <w:t>attention_name</w:t>
+      </w:r>
+      <w:proofErr w:type="spellEnd"/>
+      <w:r>
+        <w:rPr>
+          <w:sz w:val="20"/>
+          <w:szCs w:val="20"/>
+          <w:highlight w:val="yellow"/>
+        </w:rPr>
+        <w:t>}</w:t>
       </w:r>
     </w:p>
     <w:p>
@@ -307,7 +437,25 @@
           <w:szCs w:val="20"/>
           <w:highlight w:val="yellow"/>
         </w:rPr>
-        <w:t>{attention_position}</w:t>
+        <w:t>{</w:t>
+      </w:r>
+      <w:proofErr w:type="spellStart"/>
+      <w:r>
+        <w:rPr>
+          <w:sz w:val="20"/>
+          <w:szCs w:val="20"/>
+          <w:highlight w:val="yellow"/>
+        </w:rPr>
+        <w:t>attention_position</w:t>
+      </w:r>
+      <w:proofErr w:type="spellEnd"/>
+      <w:r>
+        <w:rPr>
+          <w:sz w:val="20"/>
+          <w:szCs w:val="20"/>
+          <w:highlight w:val="yellow"/>
+        </w:rPr>
+        <w:t>}</w:t>
       </w:r>
     </w:p>
     <w:p>
@@ -396,6 +544,7 @@
         </w:rPr>
         <w:t xml:space="preserve"> ACCOUNT RECEIVABLE FINANCING-</w:t>
       </w:r>
+      <w:proofErr w:type="spellStart"/>
       <w:r>
         <w:rPr>
           <w:b/>
@@ -407,6 +556,7 @@
         </w:rPr>
         <w:t>i</w:t>
       </w:r>
+      <w:proofErr w:type="spellEnd"/>
       <w:r>
         <w:rPr>
           <w:b/>
@@ -445,7 +595,55 @@
           <w:sz w:val="20"/>
           <w:szCs w:val="20"/>
         </w:rPr>
-        <w:t>We are pleased to inform you that Shoraka Suyula Platform Sdn. Bhd. (“</w:t>
+        <w:t xml:space="preserve">We are pleased to inform you that </w:t>
+      </w:r>
+      <w:proofErr w:type="spellStart"/>
+      <w:r>
+        <w:rPr>
+          <w:sz w:val="20"/>
+          <w:szCs w:val="20"/>
+        </w:rPr>
+        <w:t>Shoraka</w:t>
+      </w:r>
+      <w:proofErr w:type="spellEnd"/>
+      <w:r>
+        <w:rPr>
+          <w:sz w:val="20"/>
+          <w:szCs w:val="20"/>
+        </w:rPr>
+        <w:t xml:space="preserve"> </w:t>
+      </w:r>
+      <w:proofErr w:type="spellStart"/>
+      <w:r>
+        <w:rPr>
+          <w:sz w:val="20"/>
+          <w:szCs w:val="20"/>
+        </w:rPr>
+        <w:t>Suyula</w:t>
+      </w:r>
+      <w:proofErr w:type="spellEnd"/>
+      <w:r>
+        <w:rPr>
+          <w:sz w:val="20"/>
+          <w:szCs w:val="20"/>
+        </w:rPr>
+        <w:t xml:space="preserve"> Platform </w:t>
+      </w:r>
+      <w:proofErr w:type="spellStart"/>
+      <w:r>
+        <w:rPr>
+          <w:sz w:val="20"/>
+          <w:szCs w:val="20"/>
+        </w:rPr>
+        <w:t>Sdn</w:t>
+      </w:r>
+      <w:proofErr w:type="spellEnd"/>
+      <w:r>
+        <w:rPr>
+          <w:sz w:val="20"/>
+          <w:szCs w:val="20"/>
+        </w:rPr>
+        <w:t>. Bhd. (“</w:t>
       </w:r>
       <w:r>
         <w:rPr>
@@ -599,7 +797,27 @@
                 <w:szCs w:val="20"/>
                 <w:highlight w:val="yellow"/>
               </w:rPr>
-              <w:t>{issuer_name}</w:t>
+              <w:t>{</w:t>
+            </w:r>
+            <w:proofErr w:type="spellStart"/>
+            <w:r>
+              <w:rPr>
+                <w:b/>
+                <w:sz w:val="20"/>
+                <w:szCs w:val="20"/>
+                <w:highlight w:val="yellow"/>
+              </w:rPr>
+              <w:t>issuer_name</w:t>
+            </w:r>
+            <w:proofErr w:type="spellEnd"/>
+            <w:r>
+              <w:rPr>
+                <w:b/>
+                <w:sz w:val="20"/>
+                <w:szCs w:val="20"/>
+                <w:highlight w:val="yellow"/>
+              </w:rPr>
+              <w:t>}</w:t>
             </w:r>
           </w:p>
         </w:tc>
@@ -679,7 +897,23 @@
                 <w:sz w:val="20"/>
                 <w:szCs w:val="20"/>
               </w:rPr>
-              <w:t>Account Receivable Financing-i (“</w:t>
+              <w:t>Account Receivable Financing-</w:t>
+            </w:r>
+            <w:proofErr w:type="spellStart"/>
+            <w:r>
+              <w:rPr>
+                <w:sz w:val="20"/>
+                <w:szCs w:val="20"/>
+              </w:rPr>
+              <w:t>i</w:t>
+            </w:r>
+            <w:proofErr w:type="spellEnd"/>
+            <w:r>
+              <w:rPr>
+                <w:sz w:val="20"/>
+                <w:szCs w:val="20"/>
+              </w:rPr>
+              <w:t xml:space="preserve"> (“</w:t>
             </w:r>
             <w:r>
               <w:rPr>
@@ -914,7 +1148,25 @@
                 <w:szCs w:val="20"/>
                 <w:highlight w:val="yellow"/>
               </w:rPr>
-              <w:t>{financing_limit_rm}</w:t>
+              <w:t>{</w:t>
+            </w:r>
+            <w:proofErr w:type="spellStart"/>
+            <w:r>
+              <w:rPr>
+                <w:sz w:val="20"/>
+                <w:szCs w:val="20"/>
+                <w:highlight w:val="yellow"/>
+              </w:rPr>
+              <w:t>financing_limit_rm</w:t>
+            </w:r>
+            <w:proofErr w:type="spellEnd"/>
+            <w:r>
+              <w:rPr>
+                <w:sz w:val="20"/>
+                <w:szCs w:val="20"/>
+                <w:highlight w:val="yellow"/>
+              </w:rPr>
+              <w:t>}</w:t>
             </w:r>
           </w:p>
           <w:p>
@@ -1139,7 +1391,39 @@
                 <w:sz w:val="20"/>
                 <w:szCs w:val="20"/>
               </w:rPr>
-              <w:t>This Facility shall be structured in accordance with the Shariah principle of Baiʿ Dayn bi al-Silaʿ, whereby a receivable (invoice) arising from a sale of goods or services pursuant to a contract awarded by a contract awarder is used to request financing. SSP shall facilitate the financing by utilising the receivable as the basis through a commodity-based mechanism, with the financing amount limited to the agreed sale margin embedded in the receivable.</w:t>
+              <w:t xml:space="preserve">This Facility shall be structured in accordance with the Shariah principle of </w:t>
+            </w:r>
+            <w:proofErr w:type="spellStart"/>
+            <w:r>
+              <w:rPr>
+                <w:sz w:val="20"/>
+                <w:szCs w:val="20"/>
+              </w:rPr>
+              <w:t>Baiʿ</w:t>
+            </w:r>
+            <w:proofErr w:type="spellEnd"/>
+            <w:r>
+              <w:rPr>
+                <w:sz w:val="20"/>
+                <w:szCs w:val="20"/>
+              </w:rPr>
+              <w:t xml:space="preserve"> Dayn bi al-</w:t>
+            </w:r>
+            <w:proofErr w:type="spellStart"/>
+            <w:r>
+              <w:rPr>
+                <w:sz w:val="20"/>
+                <w:szCs w:val="20"/>
+              </w:rPr>
+              <w:t>Silaʿ</w:t>
+            </w:r>
+            <w:proofErr w:type="spellEnd"/>
+            <w:r>
+              <w:rPr>
+                <w:sz w:val="20"/>
+                <w:szCs w:val="20"/>
+              </w:rPr>
+              <w:t>, whereby a receivable (invoice) arising from a sale of goods or services pursuant to a contract awarded by a contract awarder is used to request financing. SSP shall facilitate the financing by utilising the receivable as the basis through a commodity-based mechanism, with the financing amount limited to the agreed sale margin embedded in the receivable.</w:t>
             </w:r>
           </w:p>
         </w:tc>
@@ -1221,7 +1505,25 @@
                 <w:szCs w:val="20"/>
                 <w:highlight w:val="yellow"/>
               </w:rPr>
-              <w:t>{margin_of_receivable_percent}</w:t>
+              <w:t>{</w:t>
+            </w:r>
+            <w:proofErr w:type="spellStart"/>
+            <w:r>
+              <w:rPr>
+                <w:sz w:val="20"/>
+                <w:szCs w:val="20"/>
+                <w:highlight w:val="yellow"/>
+              </w:rPr>
+              <w:t>margin_of_receivable_percent</w:t>
+            </w:r>
+            <w:proofErr w:type="spellEnd"/>
+            <w:r>
+              <w:rPr>
+                <w:sz w:val="20"/>
+                <w:szCs w:val="20"/>
+                <w:highlight w:val="yellow"/>
+              </w:rPr>
+              <w:t>}</w:t>
             </w:r>
             <w:r>
               <w:rPr>
@@ -1229,13 +1531,6 @@
                 <w:szCs w:val="20"/>
               </w:rPr>
               <w:t xml:space="preserve"> %</w:t>
-            </w:r>
-            <w:r>
-              <w:rPr>
-                <w:sz w:val="20"/>
-                <w:szCs w:val="20"/>
-              </w:rPr>
-              <w:t xml:space="preserve"/>
             </w:r>
           </w:p>
         </w:tc>
@@ -1339,7 +1634,25 @@
                 <w:szCs w:val="20"/>
                 <w:highlight w:val="yellow"/>
               </w:rPr>
-              <w:t>{profit_rate_percent}</w:t>
+              <w:t>{</w:t>
+            </w:r>
+            <w:proofErr w:type="spellStart"/>
+            <w:r>
+              <w:rPr>
+                <w:sz w:val="20"/>
+                <w:szCs w:val="20"/>
+                <w:highlight w:val="yellow"/>
+              </w:rPr>
+              <w:t>profit_rate_percent</w:t>
+            </w:r>
+            <w:proofErr w:type="spellEnd"/>
+            <w:r>
+              <w:rPr>
+                <w:sz w:val="20"/>
+                <w:szCs w:val="20"/>
+                <w:highlight w:val="yellow"/>
+              </w:rPr>
+              <w:t>}</w:t>
             </w:r>
             <w:r>
               <w:rPr>
@@ -1354,7 +1667,25 @@
                 <w:szCs w:val="20"/>
                 <w:highlight w:val="yellow"/>
               </w:rPr>
-              <w:t>{profit_rate_percent}</w:t>
+              <w:t>{</w:t>
+            </w:r>
+            <w:proofErr w:type="spellStart"/>
+            <w:r>
+              <w:rPr>
+                <w:sz w:val="20"/>
+                <w:szCs w:val="20"/>
+                <w:highlight w:val="yellow"/>
+              </w:rPr>
+              <w:t>profit_rate_percent</w:t>
+            </w:r>
+            <w:proofErr w:type="spellEnd"/>
+            <w:r>
+              <w:rPr>
+                <w:sz w:val="20"/>
+                <w:szCs w:val="20"/>
+                <w:highlight w:val="yellow"/>
+              </w:rPr>
+              <w:t>}</w:t>
             </w:r>
             <w:r>
               <w:rPr>
@@ -1362,34 +1693,6 @@
                 <w:szCs w:val="20"/>
               </w:rPr>
               <w:t xml:space="preserve">%) per month calculated on a daily basis. </w:t>
-            </w:r>
-            <w:r>
-              <w:rPr>
-                <w:sz w:val="20"/>
-                <w:szCs w:val="20"/>
-              </w:rPr>
-              <w:t/>
-            </w:r>
-            <w:r>
-              <w:rPr>
-                <w:sz w:val="20"/>
-                <w:szCs w:val="20"/>
-              </w:rPr>
-              <w:t xml:space="preserve"/>
-            </w:r>
-            <w:r>
-              <w:rPr>
-                <w:sz w:val="20"/>
-                <w:szCs w:val="20"/>
-              </w:rPr>
-              <w:t/>
-            </w:r>
-            <w:r>
-              <w:rPr>
-                <w:sz w:val="20"/>
-                <w:szCs w:val="20"/>
-              </w:rPr>
-              <w:t xml:space="preserve"/>
             </w:r>
           </w:p>
           <w:p>
@@ -1490,7 +1793,25 @@
                 <w:szCs w:val="20"/>
                 <w:highlight w:val="yellow"/>
               </w:rPr>
-              <w:t>{tenure_days}</w:t>
+              <w:t>{</w:t>
+            </w:r>
+            <w:proofErr w:type="spellStart"/>
+            <w:r>
+              <w:rPr>
+                <w:sz w:val="20"/>
+                <w:szCs w:val="20"/>
+                <w:highlight w:val="yellow"/>
+              </w:rPr>
+              <w:t>tenure_days</w:t>
+            </w:r>
+            <w:proofErr w:type="spellEnd"/>
+            <w:r>
+              <w:rPr>
+                <w:sz w:val="20"/>
+                <w:szCs w:val="20"/>
+                <w:highlight w:val="yellow"/>
+              </w:rPr>
+              <w:t>}</w:t>
             </w:r>
             <w:r>
               <w:rPr>
@@ -1498,13 +1819,6 @@
                 <w:szCs w:val="20"/>
               </w:rPr>
               <w:t xml:space="preserve"> days</w:t>
-            </w:r>
-            <w:r>
-              <w:rPr>
-                <w:sz w:val="20"/>
-                <w:szCs w:val="20"/>
-              </w:rPr>
-              <w:t xml:space="preserve"/>
             </w:r>
           </w:p>
         </w:tc>
@@ -1624,7 +1938,25 @@
                 <w:szCs w:val="20"/>
                 <w:highlight w:val="yellow"/>
               </w:rPr>
-              <w:t>{availability_period_phrase}</w:t>
+              <w:t>{</w:t>
+            </w:r>
+            <w:proofErr w:type="spellStart"/>
+            <w:r>
+              <w:rPr>
+                <w:sz w:val="20"/>
+                <w:szCs w:val="20"/>
+                <w:highlight w:val="yellow"/>
+              </w:rPr>
+              <w:t>availability_period_phrase</w:t>
+            </w:r>
+            <w:proofErr w:type="spellEnd"/>
+            <w:r>
+              <w:rPr>
+                <w:sz w:val="20"/>
+                <w:szCs w:val="20"/>
+                <w:highlight w:val="yellow"/>
+              </w:rPr>
+              <w:t>}</w:t>
             </w:r>
             <w:r>
               <w:rPr>
@@ -1633,13 +1965,6 @@
               </w:rPr>
               <w:t xml:space="preserve"> from the date of acceptance of this Letter of Offer, failing which SSP reserves the right to cancel or withdraw the Facility without further notice. </w:t>
             </w:r>
-            <w:r>
-              <w:rPr>
-                <w:sz w:val="20"/>
-                <w:szCs w:val="20"/>
-              </w:rPr>
-              <w:t xml:space="preserve"/>
-            </w:r>
           </w:p>
           <w:p>
             <w:pPr>
@@ -1665,6 +1990,7 @@
                 <w:sz w:val="20"/>
                 <w:szCs w:val="20"/>
               </w:rPr>
+              <w:lastRenderedPageBreak/>
               <w:t>Any extension of the utilisation or availability period shall be subject to the absolute discretion of SSP and may be granted upon such terms and conditions as SSP may deem fit.</w:t>
             </w:r>
           </w:p>
@@ -1849,7 +2175,23 @@
                 <w:sz w:val="20"/>
                 <w:szCs w:val="20"/>
               </w:rPr>
-              <w:t>Account Receivable Financing-i Facility Agreement;</w:t>
+              <w:t>Account Receivable Financing-</w:t>
+            </w:r>
+            <w:proofErr w:type="spellStart"/>
+            <w:r>
+              <w:rPr>
+                <w:sz w:val="20"/>
+                <w:szCs w:val="20"/>
+              </w:rPr>
+              <w:t>i</w:t>
+            </w:r>
+            <w:proofErr w:type="spellEnd"/>
+            <w:r>
+              <w:rPr>
+                <w:sz w:val="20"/>
+                <w:szCs w:val="20"/>
+              </w:rPr>
+              <w:t xml:space="preserve"> Facility Agreement;</w:t>
             </w:r>
           </w:p>
           <w:p>
@@ -2033,7 +2375,23 @@
                 <w:sz w:val="20"/>
                 <w:szCs w:val="20"/>
               </w:rPr>
-              <w:t xml:space="preserve"> of the Facility(ies).</w:t>
+              <w:t xml:space="preserve"> of the Facility(</w:t>
+            </w:r>
+            <w:proofErr w:type="spellStart"/>
+            <w:r>
+              <w:rPr>
+                <w:sz w:val="20"/>
+                <w:szCs w:val="20"/>
+              </w:rPr>
+              <w:t>ies</w:t>
+            </w:r>
+            <w:proofErr w:type="spellEnd"/>
+            <w:r>
+              <w:rPr>
+                <w:sz w:val="20"/>
+                <w:szCs w:val="20"/>
+              </w:rPr>
+              <w:t>).</w:t>
             </w:r>
           </w:p>
           <w:p>
@@ -2060,7 +2418,23 @@
                 <w:sz w:val="20"/>
                 <w:szCs w:val="20"/>
               </w:rPr>
-              <w:t>All parties providing the above securities shall hereinafter be collectively referred to as the “Security Party(ies)”.</w:t>
+              <w:t>All parties providing the above securities shall hereinafter be collectively referred to as the “Security Party(</w:t>
+            </w:r>
+            <w:proofErr w:type="spellStart"/>
+            <w:r>
+              <w:rPr>
+                <w:sz w:val="20"/>
+                <w:szCs w:val="20"/>
+              </w:rPr>
+              <w:t>ies</w:t>
+            </w:r>
+            <w:proofErr w:type="spellEnd"/>
+            <w:r>
+              <w:rPr>
+                <w:sz w:val="20"/>
+                <w:szCs w:val="20"/>
+              </w:rPr>
+              <w:t>)”.</w:t>
             </w:r>
           </w:p>
           <w:p>
@@ -2087,7 +2461,23 @@
                 <w:sz w:val="20"/>
                 <w:szCs w:val="20"/>
               </w:rPr>
-              <w:t>All the above and any other security documents shall be in such form and substance as may be stipulated by or acceptable to SSP at its absolute discretion and shall, unless otherwise determined by SSP, secure not only the present Facility(ies) but also all other existing and/or future financing facilities and/or accommodations granted or to be granted by SSP to the Issuer.</w:t>
+              <w:t>All the above and any other security documents shall be in such form and substance as may be stipulated by or acceptable to SSP at its absolute discretion and shall, unless otherwise determined by SSP, secure not only the present Facility(</w:t>
+            </w:r>
+            <w:proofErr w:type="spellStart"/>
+            <w:r>
+              <w:rPr>
+                <w:sz w:val="20"/>
+                <w:szCs w:val="20"/>
+              </w:rPr>
+              <w:t>ies</w:t>
+            </w:r>
+            <w:proofErr w:type="spellEnd"/>
+            <w:r>
+              <w:rPr>
+                <w:sz w:val="20"/>
+                <w:szCs w:val="20"/>
+              </w:rPr>
+              <w:t>) but also all other existing and/or future financing facilities and/or accommodations granted or to be granted by SSP to the Issuer.</w:t>
             </w:r>
           </w:p>
           <w:p>
@@ -2275,7 +2665,6 @@
                 <w:sz w:val="20"/>
                 <w:szCs w:val="20"/>
               </w:rPr>
-              <w:lastRenderedPageBreak/>
               <w:t>Stamp Duty (if any)</w:t>
             </w:r>
             <w:r>
@@ -2314,6 +2703,7 @@
               </w:rPr>
               <w:t xml:space="preserve">All fees and charges payable under the Facility, including the Facility Fee, the Platform Fee / Drawdown Fee constitutes </w:t>
             </w:r>
+            <w:proofErr w:type="spellStart"/>
             <w:r>
               <w:rPr>
                 <w:i/>
@@ -2324,6 +2714,7 @@
               </w:rPr>
               <w:t>ujrah</w:t>
             </w:r>
+            <w:proofErr w:type="spellEnd"/>
             <w:r>
               <w:rPr>
                 <w:b/>
@@ -2370,7 +2761,43 @@
                 <w:szCs w:val="20"/>
                 <w:lang w:val="en-US"/>
               </w:rPr>
-              <w:t>The Issuer expressly consents that the Platform Fee and stamp duty (if any) may be deducted from the Facility proceeds upon disbursement as a payment mechanism only, and such deduction shall not constitute riba, profit capitalisation, or an increase in the outstanding obligation under the Shariah.</w:t>
+              <w:t xml:space="preserve">The Issuer expressly consents that the Platform Fee and stamp duty (if any) may be deducted from the Facility proceeds upon disbursement as a payment mechanism only, and such deduction shall not constitute </w:t>
+            </w:r>
+            <w:proofErr w:type="spellStart"/>
+            <w:r>
+              <w:rPr>
+                <w:sz w:val="20"/>
+                <w:szCs w:val="20"/>
+                <w:lang w:val="en-US"/>
+              </w:rPr>
+              <w:t>riba</w:t>
+            </w:r>
+            <w:proofErr w:type="spellEnd"/>
+            <w:r>
+              <w:rPr>
+                <w:sz w:val="20"/>
+                <w:szCs w:val="20"/>
+                <w:lang w:val="en-US"/>
+              </w:rPr>
+              <w:t xml:space="preserve">, profit </w:t>
+            </w:r>
+            <w:proofErr w:type="spellStart"/>
+            <w:r>
+              <w:rPr>
+                <w:sz w:val="20"/>
+                <w:szCs w:val="20"/>
+                <w:lang w:val="en-US"/>
+              </w:rPr>
+              <w:t>capitalisation</w:t>
+            </w:r>
+            <w:proofErr w:type="spellEnd"/>
+            <w:r>
+              <w:rPr>
+                <w:sz w:val="20"/>
+                <w:szCs w:val="20"/>
+                <w:lang w:val="en-US"/>
+              </w:rPr>
+              <w:t>, or an increase in the outstanding obligation under the Shariah.</w:t>
             </w:r>
           </w:p>
           <w:p>
@@ -2547,7 +2974,23 @@
                 <w:sz w:val="20"/>
                 <w:szCs w:val="20"/>
               </w:rPr>
-              <w:t>The Facility(ies) shall be made available for your utilisation upon full satisfaction of the following conditions precedent, to the satisfaction of SSP:</w:t>
+              <w:t>The Facility(</w:t>
+            </w:r>
+            <w:proofErr w:type="spellStart"/>
+            <w:r>
+              <w:rPr>
+                <w:sz w:val="20"/>
+                <w:szCs w:val="20"/>
+              </w:rPr>
+              <w:t>ies</w:t>
+            </w:r>
+            <w:proofErr w:type="spellEnd"/>
+            <w:r>
+              <w:rPr>
+                <w:sz w:val="20"/>
+                <w:szCs w:val="20"/>
+              </w:rPr>
+              <w:t>) shall be made available for your utilisation upon full satisfaction of the following conditions precedent, to the satisfaction of SSP:</w:t>
             </w:r>
           </w:p>
           <w:p>
@@ -2576,7 +3019,23 @@
                 <w:sz w:val="20"/>
                 <w:szCs w:val="20"/>
               </w:rPr>
-              <w:t>SSP shall have received the following from the Issuer and/or the Security Party(ies), in form and substance satisfactory to SSP:</w:t>
+              <w:t>SSP shall have received the following from the Issuer and/or the Security Party(</w:t>
+            </w:r>
+            <w:proofErr w:type="spellStart"/>
+            <w:r>
+              <w:rPr>
+                <w:sz w:val="20"/>
+                <w:szCs w:val="20"/>
+              </w:rPr>
+              <w:t>ies</w:t>
+            </w:r>
+            <w:proofErr w:type="spellEnd"/>
+            <w:r>
+              <w:rPr>
+                <w:sz w:val="20"/>
+                <w:szCs w:val="20"/>
+              </w:rPr>
+              <w:t>), in form and substance satisfactory to SSP:</w:t>
             </w:r>
           </w:p>
           <w:p>
@@ -2652,7 +3111,6 @@
                 <w:sz w:val="20"/>
                 <w:szCs w:val="20"/>
               </w:rPr>
-              <w:lastRenderedPageBreak/>
               <w:t>All Finance Documents, security, and guarantee documents (where applicable) duly completed, executed, stamped, and perfected to the satisfaction of SSP, including the stamping of the relevant documents with the relevant authorities.</w:t>
             </w:r>
           </w:p>
@@ -2867,6 +3325,7 @@
                 <w:sz w:val="20"/>
                 <w:szCs w:val="20"/>
               </w:rPr>
+              <w:lastRenderedPageBreak/>
               <w:t>Such other documents, information, or evidence as may be required by SSP from time to time at its absolute discretion have been duly provided.</w:t>
             </w:r>
           </w:p>
@@ -3082,13 +3541,6 @@
                 <w:szCs w:val="20"/>
               </w:rPr>
             </w:pPr>
-            <w:r>
-              <w:rPr>
-                <w:sz w:val="20"/>
-                <w:szCs w:val="20"/>
-              </w:rPr>
-              <w:t xml:space="preserve"/>
-            </w:r>
           </w:p>
           <w:p>
             <w:pPr>
@@ -3144,7 +3596,6 @@
                 <w:sz w:val="20"/>
                 <w:szCs w:val="20"/>
               </w:rPr>
-              <w:lastRenderedPageBreak/>
               <w:t>PAYMENT PERIOD</w:t>
             </w:r>
           </w:p>
@@ -3201,7 +3652,25 @@
                 <w:szCs w:val="20"/>
                 <w:highlight w:val="yellow"/>
               </w:rPr>
-              <w:t>{payment_period_days}</w:t>
+              <w:t>{</w:t>
+            </w:r>
+            <w:proofErr w:type="spellStart"/>
+            <w:r>
+              <w:rPr>
+                <w:sz w:val="20"/>
+                <w:szCs w:val="20"/>
+                <w:highlight w:val="yellow"/>
+              </w:rPr>
+              <w:t>payment_period_days</w:t>
+            </w:r>
+            <w:proofErr w:type="spellEnd"/>
+            <w:r>
+              <w:rPr>
+                <w:sz w:val="20"/>
+                <w:szCs w:val="20"/>
+                <w:highlight w:val="yellow"/>
+              </w:rPr>
+              <w:t>}</w:t>
             </w:r>
             <w:r>
               <w:rPr>
@@ -3209,13 +3678,6 @@
                 <w:szCs w:val="20"/>
               </w:rPr>
               <w:t xml:space="preserve"> days from the date of disbursement, in accordance with the Mode of Payment set out herein.</w:t>
-            </w:r>
-            <w:r>
-              <w:rPr>
-                <w:sz w:val="20"/>
-                <w:szCs w:val="20"/>
-              </w:rPr>
-              <w:t/>
             </w:r>
           </w:p>
           <w:p>
@@ -3314,7 +3776,25 @@
                 <w:szCs w:val="20"/>
                 <w:highlight w:val="yellow"/>
               </w:rPr>
-              <w:t>{grace_period_days}</w:t>
+              <w:t>{</w:t>
+            </w:r>
+            <w:proofErr w:type="spellStart"/>
+            <w:r>
+              <w:rPr>
+                <w:sz w:val="20"/>
+                <w:szCs w:val="20"/>
+                <w:highlight w:val="yellow"/>
+              </w:rPr>
+              <w:t>grace_period_days</w:t>
+            </w:r>
+            <w:proofErr w:type="spellEnd"/>
+            <w:r>
+              <w:rPr>
+                <w:sz w:val="20"/>
+                <w:szCs w:val="20"/>
+                <w:highlight w:val="yellow"/>
+              </w:rPr>
+              <w:t>}</w:t>
             </w:r>
             <w:r>
               <w:rPr>
@@ -3329,7 +3809,25 @@
                 <w:szCs w:val="20"/>
                 <w:highlight w:val="yellow"/>
               </w:rPr>
-              <w:t>{grace_period_days_words}</w:t>
+              <w:t>{</w:t>
+            </w:r>
+            <w:proofErr w:type="spellStart"/>
+            <w:r>
+              <w:rPr>
+                <w:sz w:val="20"/>
+                <w:szCs w:val="20"/>
+                <w:highlight w:val="yellow"/>
+              </w:rPr>
+              <w:t>grace_period_days_words</w:t>
+            </w:r>
+            <w:proofErr w:type="spellEnd"/>
+            <w:r>
+              <w:rPr>
+                <w:sz w:val="20"/>
+                <w:szCs w:val="20"/>
+                <w:highlight w:val="yellow"/>
+              </w:rPr>
+              <w:t>}</w:t>
             </w:r>
             <w:r>
               <w:rPr>
@@ -3337,20 +3835,6 @@
                 <w:szCs w:val="20"/>
               </w:rPr>
               <w:t>) days after the payment due date.</w:t>
-            </w:r>
-            <w:r>
-              <w:rPr>
-                <w:sz w:val="20"/>
-                <w:szCs w:val="20"/>
-              </w:rPr>
-              <w:t xml:space="preserve"/>
-            </w:r>
-            <w:r>
-              <w:rPr>
-                <w:sz w:val="20"/>
-                <w:szCs w:val="20"/>
-              </w:rPr>
-              <w:t/>
             </w:r>
           </w:p>
         </w:tc>
@@ -3503,7 +3987,15 @@
                 <w:sz w:val="20"/>
                 <w:szCs w:val="20"/>
               </w:rPr>
-              <w:t xml:space="preserve">Once an Investment Offer is listed, the Investors may make a Subscription Offer for the Investment Note. Where an Investment Offer obtains a minimum of 80% in value of matching Subscription Offer(s), the Subscription Offer will be considered successful for the matching value. The Issuer irrevocably and unconditionally agrees to automatically accept such matching Subscription Offer(s). </w:t>
+              <w:t xml:space="preserve">Once an Investment Offer is listed, the Investors may make a Subscription Offer for the Investment Note. Where an Investment Offer obtains a minimum of 80% in value of matching Subscription Offer(s), the Subscription Offer will be considered successful for the matching value. The </w:t>
+            </w:r>
+            <w:r>
+              <w:rPr>
+                <w:sz w:val="20"/>
+                <w:szCs w:val="20"/>
+              </w:rPr>
+              <w:lastRenderedPageBreak/>
+              <w:t xml:space="preserve">Issuer irrevocably and unconditionally agrees to automatically accept such matching Subscription Offer(s). </w:t>
             </w:r>
           </w:p>
           <w:p>
@@ -3572,7 +4064,6 @@
                 <w:sz w:val="20"/>
                 <w:szCs w:val="20"/>
               </w:rPr>
-              <w:lastRenderedPageBreak/>
               <w:t xml:space="preserve">This Letter of Offer does not guarantee financing to the Issuer. SSP is not obligated to list an Investment Offer for an Investment Note on the Platform and SSP may decline to list an Investment Note. </w:t>
             </w:r>
           </w:p>
@@ -3773,6 +4264,7 @@
                 <w:sz w:val="20"/>
                 <w:szCs w:val="20"/>
               </w:rPr>
+              <w:lastRenderedPageBreak/>
               <w:t xml:space="preserve">not impose any additional profit beyond the agreed Profit Rate embedded in the original transaction; and </w:t>
             </w:r>
           </w:p>
@@ -3822,15 +4314,9 @@
                 <w:sz w:val="20"/>
                 <w:szCs w:val="20"/>
               </w:rPr>
-              <w:t xml:space="preserve"> ta’widh</w:t>
-            </w:r>
-            <w:r>
-              <w:rPr>
-                <w:sz w:val="20"/>
-                <w:szCs w:val="20"/>
-              </w:rPr>
-              <w:t xml:space="preserve"> or </w:t>
-            </w:r>
+              <w:t xml:space="preserve"> </w:t>
+            </w:r>
+            <w:proofErr w:type="spellStart"/>
             <w:r>
               <w:rPr>
                 <w:i/>
@@ -3838,8 +4324,27 @@
                 <w:sz w:val="20"/>
                 <w:szCs w:val="20"/>
               </w:rPr>
+              <w:t>ta’widh</w:t>
+            </w:r>
+            <w:proofErr w:type="spellEnd"/>
+            <w:r>
+              <w:rPr>
+                <w:sz w:val="20"/>
+                <w:szCs w:val="20"/>
+              </w:rPr>
+              <w:t xml:space="preserve"> or </w:t>
+            </w:r>
+            <w:proofErr w:type="spellStart"/>
+            <w:r>
+              <w:rPr>
+                <w:i/>
+                <w:iCs/>
+                <w:sz w:val="20"/>
+                <w:szCs w:val="20"/>
+              </w:rPr>
               <w:t>gharamah</w:t>
             </w:r>
+            <w:proofErr w:type="spellEnd"/>
             <w:r>
               <w:rPr>
                 <w:sz w:val="20"/>
@@ -4188,7 +4693,6 @@
                 <w:sz w:val="20"/>
                 <w:szCs w:val="20"/>
               </w:rPr>
-              <w:lastRenderedPageBreak/>
               <w:t>for or in connection with the enforcement or preservation of any rights of the P2P Operator under this Letter of Offer, the Facility Agreement or any other transaction or security documents;</w:t>
             </w:r>
           </w:p>
@@ -4222,7 +4726,23 @@
                 <w:sz w:val="20"/>
                 <w:szCs w:val="20"/>
               </w:rPr>
-              <w:t>to the Security Party(ies), guarantor(s), or any authorised party pursuant to any arrangement, composition, or restructuring (including any proposed restructuring) between the creditors of the Issuer;</w:t>
+              <w:t>to the Security Party(</w:t>
+            </w:r>
+            <w:proofErr w:type="spellStart"/>
+            <w:r>
+              <w:rPr>
+                <w:sz w:val="20"/>
+                <w:szCs w:val="20"/>
+              </w:rPr>
+              <w:t>ies</w:t>
+            </w:r>
+            <w:proofErr w:type="spellEnd"/>
+            <w:r>
+              <w:rPr>
+                <w:sz w:val="20"/>
+                <w:szCs w:val="20"/>
+              </w:rPr>
+              <w:t>), guarantor(s), or any authorised party pursuant to any arrangement, composition, or restructuring (including any proposed restructuring) between the creditors of the Issuer;</w:t>
             </w:r>
           </w:p>
           <w:p>
@@ -4288,6 +4808,7 @@
                 <w:sz w:val="20"/>
                 <w:szCs w:val="20"/>
               </w:rPr>
+              <w:lastRenderedPageBreak/>
               <w:t>pursuant to any applicable laws, regulations, or directives of Malaysia or any regulatory authority;</w:t>
             </w:r>
           </w:p>
@@ -4492,15 +5013,7 @@
                 <w:sz w:val="20"/>
                 <w:szCs w:val="20"/>
               </w:rPr>
-              <w:t xml:space="preserve">This Facility is subject further to the terms and conditions as stated in the Annexure (“General Terms and Conditions”), which </w:t>
-            </w:r>
-            <w:r>
-              <w:rPr>
-                <w:sz w:val="20"/>
-                <w:szCs w:val="20"/>
-              </w:rPr>
-              <w:lastRenderedPageBreak/>
-              <w:t>will form an integral part of this Letter of Offer and to the terms and conditions as contained in the Transaction Documents.</w:t>
+              <w:t>This Facility is subject further to the terms and conditions as stated in the Annexure (“General Terms and Conditions”), which will form an integral part of this Letter of Offer and to the terms and conditions as contained in the Transaction Documents.</w:t>
             </w:r>
           </w:p>
           <w:p>
@@ -4632,7 +5145,25 @@
                 <w:szCs w:val="20"/>
                 <w:highlight w:val="yellow"/>
               </w:rPr>
-              <w:t>{transaction_docs_days}</w:t>
+              <w:t>{</w:t>
+            </w:r>
+            <w:proofErr w:type="spellStart"/>
+            <w:r>
+              <w:rPr>
+                <w:sz w:val="20"/>
+                <w:szCs w:val="20"/>
+                <w:highlight w:val="yellow"/>
+              </w:rPr>
+              <w:t>transaction_docs_days</w:t>
+            </w:r>
+            <w:proofErr w:type="spellEnd"/>
+            <w:r>
+              <w:rPr>
+                <w:sz w:val="20"/>
+                <w:szCs w:val="20"/>
+                <w:highlight w:val="yellow"/>
+              </w:rPr>
+              <w:t>}</w:t>
             </w:r>
             <w:r>
               <w:rPr>
@@ -4647,7 +5178,25 @@
                 <w:szCs w:val="20"/>
                 <w:highlight w:val="yellow"/>
               </w:rPr>
-              <w:t>{transaction_docs_days_words}</w:t>
+              <w:t>{</w:t>
+            </w:r>
+            <w:proofErr w:type="spellStart"/>
+            <w:r>
+              <w:rPr>
+                <w:sz w:val="20"/>
+                <w:szCs w:val="20"/>
+                <w:highlight w:val="yellow"/>
+              </w:rPr>
+              <w:t>transaction_docs_days_words</w:t>
+            </w:r>
+            <w:proofErr w:type="spellEnd"/>
+            <w:r>
+              <w:rPr>
+                <w:sz w:val="20"/>
+                <w:szCs w:val="20"/>
+                <w:highlight w:val="yellow"/>
+              </w:rPr>
+              <w:t>}</w:t>
             </w:r>
             <w:r>
               <w:rPr>
@@ -4655,13 +5204,6 @@
                 <w:szCs w:val="20"/>
               </w:rPr>
               <w:t xml:space="preserve">) days’ from acceptance of the Letter of Offer, failing which the offer for the Facility will be revoked and cancelled, unless otherwise extended in writing by SSP. </w:t>
-            </w:r>
-            <w:r>
-              <w:rPr>
-                <w:sz w:val="20"/>
-                <w:szCs w:val="20"/>
-              </w:rPr>
-              <w:t xml:space="preserve"/>
             </w:r>
           </w:p>
           <w:p>
@@ -4783,6 +5325,7 @@
                 <w:sz w:val="20"/>
                 <w:szCs w:val="20"/>
               </w:rPr>
+              <w:lastRenderedPageBreak/>
               <w:t>Notwithstanding and without prejudice to anything stated in this Letter of Offer, the P2P Operator may review the Facility at any time, including before the utilisation of the Facility.</w:t>
             </w:r>
           </w:p>
@@ -4810,8 +5353,12 @@
           <w:szCs w:val="20"/>
         </w:rPr>
         <w:sectPr>
-          <w:headerReference w:type="default" r:id="rId11"/>
-          <w:footerReference w:type="default" r:id="rId12"/>
+          <w:headerReference w:type="even" r:id="rId11"/>
+          <w:headerReference w:type="default" r:id="rId12"/>
+          <w:footerReference w:type="even" r:id="rId13"/>
+          <w:footerReference w:type="default" r:id="rId14"/>
+          <w:headerReference w:type="first" r:id="rId15"/>
+          <w:footerReference w:type="first" r:id="rId16"/>
           <w:pgSz w:w="12240" w:h="15840" w:code="1"/>
           <w:pgMar w:top="1440" w:right="1440" w:bottom="1440" w:left="1440" w:header="709" w:footer="709" w:gutter="0"/>
           <w:cols w:space="708"/>
@@ -4882,7 +5429,25 @@
           <w:szCs w:val="20"/>
           <w:highlight w:val="yellow"/>
         </w:rPr>
-        <w:t>{withdrawal_notice_phrase}</w:t>
+        <w:t>{</w:t>
+      </w:r>
+      <w:proofErr w:type="spellStart"/>
+      <w:r>
+        <w:rPr>
+          <w:sz w:val="20"/>
+          <w:szCs w:val="20"/>
+          <w:highlight w:val="yellow"/>
+        </w:rPr>
+        <w:t>withdrawal_notice_phrase</w:t>
+      </w:r>
+      <w:proofErr w:type="spellEnd"/>
+      <w:r>
+        <w:rPr>
+          <w:sz w:val="20"/>
+          <w:szCs w:val="20"/>
+          <w:highlight w:val="yellow"/>
+        </w:rPr>
+        <w:t>}</w:t>
       </w:r>
       <w:r>
         <w:rPr>
@@ -4890,13 +5455,6 @@
           <w:szCs w:val="20"/>
         </w:rPr>
         <w:t xml:space="preserve"> prior written notice, which may include notification via electronic means.</w:t>
-      </w:r>
-      <w:r>
-        <w:rPr>
-          <w:sz w:val="20"/>
-          <w:szCs w:val="20"/>
-        </w:rPr>
-        <w:t xml:space="preserve"/>
       </w:r>
     </w:p>
     <w:p>
@@ -4970,7 +5528,25 @@
           <w:szCs w:val="20"/>
           <w:highlight w:val="yellow"/>
         </w:rPr>
-        <w:t>{offer_validity_phrase}</w:t>
+        <w:t>{</w:t>
+      </w:r>
+      <w:proofErr w:type="spellStart"/>
+      <w:r>
+        <w:rPr>
+          <w:sz w:val="20"/>
+          <w:szCs w:val="20"/>
+          <w:highlight w:val="yellow"/>
+        </w:rPr>
+        <w:t>offer_validity_phrase</w:t>
+      </w:r>
+      <w:proofErr w:type="spellEnd"/>
+      <w:r>
+        <w:rPr>
+          <w:sz w:val="20"/>
+          <w:szCs w:val="20"/>
+          <w:highlight w:val="yellow"/>
+        </w:rPr>
+        <w:t>}</w:t>
       </w:r>
       <w:r>
         <w:rPr>
@@ -4978,20 +5554,6 @@
           <w:szCs w:val="20"/>
         </w:rPr>
         <w:t xml:space="preserve"> from the date of this Facility Offer unless the validity period is extended in writing by SSP.</w:t>
-      </w:r>
-      <w:r>
-        <w:rPr>
-          <w:sz w:val="20"/>
-          <w:szCs w:val="20"/>
-        </w:rPr>
-        <w:t xml:space="preserve"/>
-      </w:r>
-      <w:r>
-        <w:rPr>
-          <w:sz w:val="20"/>
-          <w:szCs w:val="20"/>
-        </w:rPr>
-        <w:t xml:space="preserve"/>
       </w:r>
     </w:p>
     <w:p>
@@ -5113,7 +5675,6 @@
           <w:sz w:val="20"/>
           <w:szCs w:val="20"/>
         </w:rPr>
-        <w:lastRenderedPageBreak/>
         <w:t>compliance with the terms and conditions stipulated in this Facility Offer and any related agreements; and</w:t>
       </w:r>
     </w:p>
@@ -5187,6 +5748,7 @@
           <w:sz w:val="20"/>
           <w:szCs w:val="20"/>
         </w:rPr>
+        <w:lastRenderedPageBreak/>
         <w:t xml:space="preserve">Should the terms and conditions outlined above be agreeable to you, kindly signify your acceptance by signing the Memorandum of Acceptance and the Acknowledgement and Consent by Guarantors within </w:t>
       </w:r>
       <w:r>
@@ -5195,7 +5757,25 @@
           <w:szCs w:val="20"/>
           <w:highlight w:val="yellow"/>
         </w:rPr>
-        <w:t>{offer_validity_phrase}</w:t>
+        <w:t>{</w:t>
+      </w:r>
+      <w:proofErr w:type="spellStart"/>
+      <w:r>
+        <w:rPr>
+          <w:sz w:val="20"/>
+          <w:szCs w:val="20"/>
+          <w:highlight w:val="yellow"/>
+        </w:rPr>
+        <w:t>offer_validity_phrase</w:t>
+      </w:r>
+      <w:proofErr w:type="spellEnd"/>
+      <w:r>
+        <w:rPr>
+          <w:sz w:val="20"/>
+          <w:szCs w:val="20"/>
+          <w:highlight w:val="yellow"/>
+        </w:rPr>
+        <w:t>}</w:t>
       </w:r>
       <w:r>
         <w:rPr>
@@ -5204,13 +5784,6 @@
         </w:rPr>
         <w:t xml:space="preserve"> from the date of this letter. Failure to do so will result in the offer being void, unless a written extension is provided by SSP.</w:t>
       </w:r>
-      <w:r>
-        <w:rPr>
-          <w:sz w:val="20"/>
-          <w:szCs w:val="20"/>
-        </w:rPr>
-        <w:t xml:space="preserve"/>
-      </w:r>
     </w:p>
     <w:p>
       <w:pPr>
@@ -5238,7 +5811,7 @@
         </w:rPr>
         <w:t xml:space="preserve">We thank you for providing SSP with the opportunity to be of service to you. Please feel free to contact us at </w:t>
       </w:r>
-      <w:hyperlink r:id="rId13" w:history="1">
+      <w:hyperlink r:id="rId17" w:history="1">
         <w:r>
           <w:rPr>
             <w:rStyle w:val="Hyperlink"/>
@@ -6598,7 +7171,25 @@
           <w:szCs w:val="20"/>
           <w:highlight w:val="yellow"/>
         </w:rPr>
-        <w:t>{assigned_contract_date}</w:t>
+        <w:t>{</w:t>
+      </w:r>
+      <w:proofErr w:type="spellStart"/>
+      <w:r>
+        <w:rPr>
+          <w:sz w:val="20"/>
+          <w:szCs w:val="20"/>
+          <w:highlight w:val="yellow"/>
+        </w:rPr>
+        <w:t>assigned_contract_date</w:t>
+      </w:r>
+      <w:proofErr w:type="spellEnd"/>
+      <w:r>
+        <w:rPr>
+          <w:sz w:val="20"/>
+          <w:szCs w:val="20"/>
+          <w:highlight w:val="yellow"/>
+        </w:rPr>
+        <w:t>}</w:t>
       </w:r>
       <w:r>
         <w:rPr>
@@ -6613,7 +7204,25 @@
           <w:szCs w:val="20"/>
           <w:highlight w:val="yellow"/>
         </w:rPr>
-        <w:t>{assigned_contract_counterparty}</w:t>
+        <w:t>{</w:t>
+      </w:r>
+      <w:proofErr w:type="spellStart"/>
+      <w:r>
+        <w:rPr>
+          <w:sz w:val="20"/>
+          <w:szCs w:val="20"/>
+          <w:highlight w:val="yellow"/>
+        </w:rPr>
+        <w:t>assigned_contract_counterparty</w:t>
+      </w:r>
+      <w:proofErr w:type="spellEnd"/>
+      <w:r>
+        <w:rPr>
+          <w:sz w:val="20"/>
+          <w:szCs w:val="20"/>
+          <w:highlight w:val="yellow"/>
+        </w:rPr>
+        <w:t>}</w:t>
       </w:r>
       <w:r>
         <w:rPr>
@@ -6628,7 +7237,25 @@
           <w:szCs w:val="20"/>
           <w:highlight w:val="yellow"/>
         </w:rPr>
-        <w:t>{assigned_contract_description}</w:t>
+        <w:t>{</w:t>
+      </w:r>
+      <w:proofErr w:type="spellStart"/>
+      <w:r>
+        <w:rPr>
+          <w:sz w:val="20"/>
+          <w:szCs w:val="20"/>
+          <w:highlight w:val="yellow"/>
+        </w:rPr>
+        <w:t>assigned_contract_description</w:t>
+      </w:r>
+      <w:proofErr w:type="spellEnd"/>
+      <w:r>
+        <w:rPr>
+          <w:sz w:val="20"/>
+          <w:szCs w:val="20"/>
+          <w:highlight w:val="yellow"/>
+        </w:rPr>
+        <w:t>}</w:t>
       </w:r>
       <w:r>
         <w:rPr>
@@ -6636,46 +7263,6 @@
           <w:szCs w:val="20"/>
         </w:rPr>
         <w:t xml:space="preserve"> (“Contract 1”); and </w:t>
-      </w:r>
-      <w:r>
-        <w:rPr>
-          <w:sz w:val="20"/>
-          <w:szCs w:val="20"/>
-        </w:rPr>
-        <w:t xml:space="preserve"/>
-      </w:r>
-      <w:r>
-        <w:rPr>
-          <w:sz w:val="20"/>
-          <w:szCs w:val="20"/>
-        </w:rPr>
-        <w:t xml:space="preserve"/>
-      </w:r>
-      <w:r>
-        <w:rPr>
-          <w:sz w:val="20"/>
-          <w:szCs w:val="20"/>
-        </w:rPr>
-        <w:t xml:space="preserve"/>
-      </w:r>
-      <w:r>
-        <w:rPr>
-          <w:b/>
-          <w:bCs/>
-          <w:sz w:val="20"/>
-          <w:szCs w:val="20"/>
-        </w:rPr>
-        <w:t/>
-      </w:r>
-      <w:r>
-        <w:rPr>
-          <w:sz w:val="20"/>
-          <w:szCs w:val="20"/>
-        </w:rPr>
-        <w:t xml:space="preserve"/>
-      </w:r>
-      <w:r>
-        <w:t xml:space="preserve"/>
       </w:r>
     </w:p>
     <w:p>
@@ -6846,8 +7433,9 @@
           <w:szCs w:val="20"/>
           <w:u w:val="single"/>
         </w:rPr>
-        <w:t xml:space="preserve">RE : LETTER OF OFFER ON ACCOUNT RECEIVABLE FINANCING-i (“FACILITY”) DATED </w:t>
-      </w:r>
+        <w:t>RE : LETTER OF OFFER ON ACCOUNT RECEIVABLE FINANCING-</w:t>
+      </w:r>
+      <w:proofErr w:type="spellStart"/>
       <w:r>
         <w:rPr>
           <w:b/>
@@ -6855,10 +7443,10 @@
           <w:sz w:val="20"/>
           <w:szCs w:val="20"/>
           <w:u w:val="single"/>
-          <w:highlight w:val="yellow"/>
-        </w:rPr>
-        <w:t>{letter_date}</w:t>
-      </w:r>
+        </w:rPr>
+        <w:t>i</w:t>
+      </w:r>
+      <w:proofErr w:type="spellEnd"/>
       <w:r>
         <w:rPr>
           <w:b/>
@@ -6867,33 +7455,68 @@
           <w:szCs w:val="20"/>
           <w:u w:val="single"/>
         </w:rPr>
-        <w:t xml:space="preserve"/>
-      </w:r>
-    </w:p>
-    <w:p>
-      <w:pPr>
-        <w:spacing w:line="360" w:lineRule="auto"/>
-        <w:jc w:val="both"/>
+        <w:t xml:space="preserve"> (“FACILITY”) DATED </w:t>
+      </w:r>
+      <w:r>
         <w:rPr>
           <w:b/>
           <w:bCs/>
           <w:sz w:val="20"/>
           <w:szCs w:val="20"/>
+          <w:highlight w:val="yellow"/>
           <w:u w:val="single"/>
         </w:rPr>
-      </w:pPr>
-    </w:p>
-    <w:p>
-      <w:pPr>
-        <w:spacing w:line="360" w:lineRule="auto"/>
-        <w:jc w:val="both"/>
+        <w:t>{</w:t>
+      </w:r>
+      <w:proofErr w:type="spellStart"/>
+      <w:r>
         <w:rPr>
           <w:b/>
           <w:bCs/>
           <w:sz w:val="20"/>
           <w:szCs w:val="20"/>
+          <w:highlight w:val="yellow"/>
           <w:u w:val="single"/>
         </w:rPr>
+        <w:t>letter_date</w:t>
+      </w:r>
+      <w:proofErr w:type="spellEnd"/>
+      <w:r>
+        <w:rPr>
+          <w:b/>
+          <w:bCs/>
+          <w:sz w:val="20"/>
+          <w:szCs w:val="20"/>
+          <w:highlight w:val="yellow"/>
+          <w:u w:val="single"/>
+        </w:rPr>
+        <w:t>}</w:t>
+      </w:r>
+    </w:p>
+    <w:p>
+      <w:pPr>
+        <w:spacing w:line="360" w:lineRule="auto"/>
+        <w:jc w:val="both"/>
+        <w:rPr>
+          <w:b/>
+          <w:bCs/>
+          <w:sz w:val="20"/>
+          <w:szCs w:val="20"/>
+          <w:u w:val="single"/>
+        </w:rPr>
+      </w:pPr>
+    </w:p>
+    <w:p>
+      <w:pPr>
+        <w:spacing w:line="360" w:lineRule="auto"/>
+        <w:jc w:val="both"/>
+        <w:rPr>
+          <w:b/>
+          <w:bCs/>
+          <w:sz w:val="20"/>
+          <w:szCs w:val="20"/>
+          <w:u w:val="single"/>
+        </w:rPr>
       </w:pPr>
       <w:r>
         <w:rPr>
@@ -6908,7 +7531,25 @@
           <w:szCs w:val="20"/>
           <w:highlight w:val="yellow"/>
         </w:rPr>
-        <w:t>{issuer_name}</w:t>
+        <w:t>{</w:t>
+      </w:r>
+      <w:proofErr w:type="spellStart"/>
+      <w:r>
+        <w:rPr>
+          <w:sz w:val="20"/>
+          <w:szCs w:val="20"/>
+          <w:highlight w:val="yellow"/>
+        </w:rPr>
+        <w:t>issuer_name</w:t>
+      </w:r>
+      <w:proofErr w:type="spellEnd"/>
+      <w:r>
+        <w:rPr>
+          <w:sz w:val="20"/>
+          <w:szCs w:val="20"/>
+          <w:highlight w:val="yellow"/>
+        </w:rPr>
+        <w:t>}</w:t>
       </w:r>
       <w:r>
         <w:rPr>
@@ -6923,7 +7564,25 @@
           <w:szCs w:val="20"/>
           <w:highlight w:val="yellow"/>
         </w:rPr>
-        <w:t>{issuer_registration_number}</w:t>
+        <w:t>{</w:t>
+      </w:r>
+      <w:proofErr w:type="spellStart"/>
+      <w:r>
+        <w:rPr>
+          <w:sz w:val="20"/>
+          <w:szCs w:val="20"/>
+          <w:highlight w:val="yellow"/>
+        </w:rPr>
+        <w:t>issuer_registration_number</w:t>
+      </w:r>
+      <w:proofErr w:type="spellEnd"/>
+      <w:r>
+        <w:rPr>
+          <w:sz w:val="20"/>
+          <w:szCs w:val="20"/>
+          <w:highlight w:val="yellow"/>
+        </w:rPr>
+        <w:t>}</w:t>
       </w:r>
       <w:r>
         <w:rPr>
@@ -6938,7 +7597,25 @@
           <w:szCs w:val="20"/>
           <w:highlight w:val="yellow"/>
         </w:rPr>
-        <w:t>{issuer_address}</w:t>
+        <w:t>{</w:t>
+      </w:r>
+      <w:proofErr w:type="spellStart"/>
+      <w:r>
+        <w:rPr>
+          <w:sz w:val="20"/>
+          <w:szCs w:val="20"/>
+          <w:highlight w:val="yellow"/>
+        </w:rPr>
+        <w:t>issuer_address</w:t>
+      </w:r>
+      <w:proofErr w:type="spellEnd"/>
+      <w:r>
+        <w:rPr>
+          <w:sz w:val="20"/>
+          <w:szCs w:val="20"/>
+          <w:highlight w:val="yellow"/>
+        </w:rPr>
+        <w:t>}</w:t>
       </w:r>
       <w:r>
         <w:rPr>
@@ -6953,7 +7630,25 @@
           <w:szCs w:val="20"/>
           <w:highlight w:val="yellow"/>
         </w:rPr>
-        <w:t>{financing_limit_rm}</w:t>
+        <w:t>{</w:t>
+      </w:r>
+      <w:proofErr w:type="spellStart"/>
+      <w:r>
+        <w:rPr>
+          <w:sz w:val="20"/>
+          <w:szCs w:val="20"/>
+          <w:highlight w:val="yellow"/>
+        </w:rPr>
+        <w:t>financing_limit_rm</w:t>
+      </w:r>
+      <w:proofErr w:type="spellEnd"/>
+      <w:r>
+        <w:rPr>
+          <w:sz w:val="20"/>
+          <w:szCs w:val="20"/>
+          <w:highlight w:val="yellow"/>
+        </w:rPr>
+        <w:t>}</w:t>
       </w:r>
       <w:r>
         <w:rPr>
@@ -6961,34 +7656,6 @@
           <w:szCs w:val="20"/>
         </w:rPr>
         <w:t xml:space="preserve"> ("the Facility") based upon the terms as set out above and/or and in the Schedule(s) of the Letter of Offer and/or may appear in the Transaction Documents to be executed pursuant to the Facility.</w:t>
-      </w:r>
-      <w:r>
-        <w:rPr>
-          <w:sz w:val="20"/>
-          <w:szCs w:val="20"/>
-        </w:rPr>
-        <w:t xml:space="preserve"/>
-      </w:r>
-      <w:r>
-        <w:rPr>
-          <w:sz w:val="20"/>
-          <w:szCs w:val="20"/>
-        </w:rPr>
-        <w:t xml:space="preserve"/>
-      </w:r>
-      <w:r>
-        <w:rPr>
-          <w:sz w:val="20"/>
-          <w:szCs w:val="20"/>
-        </w:rPr>
-        <w:t xml:space="preserve"/>
-      </w:r>
-      <w:r>
-        <w:rPr>
-          <w:sz w:val="20"/>
-          <w:szCs w:val="20"/>
-        </w:rPr>
-        <w:t xml:space="preserve"/>
       </w:r>
     </w:p>
     <w:p>
@@ -7139,7 +7806,25 @@
           <w:szCs w:val="20"/>
           <w:highlight w:val="yellow"/>
         </w:rPr>
-        <w:t>{issuer_name}</w:t>
+        <w:t>{</w:t>
+      </w:r>
+      <w:proofErr w:type="spellStart"/>
+      <w:r>
+        <w:rPr>
+          <w:sz w:val="20"/>
+          <w:szCs w:val="20"/>
+          <w:highlight w:val="yellow"/>
+        </w:rPr>
+        <w:t>issuer_name</w:t>
+      </w:r>
+      <w:proofErr w:type="spellEnd"/>
+      <w:r>
+        <w:rPr>
+          <w:sz w:val="20"/>
+          <w:szCs w:val="20"/>
+          <w:highlight w:val="yellow"/>
+        </w:rPr>
+        <w:t>}</w:t>
       </w:r>
       <w:r>
         <w:rPr>
@@ -7154,7 +7839,25 @@
           <w:szCs w:val="20"/>
           <w:highlight w:val="yellow"/>
         </w:rPr>
-        <w:t>{issuer_registration_number}</w:t>
+        <w:t>{</w:t>
+      </w:r>
+      <w:proofErr w:type="spellStart"/>
+      <w:r>
+        <w:rPr>
+          <w:sz w:val="20"/>
+          <w:szCs w:val="20"/>
+          <w:highlight w:val="yellow"/>
+        </w:rPr>
+        <w:t>issuer_registration_number</w:t>
+      </w:r>
+      <w:proofErr w:type="spellEnd"/>
+      <w:r>
+        <w:rPr>
+          <w:sz w:val="20"/>
+          <w:szCs w:val="20"/>
+          <w:highlight w:val="yellow"/>
+        </w:rPr>
+        <w:t>}</w:t>
       </w:r>
       <w:r>
         <w:rPr>
@@ -7163,27 +7866,6 @@
         </w:rPr>
         <w:t>)</w:t>
       </w:r>
-      <w:r>
-        <w:rPr>
-          <w:sz w:val="20"/>
-          <w:szCs w:val="20"/>
-        </w:rPr>
-        <w:t xml:space="preserve"/>
-      </w:r>
-      <w:r>
-        <w:rPr>
-          <w:sz w:val="20"/>
-          <w:szCs w:val="20"/>
-        </w:rPr>
-        <w:t xml:space="preserve"/>
-      </w:r>
-      <w:r>
-        <w:rPr>
-          <w:sz w:val="20"/>
-          <w:szCs w:val="20"/>
-        </w:rPr>
-        <w:t/>
-      </w:r>
     </w:p>
     <w:p>
       <w:pPr>
@@ -7199,7 +7881,23 @@
           <w:sz w:val="20"/>
           <w:szCs w:val="20"/>
         </w:rPr>
-        <w:t xml:space="preserve">Name of Authorised Signatory (ies): </w:t>
+        <w:t>Name of Authorised Signatory (</w:t>
+      </w:r>
+      <w:proofErr w:type="spellStart"/>
+      <w:r>
+        <w:rPr>
+          <w:sz w:val="20"/>
+          <w:szCs w:val="20"/>
+        </w:rPr>
+        <w:t>ies</w:t>
+      </w:r>
+      <w:proofErr w:type="spellEnd"/>
+      <w:r>
+        <w:rPr>
+          <w:sz w:val="20"/>
+          <w:szCs w:val="20"/>
+        </w:rPr>
+        <w:t xml:space="preserve">): </w:t>
       </w:r>
       <w:r>
         <w:rPr>
@@ -7207,14 +7905,25 @@
           <w:szCs w:val="20"/>
           <w:highlight w:val="yellow"/>
         </w:rPr>
-        <w:t>{moa_authorised_signatory_names}</w:t>
-      </w:r>
-      <w:r>
-        <w:rPr>
-          <w:sz w:val="20"/>
-          <w:szCs w:val="20"/>
-        </w:rPr>
-        <w:t/>
+        <w:t>{</w:t>
+      </w:r>
+      <w:proofErr w:type="spellStart"/>
+      <w:r>
+        <w:rPr>
+          <w:sz w:val="20"/>
+          <w:szCs w:val="20"/>
+          <w:highlight w:val="yellow"/>
+        </w:rPr>
+        <w:t>moa_authorised_signatory_names</w:t>
+      </w:r>
+      <w:proofErr w:type="spellEnd"/>
+      <w:r>
+        <w:rPr>
+          <w:sz w:val="20"/>
+          <w:szCs w:val="20"/>
+          <w:highlight w:val="yellow"/>
+        </w:rPr>
+        <w:t>}</w:t>
       </w:r>
     </w:p>
     <w:p>
@@ -7366,7 +8075,25 @@
           <w:szCs w:val="20"/>
           <w:highlight w:val="yellow"/>
         </w:rPr>
-        <w:t>{issuer_name}</w:t>
+        <w:t>{</w:t>
+      </w:r>
+      <w:proofErr w:type="spellStart"/>
+      <w:r>
+        <w:rPr>
+          <w:sz w:val="20"/>
+          <w:szCs w:val="20"/>
+          <w:highlight w:val="yellow"/>
+        </w:rPr>
+        <w:t>issuer_name</w:t>
+      </w:r>
+      <w:proofErr w:type="spellEnd"/>
+      <w:r>
+        <w:rPr>
+          <w:sz w:val="20"/>
+          <w:szCs w:val="20"/>
+          <w:highlight w:val="yellow"/>
+        </w:rPr>
+        <w:t>}</w:t>
       </w:r>
       <w:r>
         <w:rPr>
@@ -7381,7 +8108,25 @@
           <w:szCs w:val="20"/>
           <w:highlight w:val="yellow"/>
         </w:rPr>
-        <w:t>{letter_date}</w:t>
+        <w:t>{</w:t>
+      </w:r>
+      <w:proofErr w:type="spellStart"/>
+      <w:r>
+        <w:rPr>
+          <w:sz w:val="20"/>
+          <w:szCs w:val="20"/>
+          <w:highlight w:val="yellow"/>
+        </w:rPr>
+        <w:t>letter_date</w:t>
+      </w:r>
+      <w:proofErr w:type="spellEnd"/>
+      <w:r>
+        <w:rPr>
+          <w:sz w:val="20"/>
+          <w:szCs w:val="20"/>
+          <w:highlight w:val="yellow"/>
+        </w:rPr>
+        <w:t>}</w:t>
       </w:r>
       <w:r>
         <w:rPr>
@@ -7390,43 +8135,70 @@
         </w:rPr>
         <w:t>.</w:t>
       </w:r>
-      <w:r>
-        <w:rPr>
-          <w:sz w:val="20"/>
-          <w:szCs w:val="20"/>
-        </w:rPr>
-        <w:t/>
-      </w:r>
-      <w:r>
-        <w:rPr>
-          <w:sz w:val="20"/>
-          <w:szCs w:val="20"/>
-        </w:rPr>
-        <w:t xml:space="preserve"/>
-      </w:r>
-      <w:r>
-        <w:rPr>
-          <w:sz w:val="20"/>
-          <w:szCs w:val="20"/>
-        </w:rPr>
-        <w:t xml:space="preserve"/>
-      </w:r>
-    </w:p>
-    <w:p>
-      <w:pPr>
-        <w:spacing w:line="360" w:lineRule="auto"/>
-        <w:jc w:val="both"/>
-        <w:rPr>
-          <w:sz w:val="20"/>
-          <w:szCs w:val="20"/>
-        </w:rPr>
-      </w:pPr>
-      <w:r>
-        <w:rPr>
-          <w:sz w:val="20"/>
-          <w:szCs w:val="20"/>
-        </w:rPr>
-        <w:t xml:space="preserve">For the avoidance of doubt, the obligations and liabilities of the Guarantors under this Letter of Offer shall be further set out in a Guarantee Agreement to be executed by the Guarantors in favour of Shoraka Suyula Platform Sdn. Bhd. (Reg. </w:t>
+    </w:p>
+    <w:p>
+      <w:pPr>
+        <w:spacing w:line="360" w:lineRule="auto"/>
+        <w:jc w:val="both"/>
+        <w:rPr>
+          <w:sz w:val="20"/>
+          <w:szCs w:val="20"/>
+        </w:rPr>
+      </w:pPr>
+      <w:r>
+        <w:rPr>
+          <w:sz w:val="20"/>
+          <w:szCs w:val="20"/>
+        </w:rPr>
+        <w:t xml:space="preserve">For the avoidance of doubt, the obligations and liabilities of the Guarantors under this Letter of Offer shall be further set out in a Guarantee Agreement to be executed by the Guarantors in favour of </w:t>
+      </w:r>
+      <w:proofErr w:type="spellStart"/>
+      <w:r>
+        <w:rPr>
+          <w:sz w:val="20"/>
+          <w:szCs w:val="20"/>
+        </w:rPr>
+        <w:t>Shoraka</w:t>
+      </w:r>
+      <w:proofErr w:type="spellEnd"/>
+      <w:r>
+        <w:rPr>
+          <w:sz w:val="20"/>
+          <w:szCs w:val="20"/>
+        </w:rPr>
+        <w:t xml:space="preserve"> </w:t>
+      </w:r>
+      <w:proofErr w:type="spellStart"/>
+      <w:r>
+        <w:rPr>
+          <w:sz w:val="20"/>
+          <w:szCs w:val="20"/>
+        </w:rPr>
+        <w:t>Suyula</w:t>
+      </w:r>
+      <w:proofErr w:type="spellEnd"/>
+      <w:r>
+        <w:rPr>
+          <w:sz w:val="20"/>
+          <w:szCs w:val="20"/>
+        </w:rPr>
+        <w:t xml:space="preserve"> Platform </w:t>
+      </w:r>
+      <w:proofErr w:type="spellStart"/>
+      <w:r>
+        <w:rPr>
+          <w:sz w:val="20"/>
+          <w:szCs w:val="20"/>
+        </w:rPr>
+        <w:t>Sdn</w:t>
+      </w:r>
+      <w:proofErr w:type="spellEnd"/>
+      <w:r>
+        <w:rPr>
+          <w:sz w:val="20"/>
+          <w:szCs w:val="20"/>
+        </w:rPr>
+        <w:t xml:space="preserve">. Bhd. (Reg. </w:t>
       </w:r>
       <w:proofErr w:type="gramStart"/>
       <w:r>
@@ -7767,7 +8539,25 @@
           <w:szCs w:val="20"/>
           <w:highlight w:val="yellow"/>
         </w:rPr>
-        <w:t>{corporate_guarantor_name}</w:t>
+        <w:t>{</w:t>
+      </w:r>
+      <w:proofErr w:type="spellStart"/>
+      <w:r>
+        <w:rPr>
+          <w:sz w:val="20"/>
+          <w:szCs w:val="20"/>
+          <w:highlight w:val="yellow"/>
+        </w:rPr>
+        <w:t>corporate_guarantor_name</w:t>
+      </w:r>
+      <w:proofErr w:type="spellEnd"/>
+      <w:r>
+        <w:rPr>
+          <w:sz w:val="20"/>
+          <w:szCs w:val="20"/>
+          <w:highlight w:val="yellow"/>
+        </w:rPr>
+        <w:t>}</w:t>
       </w:r>
       <w:r>
         <w:rPr>
@@ -7782,7 +8572,25 @@
           <w:szCs w:val="20"/>
           <w:highlight w:val="yellow"/>
         </w:rPr>
-        <w:t>{corporate_guarantor_ssm}</w:t>
+        <w:t>{</w:t>
+      </w:r>
+      <w:proofErr w:type="spellStart"/>
+      <w:r>
+        <w:rPr>
+          <w:sz w:val="20"/>
+          <w:szCs w:val="20"/>
+          <w:highlight w:val="yellow"/>
+        </w:rPr>
+        <w:t>corporate_guarantor_ssm</w:t>
+      </w:r>
+      <w:proofErr w:type="spellEnd"/>
+      <w:r>
+        <w:rPr>
+          <w:sz w:val="20"/>
+          <w:szCs w:val="20"/>
+          <w:highlight w:val="yellow"/>
+        </w:rPr>
+        <w:t>}</w:t>
       </w:r>
       <w:r>
         <w:rPr>
@@ -7797,7 +8605,25 @@
           <w:szCs w:val="20"/>
           <w:highlight w:val="yellow"/>
         </w:rPr>
-        <w:t>{issuer_name}</w:t>
+        <w:t>{</w:t>
+      </w:r>
+      <w:proofErr w:type="spellStart"/>
+      <w:r>
+        <w:rPr>
+          <w:sz w:val="20"/>
+          <w:szCs w:val="20"/>
+          <w:highlight w:val="yellow"/>
+        </w:rPr>
+        <w:t>issuer_name</w:t>
+      </w:r>
+      <w:proofErr w:type="spellEnd"/>
+      <w:r>
+        <w:rPr>
+          <w:sz w:val="20"/>
+          <w:szCs w:val="20"/>
+          <w:highlight w:val="yellow"/>
+        </w:rPr>
+        <w:t>}</w:t>
       </w:r>
       <w:r>
         <w:rPr>
@@ -7812,7 +8638,25 @@
           <w:szCs w:val="20"/>
           <w:highlight w:val="yellow"/>
         </w:rPr>
-        <w:t>{letter_date}</w:t>
+        <w:t>{</w:t>
+      </w:r>
+      <w:proofErr w:type="spellStart"/>
+      <w:r>
+        <w:rPr>
+          <w:sz w:val="20"/>
+          <w:szCs w:val="20"/>
+          <w:highlight w:val="yellow"/>
+        </w:rPr>
+        <w:t>letter_date</w:t>
+      </w:r>
+      <w:proofErr w:type="spellEnd"/>
+      <w:r>
+        <w:rPr>
+          <w:sz w:val="20"/>
+          <w:szCs w:val="20"/>
+          <w:highlight w:val="yellow"/>
+        </w:rPr>
+        <w:t>}</w:t>
       </w:r>
       <w:r>
         <w:rPr>
@@ -7821,66 +8665,70 @@
         </w:rPr>
         <w:t>.</w:t>
       </w:r>
-      <w:r>
-        <w:rPr>
-          <w:b/>
-          <w:bCs/>
-          <w:sz w:val="20"/>
-          <w:szCs w:val="20"/>
-        </w:rPr>
-        <w:t/>
-      </w:r>
-      <w:r>
-        <w:rPr>
-          <w:sz w:val="20"/>
-          <w:szCs w:val="20"/>
-        </w:rPr>
-        <w:t xml:space="preserve"/>
-      </w:r>
-      <w:r>
-        <w:rPr>
-          <w:sz w:val="20"/>
-          <w:szCs w:val="20"/>
-        </w:rPr>
-        <w:t xml:space="preserve"/>
-      </w:r>
-      <w:r>
-        <w:rPr>
-          <w:sz w:val="20"/>
-          <w:szCs w:val="20"/>
-        </w:rPr>
-        <w:t/>
-      </w:r>
-      <w:r>
-        <w:rPr>
-          <w:sz w:val="20"/>
-          <w:szCs w:val="20"/>
-        </w:rPr>
-        <w:t xml:space="preserve"/>
-      </w:r>
-      <w:r>
-        <w:rPr>
-          <w:sz w:val="20"/>
-          <w:szCs w:val="20"/>
-        </w:rPr>
-        <w:t xml:space="preserve"/>
-      </w:r>
-    </w:p>
-    <w:p>
-      <w:pPr>
-        <w:spacing w:line="360" w:lineRule="auto"/>
-        <w:jc w:val="both"/>
-        <w:rPr>
-          <w:sz w:val="20"/>
-          <w:szCs w:val="20"/>
-        </w:rPr>
-      </w:pPr>
-      <w:r>
-        <w:rPr>
-          <w:sz w:val="20"/>
-          <w:szCs w:val="20"/>
-        </w:rPr>
-        <w:t xml:space="preserve">For the avoidance of doubt, the obligations and liabilities of the Guarantors under this Letter of Offer shall be further set out in a Guarantee Agreement to be executed by the Guarantors in favour of Shoraka Suyula Platform Sdn. Bhd. (Reg. </w:t>
+    </w:p>
+    <w:p>
+      <w:pPr>
+        <w:spacing w:line="360" w:lineRule="auto"/>
+        <w:jc w:val="both"/>
+        <w:rPr>
+          <w:sz w:val="20"/>
+          <w:szCs w:val="20"/>
+        </w:rPr>
+      </w:pPr>
+      <w:r>
+        <w:rPr>
+          <w:sz w:val="20"/>
+          <w:szCs w:val="20"/>
+        </w:rPr>
+        <w:t xml:space="preserve">For the avoidance of doubt, the obligations and liabilities of the Guarantors under this Letter of Offer shall be further set out in a Guarantee Agreement to be executed by the Guarantors in favour of </w:t>
+      </w:r>
+      <w:proofErr w:type="spellStart"/>
+      <w:r>
+        <w:rPr>
+          <w:sz w:val="20"/>
+          <w:szCs w:val="20"/>
+        </w:rPr>
+        <w:t>Shoraka</w:t>
+      </w:r>
+      <w:proofErr w:type="spellEnd"/>
+      <w:r>
+        <w:rPr>
+          <w:sz w:val="20"/>
+          <w:szCs w:val="20"/>
+        </w:rPr>
+        <w:t xml:space="preserve"> </w:t>
+      </w:r>
+      <w:proofErr w:type="spellStart"/>
+      <w:r>
+        <w:rPr>
+          <w:sz w:val="20"/>
+          <w:szCs w:val="20"/>
+        </w:rPr>
+        <w:t>Suyula</w:t>
+      </w:r>
+      <w:proofErr w:type="spellEnd"/>
+      <w:r>
+        <w:rPr>
+          <w:sz w:val="20"/>
+          <w:szCs w:val="20"/>
+        </w:rPr>
+        <w:t xml:space="preserve"> Platform </w:t>
+      </w:r>
+      <w:proofErr w:type="spellStart"/>
+      <w:r>
+        <w:rPr>
+          <w:sz w:val="20"/>
+          <w:szCs w:val="20"/>
+        </w:rPr>
+        <w:t>Sdn</w:t>
+      </w:r>
+      <w:proofErr w:type="spellEnd"/>
+      <w:r>
+        <w:rPr>
+          <w:sz w:val="20"/>
+          <w:szCs w:val="20"/>
+        </w:rPr>
+        <w:t xml:space="preserve">. Bhd. (Reg. </w:t>
       </w:r>
       <w:proofErr w:type="gramStart"/>
       <w:r>
@@ -8369,7 +9217,23 @@
           <w:sz w:val="20"/>
           <w:szCs w:val="20"/>
         </w:rPr>
-        <w:t>By accepting this Letter of Offer, you hereby acknowledge and agree that SSP has made available to you the facility(ies) in full reliance upon your representations and warranties, which you confirm as follows:</w:t>
+        <w:t>By accepting this Letter of Offer, you hereby acknowledge and agree that SSP has made available to you the facility(</w:t>
+      </w:r>
+      <w:proofErr w:type="spellStart"/>
+      <w:r>
+        <w:rPr>
+          <w:sz w:val="20"/>
+          <w:szCs w:val="20"/>
+        </w:rPr>
+        <w:t>ies</w:t>
+      </w:r>
+      <w:proofErr w:type="spellEnd"/>
+      <w:r>
+        <w:rPr>
+          <w:sz w:val="20"/>
+          <w:szCs w:val="20"/>
+        </w:rPr>
+        <w:t>) in full reliance upon your representations and warranties, which you confirm as follows:</w:t>
       </w:r>
     </w:p>
     <w:p>
@@ -8426,7 +9290,23 @@
           <w:sz w:val="20"/>
           <w:szCs w:val="20"/>
         </w:rPr>
-        <w:t>You possess the requisite authority to accept the facility(ies) under the terms set forth herein and to perform the obligations specified in this Letter of Offer.</w:t>
+        <w:t>You possess the requisite authority to accept the facility(</w:t>
+      </w:r>
+      <w:proofErr w:type="spellStart"/>
+      <w:r>
+        <w:rPr>
+          <w:sz w:val="20"/>
+          <w:szCs w:val="20"/>
+        </w:rPr>
+        <w:t>ies</w:t>
+      </w:r>
+      <w:proofErr w:type="spellEnd"/>
+      <w:r>
+        <w:rPr>
+          <w:sz w:val="20"/>
+          <w:szCs w:val="20"/>
+        </w:rPr>
+        <w:t>) under the terms set forth herein and to perform the obligations specified in this Letter of Offer.</w:t>
       </w:r>
     </w:p>
     <w:p>
@@ -8472,7 +9352,23 @@
           <w:sz w:val="20"/>
           <w:szCs w:val="20"/>
         </w:rPr>
-        <w:t>The acceptance and utilization of the facility(ies) will not exceed your authorized powers nor contravene any applicable laws, regulations, orders, decrees, or governmental directives, nor will it violate any provision of your corporate Constitution, nor any contractual or legal obligation, including mortgages, charges, or any other undertaking to which you are a party, or any restrictions placed upon your borrowing capacity. Furthermore, it will not result in the creation or imposition of, nor any obligation to create or impose, any lien, charge, pledge, or security interest on your assets, except as permitted by the relevant legal and/or security documents.</w:t>
+        <w:t>The acceptance and utilization of the facility(</w:t>
+      </w:r>
+      <w:proofErr w:type="spellStart"/>
+      <w:r>
+        <w:rPr>
+          <w:sz w:val="20"/>
+          <w:szCs w:val="20"/>
+        </w:rPr>
+        <w:t>ies</w:t>
+      </w:r>
+      <w:proofErr w:type="spellEnd"/>
+      <w:r>
+        <w:rPr>
+          <w:sz w:val="20"/>
+          <w:szCs w:val="20"/>
+        </w:rPr>
+        <w:t>) will not exceed your authorized powers nor contravene any applicable laws, regulations, orders, decrees, or governmental directives, nor will it violate any provision of your corporate Constitution, nor any contractual or legal obligation, including mortgages, charges, or any other undertaking to which you are a party, or any restrictions placed upon your borrowing capacity. Furthermore, it will not result in the creation or imposition of, nor any obligation to create or impose, any lien, charge, pledge, or security interest on your assets, except as permitted by the relevant legal and/or security documents.</w:t>
       </w:r>
     </w:p>
     <w:p>
@@ -8541,7 +9437,24 @@
           <w:sz w:val="20"/>
           <w:szCs w:val="20"/>
         </w:rPr>
-        <w:t>Since the date of your application for the facility(ies), there has been no material adverse change in your financial condition or operations.</w:t>
+        <w:lastRenderedPageBreak/>
+        <w:t>Since the date of your application for the facility(</w:t>
+      </w:r>
+      <w:proofErr w:type="spellStart"/>
+      <w:r>
+        <w:rPr>
+          <w:sz w:val="20"/>
+          <w:szCs w:val="20"/>
+        </w:rPr>
+        <w:t>ies</w:t>
+      </w:r>
+      <w:proofErr w:type="spellEnd"/>
+      <w:r>
+        <w:rPr>
+          <w:sz w:val="20"/>
+          <w:szCs w:val="20"/>
+        </w:rPr>
+        <w:t>), there has been no material adverse change in your financial condition or operations.</w:t>
       </w:r>
     </w:p>
     <w:p>
@@ -8564,8 +9477,23 @@
           <w:sz w:val="20"/>
           <w:szCs w:val="20"/>
         </w:rPr>
-        <w:lastRenderedPageBreak/>
-        <w:t>All information provided by you in connection with the facility(ies) is complete, accurate, and does not omit any material facts that would make any statements made by you misleading. Furthermore, all representations of expectation, intention, belief, and opinion made by you have been made in good faith, on reasonable grounds, and following due and proper inquiry.</w:t>
+        <w:t>All information provided by you in connection with the facility(</w:t>
+      </w:r>
+      <w:proofErr w:type="spellStart"/>
+      <w:r>
+        <w:rPr>
+          <w:sz w:val="20"/>
+          <w:szCs w:val="20"/>
+        </w:rPr>
+        <w:t>ies</w:t>
+      </w:r>
+      <w:proofErr w:type="spellEnd"/>
+      <w:r>
+        <w:rPr>
+          <w:sz w:val="20"/>
+          <w:szCs w:val="20"/>
+        </w:rPr>
+        <w:t>) is complete, accurate, and does not omit any material facts that would make any statements made by you misleading. Furthermore, all representations of expectation, intention, belief, and opinion made by you have been made in good faith, on reasonable grounds, and following due and proper inquiry.</w:t>
       </w:r>
     </w:p>
     <w:p>
@@ -8687,7 +9615,39 @@
           <w:sz w:val="20"/>
           <w:szCs w:val="20"/>
         </w:rPr>
-        <w:t>The representations and warranties contained in this Letter of Offer shall survive the acceptance of this Letter of Offer, the execution of the legal and/or security documentation, and any drawdown or utilization of the facility(ies), and shall remain in full force and effect until the full and final settlement of all amounts owed under the facility(ies), except for those provisions relating to financial statements under item (9), which shall be construed as referring to the most recent available annual accounts.</w:t>
+        <w:t>The representations and warranties contained in this Letter of Offer shall survive the acceptance of this Letter of Offer, the execution of the legal and/or security documentation, and any drawdown or utilization of the facility(</w:t>
+      </w:r>
+      <w:proofErr w:type="spellStart"/>
+      <w:r>
+        <w:rPr>
+          <w:sz w:val="20"/>
+          <w:szCs w:val="20"/>
+        </w:rPr>
+        <w:t>ies</w:t>
+      </w:r>
+      <w:proofErr w:type="spellEnd"/>
+      <w:r>
+        <w:rPr>
+          <w:sz w:val="20"/>
+          <w:szCs w:val="20"/>
+        </w:rPr>
+        <w:t>), and shall remain in full force and effect until the full and final settlement of all amounts owed under the facility(</w:t>
+      </w:r>
+      <w:proofErr w:type="spellStart"/>
+      <w:r>
+        <w:rPr>
+          <w:sz w:val="20"/>
+          <w:szCs w:val="20"/>
+        </w:rPr>
+        <w:t>ies</w:t>
+      </w:r>
+      <w:proofErr w:type="spellEnd"/>
+      <w:r>
+        <w:rPr>
+          <w:sz w:val="20"/>
+          <w:szCs w:val="20"/>
+        </w:rPr>
+        <w:t>), except for those provisions relating to financial statements under item (9), which shall be construed as referring to the most recent available annual accounts.</w:t>
       </w:r>
     </w:p>
     <w:p>
@@ -8791,7 +9751,23 @@
           <w:sz w:val="20"/>
           <w:szCs w:val="20"/>
         </w:rPr>
-        <w:t>By accepting this Letter of Offer, you covenant and agree that for so long as the facility(ies) or any part thereof, or any charges or other sums payable hereunder remain outstanding, and/or so long as any money remains to be financed hereunder, you shall:</w:t>
+        <w:t>By accepting this Letter of Offer, you covenant and agree that for so long as the facility(</w:t>
+      </w:r>
+      <w:proofErr w:type="spellStart"/>
+      <w:r>
+        <w:rPr>
+          <w:sz w:val="20"/>
+          <w:szCs w:val="20"/>
+        </w:rPr>
+        <w:t>ies</w:t>
+      </w:r>
+      <w:proofErr w:type="spellEnd"/>
+      <w:r>
+        <w:rPr>
+          <w:sz w:val="20"/>
+          <w:szCs w:val="20"/>
+        </w:rPr>
+        <w:t>) or any part thereof, or any charges or other sums payable hereunder remain outstanding, and/or so long as any money remains to be financed hereunder, you shall:</w:t>
       </w:r>
     </w:p>
     <w:p>
@@ -8839,7 +9815,23 @@
           <w:sz w:val="20"/>
           <w:szCs w:val="20"/>
         </w:rPr>
-        <w:t xml:space="preserve">Active Account Management: Operate your account in a fully active and satisfactory manner, ensuring that the approved limit of the facility(ies) is </w:t>
+        <w:t>Active Account Management: Operate your account in a fully active and satisfactory manner, ensuring that the approved limit of the facility(</w:t>
+      </w:r>
+      <w:proofErr w:type="spellStart"/>
+      <w:r>
+        <w:rPr>
+          <w:sz w:val="20"/>
+          <w:szCs w:val="20"/>
+        </w:rPr>
+        <w:t>ies</w:t>
+      </w:r>
+      <w:proofErr w:type="spellEnd"/>
+      <w:r>
+        <w:rPr>
+          <w:sz w:val="20"/>
+          <w:szCs w:val="20"/>
+        </w:rPr>
+        <w:t xml:space="preserve">) is </w:t>
       </w:r>
       <w:proofErr w:type="gramStart"/>
       <w:r>
@@ -9153,6 +10145,7 @@
           <w:sz w:val="20"/>
           <w:szCs w:val="20"/>
         </w:rPr>
+        <w:lastRenderedPageBreak/>
         <w:t>Payment of Taxes and Outgoings: Ensure the timely payment of all taxes, rates, and other outgoings related to your assets, including penalties. In the event of non-payment, P2P Operator may, at its discretion, pay the amounts on your behalf and submit the receipts to you for reimbursement.</w:t>
       </w:r>
     </w:p>
@@ -9221,7 +10214,6 @@
           <w:sz w:val="20"/>
           <w:szCs w:val="20"/>
         </w:rPr>
-        <w:lastRenderedPageBreak/>
         <w:t>Notification of Adverse Events: Immediately notify SSP of any event described in Paragraph C hereof, or any material adverse change in your financial condition, or any other event that may reasonably affect your ability to perform your obligations under this Letter of Offer or any related legal and/or security documents.</w:t>
       </w:r>
     </w:p>
@@ -9374,7 +10366,23 @@
           <w:sz w:val="20"/>
           <w:szCs w:val="20"/>
         </w:rPr>
-        <w:t>Subordination of Other Financing: Ensure that all present and future financing facilities granted to you by your directors, shareholders, or related companies are subordinated to the facility(ies) under this Letter of Offer.</w:t>
+        <w:t>Subordination of Other Financing: Ensure that all present and future financing facilities granted to you by your directors, shareholders, or related companies are subordinated to the facility(</w:t>
+      </w:r>
+      <w:proofErr w:type="spellStart"/>
+      <w:r>
+        <w:rPr>
+          <w:sz w:val="20"/>
+          <w:szCs w:val="20"/>
+        </w:rPr>
+        <w:t>ies</w:t>
+      </w:r>
+      <w:proofErr w:type="spellEnd"/>
+      <w:r>
+        <w:rPr>
+          <w:sz w:val="20"/>
+          <w:szCs w:val="20"/>
+        </w:rPr>
+        <w:t>) under this Letter of Offer.</w:t>
       </w:r>
     </w:p>
     <w:p>
@@ -9408,6 +10416,7 @@
           <w:sz w:val="20"/>
           <w:szCs w:val="20"/>
         </w:rPr>
+        <w:lastRenderedPageBreak/>
         <w:t xml:space="preserve">Ranking of Liabilities: Ensure that your liabilities under this Letter of Offer and the related legal and/or security documents will </w:t>
       </w:r>
       <w:proofErr w:type="gramStart"/>
@@ -9627,7 +10636,6 @@
           <w:sz w:val="20"/>
           <w:szCs w:val="20"/>
         </w:rPr>
-        <w:lastRenderedPageBreak/>
         <w:t>Negative Covenants</w:t>
       </w:r>
     </w:p>
@@ -9726,7 +10734,7 @@
           <w:sz w:val="20"/>
           <w:szCs w:val="20"/>
         </w:rPr>
-        <w:t xml:space="preserve">Creation of Liens: Create or permit any lien or encumbrance on any of your assets, except for tax or statutory liens that are discharged within thirty (30) days of final adjudication, security granted in the ordinary course of business in connection with other financing and any security which does not materially prejudice the interests of the investors. "Lien" includes any assignment, mortgage, pledge, charge, privilege, encumbrance, or priority, and "assets" include any rights, receivables, or property, whether movable or immovable, present or future.</w:t>
+        <w:t>Creation of Liens: Create or permit any lien or encumbrance on any of your assets, except for tax or statutory liens that are discharged within thirty (30) days of final adjudication, security granted in the ordinary course of business in connection with other financing and any security which does not materially prejudice the interests of the investors. "Lien" includes any assignment, mortgage, pledge, charge, privilege, encumbrance, or priority, and "assets" include any rights, receivables, or property, whether movable or immovable, present or future.</w:t>
       </w:r>
       <w:r>
         <w:rPr>
@@ -9758,6 +10766,7 @@
           <w:sz w:val="20"/>
           <w:szCs w:val="20"/>
         </w:rPr>
+        <w:lastRenderedPageBreak/>
         <w:t>Financial Assistance to Related Entities: Lend money or provide financing to your holding company, related corporations, or any other entities, except for normal trade guarantees or temporary financing in the ordinary course of business.</w:t>
       </w:r>
     </w:p>
@@ -9928,8 +10937,23 @@
           <w:sz w:val="20"/>
           <w:szCs w:val="20"/>
         </w:rPr>
-        <w:lastRenderedPageBreak/>
-        <w:t>Alteration of Facility Purpose: Alter the purpose or application of the facility(ies) or any part thereof.</w:t>
+        <w:t>Alteration of Facility Purpose: Alter the purpose or application of the facility(</w:t>
+      </w:r>
+      <w:proofErr w:type="spellStart"/>
+      <w:r>
+        <w:rPr>
+          <w:sz w:val="20"/>
+          <w:szCs w:val="20"/>
+        </w:rPr>
+        <w:t>ies</w:t>
+      </w:r>
+      <w:proofErr w:type="spellEnd"/>
+      <w:r>
+        <w:rPr>
+          <w:sz w:val="20"/>
+          <w:szCs w:val="20"/>
+        </w:rPr>
+        <w:t>) or any part thereof.</w:t>
       </w:r>
     </w:p>
     <w:p>
@@ -10031,7 +11055,39 @@
           <w:sz w:val="20"/>
           <w:szCs w:val="20"/>
         </w:rPr>
-        <w:t>Notwithstanding any provisions herein regarding repayment of the facility(ies), SSP reserves the right to cancel the facility(ies), or any part thereof, whereupon all principal, advances, late payment charges, and all other sums owed to SSP and/or Investors, secured by any security, shall be immediately repayable upon demand. SSP may also withdraw any sums payable by you to SSP and/or Investors from your account under the following circumstances:</w:t>
+        <w:t>Notwithstanding any provisions herein regarding repayment of the facility(</w:t>
+      </w:r>
+      <w:proofErr w:type="spellStart"/>
+      <w:r>
+        <w:rPr>
+          <w:sz w:val="20"/>
+          <w:szCs w:val="20"/>
+        </w:rPr>
+        <w:t>ies</w:t>
+      </w:r>
+      <w:proofErr w:type="spellEnd"/>
+      <w:r>
+        <w:rPr>
+          <w:sz w:val="20"/>
+          <w:szCs w:val="20"/>
+        </w:rPr>
+        <w:t>), SSP reserves the right to cancel the facility(</w:t>
+      </w:r>
+      <w:proofErr w:type="spellStart"/>
+      <w:r>
+        <w:rPr>
+          <w:sz w:val="20"/>
+          <w:szCs w:val="20"/>
+        </w:rPr>
+        <w:t>ies</w:t>
+      </w:r>
+      <w:proofErr w:type="spellEnd"/>
+      <w:r>
+        <w:rPr>
+          <w:sz w:val="20"/>
+          <w:szCs w:val="20"/>
+        </w:rPr>
+        <w:t>), or any part thereof, whereupon all principal, advances, late payment charges, and all other sums owed to SSP and/or Investors, secured by any security, shall be immediately repayable upon demand. SSP may also withdraw any sums payable by you to SSP and/or Investors from your account under the following circumstances:</w:t>
       </w:r>
     </w:p>
     <w:p>
@@ -10065,7 +11121,55 @@
           <w:sz w:val="20"/>
           <w:szCs w:val="20"/>
         </w:rPr>
-        <w:t>Payment Default: You, your guarantor, or any party providing security for the facility(ies) (referred to as the “Security Party”) (i) defaults or fails to pay any amount due under the facility(ies), or (ii) fails to pay any amounts owed by you, your guarantor, or security party under any other agreement or arrangement with SSP and/or Investors or any other P2P operator.</w:t>
+        <w:t>Payment Default: You, your guarantor, or any party providing security for the facility(</w:t>
+      </w:r>
+      <w:proofErr w:type="spellStart"/>
+      <w:r>
+        <w:rPr>
+          <w:sz w:val="20"/>
+          <w:szCs w:val="20"/>
+        </w:rPr>
+        <w:t>ies</w:t>
+      </w:r>
+      <w:proofErr w:type="spellEnd"/>
+      <w:r>
+        <w:rPr>
+          <w:sz w:val="20"/>
+          <w:szCs w:val="20"/>
+        </w:rPr>
+        <w:t>) (referred to as the “Security Party”) (</w:t>
+      </w:r>
+      <w:proofErr w:type="spellStart"/>
+      <w:r>
+        <w:rPr>
+          <w:sz w:val="20"/>
+          <w:szCs w:val="20"/>
+        </w:rPr>
+        <w:t>i</w:t>
+      </w:r>
+      <w:proofErr w:type="spellEnd"/>
+      <w:r>
+        <w:rPr>
+          <w:sz w:val="20"/>
+          <w:szCs w:val="20"/>
+        </w:rPr>
+        <w:t>) defaults or fails to pay any amount due under the facility(</w:t>
+      </w:r>
+      <w:proofErr w:type="spellStart"/>
+      <w:r>
+        <w:rPr>
+          <w:sz w:val="20"/>
+          <w:szCs w:val="20"/>
+        </w:rPr>
+        <w:t>ies</w:t>
+      </w:r>
+      <w:proofErr w:type="spellEnd"/>
+      <w:r>
+        <w:rPr>
+          <w:sz w:val="20"/>
+          <w:szCs w:val="20"/>
+        </w:rPr>
+        <w:t>), or (ii) fails to pay any amounts owed by you, your guarantor, or security party under any other agreement or arrangement with SSP and/or Investors or any other P2P operator.</w:t>
       </w:r>
     </w:p>
     <w:p>
@@ -10164,7 +11268,7 @@
           <w:sz w:val="20"/>
           <w:szCs w:val="20"/>
         </w:rPr>
-        <w:t xml:space="preserve">Distress or Execution: A distress or execution is levied or enforced upon any of your property or assets, or those of your guarantor or any security party, and remains unsatisfied within seven (7) days from the commencement of such distress or execution.</w:t>
+        <w:t>Distress or Execution: A distress or execution is levied or enforced upon any of your property or assets, or those of your guarantor or any security party, and remains unsatisfied within seven (7) days from the commencement of such distress or execution.</w:t>
       </w:r>
     </w:p>
     <w:p>
@@ -10292,7 +11396,24 @@
           <w:sz w:val="20"/>
           <w:szCs w:val="20"/>
         </w:rPr>
-        <w:t>Security in Jeopardy: SSP reasonably believes that the security held in its favor is in jeopardy.</w:t>
+        <w:lastRenderedPageBreak/>
+        <w:t xml:space="preserve">Security in Jeopardy: SSP reasonably believes that the security held in its </w:t>
+      </w:r>
+      <w:proofErr w:type="spellStart"/>
+      <w:r>
+        <w:rPr>
+          <w:sz w:val="20"/>
+          <w:szCs w:val="20"/>
+        </w:rPr>
+        <w:t>favor</w:t>
+      </w:r>
+      <w:proofErr w:type="spellEnd"/>
+      <w:r>
+        <w:rPr>
+          <w:sz w:val="20"/>
+          <w:szCs w:val="20"/>
+        </w:rPr>
+        <w:t xml:space="preserve"> is in jeopardy.</w:t>
       </w:r>
     </w:p>
     <w:p>
@@ -10356,7 +11477,23 @@
           <w:sz w:val="20"/>
           <w:szCs w:val="20"/>
         </w:rPr>
-        <w:t>Contradiction of Terms: The utilization of the facility(ies) and/or any other accounts maintained by you with SSP is deemed by SSP to contradict the terms and conditions herein.</w:t>
+        <w:t>Contradiction of Terms: The utilization of the facility(</w:t>
+      </w:r>
+      <w:proofErr w:type="spellStart"/>
+      <w:r>
+        <w:rPr>
+          <w:sz w:val="20"/>
+          <w:szCs w:val="20"/>
+        </w:rPr>
+        <w:t>ies</w:t>
+      </w:r>
+      <w:proofErr w:type="spellEnd"/>
+      <w:r>
+        <w:rPr>
+          <w:sz w:val="20"/>
+          <w:szCs w:val="20"/>
+        </w:rPr>
+        <w:t>) and/or any other accounts maintained by you with SSP is deemed by SSP to contradict the terms and conditions herein.</w:t>
       </w:r>
     </w:p>
     <w:p>
@@ -10532,7 +11669,6 @@
           <w:sz w:val="20"/>
           <w:szCs w:val="20"/>
         </w:rPr>
-        <w:lastRenderedPageBreak/>
         <w:t>Indebtedness Due Before Maturity: Any of your indebtedness, or that of your guarantor or any security party, becomes due or capable of being declared due before its stated maturity, any guarantee given by you, your guarantor, or any security party is not discharged when due, or you, your guarantor, or any security party defaults or breaches any instrument or agreement relating to any such indebtedness or guarantee.</w:t>
       </w:r>
     </w:p>
@@ -10565,7 +11701,15 @@
           <w:sz w:val="20"/>
           <w:szCs w:val="20"/>
         </w:rPr>
-        <w:t xml:space="preserve">Failure to Satisfy Judgment: You or your guarantor or any security party fails to satisfy any judgment rendered against them by a court of competent jurisdiction, and no appeal is made within the prescribed time or such appeal is dismissed. In the case of a judgment obtained in default of appearance, no application to set aside such judgment is made within thirty (30) days of the date of becoming aware of the judgment.</w:t>
+        <w:t xml:space="preserve">Failure to Satisfy Judgment: You or your guarantor or any security party fails to satisfy any judgment rendered against them by a court of competent jurisdiction, and no appeal is made within the prescribed time or such appeal is dismissed. In the case of a judgment obtained in default of </w:t>
+      </w:r>
+      <w:r>
+        <w:rPr>
+          <w:sz w:val="20"/>
+          <w:szCs w:val="20"/>
+        </w:rPr>
+        <w:lastRenderedPageBreak/>
+        <w:t>appearance, no application to set aside such judgment is made within thirty (30) days of the date of becoming aware of the judgment.</w:t>
       </w:r>
     </w:p>
     <w:p>
@@ -10725,7 +11869,23 @@
           <w:sz w:val="20"/>
           <w:szCs w:val="20"/>
         </w:rPr>
-        <w:t>Breach of Warranties or Violations: SSP has the right to suspend or terminate the facility(ies), including any operating accounts or any part thereof, with immediate written notice should SSP become aware of any breach of your warranties, undertakings, or any violation of applicable Anti-Corruption Laws, Sanctions, and/or AMLATFAPUAA (as defined below).</w:t>
+        <w:t>Breach of Warranties or Violations: SSP has the right to suspend or terminate the facility(</w:t>
+      </w:r>
+      <w:proofErr w:type="spellStart"/>
+      <w:r>
+        <w:rPr>
+          <w:sz w:val="20"/>
+          <w:szCs w:val="20"/>
+        </w:rPr>
+        <w:t>ies</w:t>
+      </w:r>
+      <w:proofErr w:type="spellEnd"/>
+      <w:r>
+        <w:rPr>
+          <w:sz w:val="20"/>
+          <w:szCs w:val="20"/>
+        </w:rPr>
+        <w:t>), including any operating accounts or any part thereof, with immediate written notice should SSP become aware of any breach of your warranties, undertakings, or any violation of applicable Anti-Corruption Laws, Sanctions, and/or AMLATFAPUAA (as defined below).</w:t>
       </w:r>
     </w:p>
     <w:p>
@@ -10757,7 +11917,23 @@
           <w:sz w:val="20"/>
           <w:szCs w:val="20"/>
         </w:rPr>
-        <w:t>Other Events of Default: Any other event of default as may be stipulated in the legal documentation for the facility(ies).</w:t>
+        <w:t>Other Events of Default: Any other event of default as may be stipulated in the legal documentation for the facility(</w:t>
+      </w:r>
+      <w:proofErr w:type="spellStart"/>
+      <w:r>
+        <w:rPr>
+          <w:sz w:val="20"/>
+          <w:szCs w:val="20"/>
+        </w:rPr>
+        <w:t>ies</w:t>
+      </w:r>
+      <w:proofErr w:type="spellEnd"/>
+      <w:r>
+        <w:rPr>
+          <w:sz w:val="20"/>
+          <w:szCs w:val="20"/>
+        </w:rPr>
+        <w:t>).</w:t>
       </w:r>
     </w:p>
     <w:p>
@@ -10800,7 +11976,6 @@
           <w:szCs w:val="20"/>
           <w:lang w:val="en-US"/>
         </w:rPr>
-        <w:lastRenderedPageBreak/>
         <w:t>INDEMNITY</w:t>
       </w:r>
     </w:p>
@@ -10835,7 +12010,25 @@
           <w:szCs w:val="20"/>
           <w:lang w:val="en-US"/>
         </w:rPr>
-        <w:t>You hereby covenant to indemnify and hold harmless SSP from and against any loss, damage, liability, claim, or expense (including legal fees on a solicitor and client basis) that SSP may incur or suffer as a result of any default, breach, or failure on your part to duly perform any of the obligations assumed by you under this Letter of Offer in relation to the facility(ies).</w:t>
+        <w:t>You hereby covenant to indemnify and hold harmless SSP from and against any loss, damage, liability, claim, or expense (including legal fees on a solicitor and client basis) that SSP may incur or suffer as a result of any default, breach, or failure on your part to duly perform any of the obligations assumed by you under this Letter of Offer in relation to the facility(</w:t>
+      </w:r>
+      <w:proofErr w:type="spellStart"/>
+      <w:r>
+        <w:rPr>
+          <w:sz w:val="20"/>
+          <w:szCs w:val="20"/>
+          <w:lang w:val="en-US"/>
+        </w:rPr>
+        <w:t>ies</w:t>
+      </w:r>
+      <w:proofErr w:type="spellEnd"/>
+      <w:r>
+        <w:rPr>
+          <w:sz w:val="20"/>
+          <w:szCs w:val="20"/>
+          <w:lang w:val="en-US"/>
+        </w:rPr>
+        <w:t>).</w:t>
       </w:r>
     </w:p>
     <w:p>
@@ -10874,6 +12067,7 @@
           <w:szCs w:val="20"/>
           <w:lang w:val="en-US"/>
         </w:rPr>
+        <w:lastRenderedPageBreak/>
         <w:t>COSTS, EXPENSES, AND FEES</w:t>
       </w:r>
     </w:p>
@@ -10948,7 +12142,25 @@
           <w:szCs w:val="20"/>
           <w:lang w:val="en-US"/>
         </w:rPr>
-        <w:t>, after accepting this Letter of Offer, you fail for any reason whatsoever to proceed with the facility(ies), you shall bear all costs and expenses incurred by SSP, including any fees charged by solicitors instructed by SSP. You shall also be liable to pay all fees and expenses, including SSP’s legal fees, if any sums owed by you are required to be recovered through legal proceedings or by SSP’s solicitors.</w:t>
+        <w:t>, after accepting this Letter of Offer, you fail for any reason whatsoever to proceed with the facility(</w:t>
+      </w:r>
+      <w:proofErr w:type="spellStart"/>
+      <w:r>
+        <w:rPr>
+          <w:sz w:val="20"/>
+          <w:szCs w:val="20"/>
+          <w:lang w:val="en-US"/>
+        </w:rPr>
+        <w:t>ies</w:t>
+      </w:r>
+      <w:proofErr w:type="spellEnd"/>
+      <w:r>
+        <w:rPr>
+          <w:sz w:val="20"/>
+          <w:szCs w:val="20"/>
+          <w:lang w:val="en-US"/>
+        </w:rPr>
+        <w:t>), you shall bear all costs and expenses incurred by SSP, including any fees charged by solicitors instructed by SSP. You shall also be liable to pay all fees and expenses, including SSP’s legal fees, if any sums owed by you are required to be recovered through legal proceedings or by SSP’s solicitors.</w:t>
       </w:r>
     </w:p>
     <w:p>
@@ -11110,7 +12322,25 @@
           <w:szCs w:val="20"/>
           <w:lang w:val="en-US"/>
         </w:rPr>
-        <w:t>If SSP determines that the introduction or change of any law (or any change in the interpretation or application of any law), regulation, directive, or request from any governmental or regulatory authority (whether or not having the force of law) increases the cost to SSP/ Investors of making, maintaining, or financing any amount paid out or contingently to be paid under the facility(ies), then:</w:t>
+        <w:t>If SSP determines that the introduction or change of any law (or any change in the interpretation or application of any law), regulation, directive, or request from any governmental or regulatory authority (whether or not having the force of law) increases the cost to SSP/ Investors of making, maintaining, or financing any amount paid out or contingently to be paid under the facility(</w:t>
+      </w:r>
+      <w:proofErr w:type="spellStart"/>
+      <w:r>
+        <w:rPr>
+          <w:sz w:val="20"/>
+          <w:szCs w:val="20"/>
+          <w:lang w:val="en-US"/>
+        </w:rPr>
+        <w:t>ies</w:t>
+      </w:r>
+      <w:proofErr w:type="spellEnd"/>
+      <w:r>
+        <w:rPr>
+          <w:sz w:val="20"/>
+          <w:szCs w:val="20"/>
+          <w:lang w:val="en-US"/>
+        </w:rPr>
+        <w:t>), then:</w:t>
       </w:r>
     </w:p>
     <w:p>
@@ -11172,7 +12402,25 @@
           <w:szCs w:val="20"/>
           <w:lang w:val="en-US"/>
         </w:rPr>
-        <w:t>SSP shall be entitled to adjust the late payment charges rate on the facility(ies);</w:t>
+        <w:t>SSP shall be entitled to adjust the late payment charges rate on the facility(</w:t>
+      </w:r>
+      <w:proofErr w:type="spellStart"/>
+      <w:r>
+        <w:rPr>
+          <w:sz w:val="20"/>
+          <w:szCs w:val="20"/>
+          <w:lang w:val="en-US"/>
+        </w:rPr>
+        <w:t>ies</w:t>
+      </w:r>
+      <w:proofErr w:type="spellEnd"/>
+      <w:r>
+        <w:rPr>
+          <w:sz w:val="20"/>
+          <w:szCs w:val="20"/>
+          <w:lang w:val="en-US"/>
+        </w:rPr>
+        <w:t>);</w:t>
       </w:r>
     </w:p>
     <w:p>
@@ -11240,7 +12488,6 @@
           <w:szCs w:val="20"/>
           <w:lang w:val="en-US"/>
         </w:rPr>
-        <w:lastRenderedPageBreak/>
         <w:t>For as long as the circumstances giving rise to the obligation to make such compensatory payments continue:</w:t>
       </w:r>
     </w:p>
@@ -11278,7 +12525,26 @@
           <w:szCs w:val="20"/>
           <w:lang w:val="en-US"/>
         </w:rPr>
-        <w:t>At your election, by notice to SSP, SSP and/or Investors' obligation to fund any further utilization shall terminate, and the facility(ies) shall be cancelled to the extent specified; and</w:t>
+        <w:lastRenderedPageBreak/>
+        <w:t>At your election, by notice to SSP, SSP and/or Investors' obligation to fund any further utilization shall terminate, and the facility(</w:t>
+      </w:r>
+      <w:proofErr w:type="spellStart"/>
+      <w:r>
+        <w:rPr>
+          <w:sz w:val="20"/>
+          <w:szCs w:val="20"/>
+          <w:lang w:val="en-US"/>
+        </w:rPr>
+        <w:t>ies</w:t>
+      </w:r>
+      <w:proofErr w:type="spellEnd"/>
+      <w:r>
+        <w:rPr>
+          <w:sz w:val="20"/>
+          <w:szCs w:val="20"/>
+          <w:lang w:val="en-US"/>
+        </w:rPr>
+        <w:t>) shall be cancelled to the extent specified; and</w:t>
       </w:r>
     </w:p>
     <w:p>
@@ -11321,7 +12587,43 @@
           <w:szCs w:val="20"/>
           <w:lang w:val="en-US"/>
         </w:rPr>
-        <w:t xml:space="preserve">which shall be irrevocable), make early settlement of the Facility(ies) together with any accrued profit or amounts due up to the date of settlement, along with any other outstanding obligations. Upon receipt of such </w:t>
+        <w:t>which shall be irrevocable), make early settlement of the Facility(</w:t>
+      </w:r>
+      <w:proofErr w:type="spellStart"/>
+      <w:r>
+        <w:rPr>
+          <w:sz w:val="20"/>
+          <w:szCs w:val="20"/>
+          <w:lang w:val="en-US"/>
+        </w:rPr>
+        <w:t>ies</w:t>
+      </w:r>
+      <w:proofErr w:type="spellEnd"/>
+      <w:r>
+        <w:rPr>
+          <w:sz w:val="20"/>
+          <w:szCs w:val="20"/>
+          <w:lang w:val="en-US"/>
+        </w:rPr>
+        <w:t xml:space="preserve">) together with any accrued profit or amounts </w:t>
+      </w:r>
+      <w:proofErr w:type="gramStart"/>
+      <w:r>
+        <w:rPr>
+          <w:sz w:val="20"/>
+          <w:szCs w:val="20"/>
+          <w:lang w:val="en-US"/>
+        </w:rPr>
+        <w:t>due up</w:t>
+      </w:r>
+      <w:proofErr w:type="gramEnd"/>
+      <w:r>
+        <w:rPr>
+          <w:sz w:val="20"/>
+          <w:szCs w:val="20"/>
+          <w:lang w:val="en-US"/>
+        </w:rPr>
+        <w:t xml:space="preserve"> to the date of settlement, along with any other outstanding obligations. Upon receipt of such </w:t>
       </w:r>
       <w:proofErr w:type="gramStart"/>
       <w:r>
@@ -11412,7 +12714,25 @@
           <w:szCs w:val="20"/>
           <w:lang w:val="en-US"/>
         </w:rPr>
-        <w:t>The Issuer shall be liable to pay to the Agent the Late Payment Charges (Ta’widh) on any overdue amounts as follows:</w:t>
+        <w:t>The Issuer shall be liable to pay to the Agent the Late Payment Charges (</w:t>
+      </w:r>
+      <w:proofErr w:type="spellStart"/>
+      <w:r>
+        <w:rPr>
+          <w:sz w:val="20"/>
+          <w:szCs w:val="20"/>
+          <w:lang w:val="en-US"/>
+        </w:rPr>
+        <w:t>Ta’widh</w:t>
+      </w:r>
+      <w:proofErr w:type="spellEnd"/>
+      <w:r>
+        <w:rPr>
+          <w:sz w:val="20"/>
+          <w:szCs w:val="20"/>
+          <w:lang w:val="en-US"/>
+        </w:rPr>
+        <w:t>) on any overdue amounts as follows:</w:t>
       </w:r>
     </w:p>
     <w:p>
@@ -11464,7 +12784,43 @@
           <w:szCs w:val="20"/>
           <w:lang w:val="en-US"/>
         </w:rPr>
-        <w:t>Notwithstanding the Late Payment Charges (Ta’widh) charged, it is expressly acknowledged and agreed that the amount of Late Payment Charges (Ta’widh) shall not be further compounded.</w:t>
+        <w:t>Notwithstanding the Late Payment Charges (</w:t>
+      </w:r>
+      <w:proofErr w:type="spellStart"/>
+      <w:r>
+        <w:rPr>
+          <w:sz w:val="20"/>
+          <w:szCs w:val="20"/>
+          <w:lang w:val="en-US"/>
+        </w:rPr>
+        <w:t>Ta’widh</w:t>
+      </w:r>
+      <w:proofErr w:type="spellEnd"/>
+      <w:r>
+        <w:rPr>
+          <w:sz w:val="20"/>
+          <w:szCs w:val="20"/>
+          <w:lang w:val="en-US"/>
+        </w:rPr>
+        <w:t>) charged, it is expressly acknowledged and agreed that the amount of Late Payment Charges (</w:t>
+      </w:r>
+      <w:proofErr w:type="spellStart"/>
+      <w:r>
+        <w:rPr>
+          <w:sz w:val="20"/>
+          <w:szCs w:val="20"/>
+          <w:lang w:val="en-US"/>
+        </w:rPr>
+        <w:t>Ta’widh</w:t>
+      </w:r>
+      <w:proofErr w:type="spellEnd"/>
+      <w:r>
+        <w:rPr>
+          <w:sz w:val="20"/>
+          <w:szCs w:val="20"/>
+          <w:lang w:val="en-US"/>
+        </w:rPr>
+        <w:t>) shall not be further compounded.</w:t>
       </w:r>
     </w:p>
     <w:p>
@@ -11706,7 +13062,43 @@
           <w:szCs w:val="20"/>
           <w:lang w:val="en-US"/>
         </w:rPr>
-        <w:t>The Hibah granted by the Agent will not constitute a contractual obligation but shall be at SSP’s discretion, in compliance with Shariah principles governing Baiʿ Dayn bi al-Silaʿ.</w:t>
+        <w:t xml:space="preserve">The Hibah granted by the Agent will not constitute a contractual obligation but shall be at SSP’s discretion, in compliance with Shariah principles governing </w:t>
+      </w:r>
+      <w:proofErr w:type="spellStart"/>
+      <w:r>
+        <w:rPr>
+          <w:sz w:val="20"/>
+          <w:szCs w:val="20"/>
+          <w:lang w:val="en-US"/>
+        </w:rPr>
+        <w:t>Baiʿ</w:t>
+      </w:r>
+      <w:proofErr w:type="spellEnd"/>
+      <w:r>
+        <w:rPr>
+          <w:sz w:val="20"/>
+          <w:szCs w:val="20"/>
+          <w:lang w:val="en-US"/>
+        </w:rPr>
+        <w:t xml:space="preserve"> Dayn bi al-</w:t>
+      </w:r>
+      <w:proofErr w:type="spellStart"/>
+      <w:r>
+        <w:rPr>
+          <w:sz w:val="20"/>
+          <w:szCs w:val="20"/>
+          <w:lang w:val="en-US"/>
+        </w:rPr>
+        <w:t>Silaʿ</w:t>
+      </w:r>
+      <w:proofErr w:type="spellEnd"/>
+      <w:r>
+        <w:rPr>
+          <w:sz w:val="20"/>
+          <w:szCs w:val="20"/>
+          <w:lang w:val="en-US"/>
+        </w:rPr>
+        <w:t>.</w:t>
       </w:r>
     </w:p>
     <w:p>
@@ -11852,7 +13244,25 @@
           <w:szCs w:val="20"/>
           <w:lang w:val="en-US"/>
         </w:rPr>
-        <w:t>Any taxes, levies, duties, or government charges, whether currently in force or imposed hereafter by any applicable law or regulation in connection with this facility(ies), shall be borne by you.</w:t>
+        <w:t>Any taxes, levies, duties, or government charges, whether currently in force or imposed hereafter by any applicable law or regulation in connection with this facility(</w:t>
+      </w:r>
+      <w:proofErr w:type="spellStart"/>
+      <w:r>
+        <w:rPr>
+          <w:sz w:val="20"/>
+          <w:szCs w:val="20"/>
+          <w:lang w:val="en-US"/>
+        </w:rPr>
+        <w:t>ies</w:t>
+      </w:r>
+      <w:proofErr w:type="spellEnd"/>
+      <w:r>
+        <w:rPr>
+          <w:sz w:val="20"/>
+          <w:szCs w:val="20"/>
+          <w:lang w:val="en-US"/>
+        </w:rPr>
+        <w:t>), shall be borne by you.</w:t>
       </w:r>
     </w:p>
     <w:p>
@@ -12070,7 +13480,6 @@
           <w:szCs w:val="20"/>
           <w:lang w:val="en-US"/>
         </w:rPr>
-        <w:lastRenderedPageBreak/>
         <w:t>DISCLOSURE OF INFORMATION</w:t>
       </w:r>
     </w:p>
@@ -12108,7 +13517,61 @@
           <w:szCs w:val="20"/>
           <w:lang w:val="en-US"/>
         </w:rPr>
-        <w:t>You hereby consent to SSP disclosing information and/or financial data, including but not limited to data relating to or documents supplied in connection with the facility(ies), your business, and your account(s) with SSP  (including any future accounts), to SSP’s subsidiaries, any company that is or may in the future become a related company to SSP, any Investor or the Investor’s head offices, representative and branch offices, and/or any related or associated company of the Investors in any jurisdiction, agents, auditors, legal counsels, insurers, professional advisors, or representatives, the Central Credit Unit, or any other banking or regulatory authorities. This disclosure may also include any co-debtor, joint account holder, guarantor, charger, surety, security party, any party making a claim under a third-party payment instrument or trade document, or any other person who has undertaken liability for the facility(ies) with SSP or under any law or legal process, or in connection with any action, suit, or proceeding relating to the facility(ies).</w:t>
+        <w:t>You hereby consent to SSP disclosing information and/or financial data, including but not limited to data relating to or documents supplied in connection with the facility(</w:t>
+      </w:r>
+      <w:proofErr w:type="spellStart"/>
+      <w:r>
+        <w:rPr>
+          <w:sz w:val="20"/>
+          <w:szCs w:val="20"/>
+          <w:lang w:val="en-US"/>
+        </w:rPr>
+        <w:t>ies</w:t>
+      </w:r>
+      <w:proofErr w:type="spellEnd"/>
+      <w:r>
+        <w:rPr>
+          <w:sz w:val="20"/>
+          <w:szCs w:val="20"/>
+          <w:lang w:val="en-US"/>
+        </w:rPr>
+        <w:t>), your business, and your account(s) with SSP  (including any future accounts), to SSP’s subsidiaries, any company that is or may in the future become a related company to SSP, any Investor or the Investor’s head offices, representative and branch offices, and/or any related or associated company of the Investors in any jurisdiction, agents, auditors, legal counsels, insurers, professional advisors, or representatives, the Central Credit Unit, or any other banking or regulatory authorities. This disclosure may also include any co-debtor, joint account holder, guarantor, charger, surety, security party, any party making a claim under a third-party payment instrument or trade document, or any other person who has undertaken liability for the facility(</w:t>
+      </w:r>
+      <w:proofErr w:type="spellStart"/>
+      <w:r>
+        <w:rPr>
+          <w:sz w:val="20"/>
+          <w:szCs w:val="20"/>
+          <w:lang w:val="en-US"/>
+        </w:rPr>
+        <w:t>ies</w:t>
+      </w:r>
+      <w:proofErr w:type="spellEnd"/>
+      <w:r>
+        <w:rPr>
+          <w:sz w:val="20"/>
+          <w:szCs w:val="20"/>
+          <w:lang w:val="en-US"/>
+        </w:rPr>
+        <w:t>) with SSP or under any law or legal process, or in connection with any action, suit, or proceeding relating to the facility(</w:t>
+      </w:r>
+      <w:proofErr w:type="spellStart"/>
+      <w:r>
+        <w:rPr>
+          <w:sz w:val="20"/>
+          <w:szCs w:val="20"/>
+          <w:lang w:val="en-US"/>
+        </w:rPr>
+        <w:t>ies</w:t>
+      </w:r>
+      <w:proofErr w:type="spellEnd"/>
+      <w:r>
+        <w:rPr>
+          <w:sz w:val="20"/>
+          <w:szCs w:val="20"/>
+          <w:lang w:val="en-US"/>
+        </w:rPr>
+        <w:t>).</w:t>
       </w:r>
     </w:p>
     <w:p>
@@ -12297,6 +13760,7 @@
           <w:szCs w:val="20"/>
           <w:lang w:val="en-US"/>
         </w:rPr>
+        <w:lastRenderedPageBreak/>
         <w:t>VARIATION</w:t>
       </w:r>
     </w:p>
@@ -12369,7 +13833,6 @@
           <w:szCs w:val="20"/>
           <w:lang w:val="en-US"/>
         </w:rPr>
-        <w:lastRenderedPageBreak/>
         <w:t xml:space="preserve">Notwithstanding any provisions in this agreement regarding the profit rate, fees, and other charges, SSP shall have the right, at its discretion, to adjust the manner, method, basis, or mode of determining the profit rate, including but not limited to: </w:t>
       </w:r>
     </w:p>
@@ -12789,6 +14252,7 @@
           <w:szCs w:val="20"/>
           <w:lang w:val="en-US"/>
         </w:rPr>
+        <w:lastRenderedPageBreak/>
         <w:t>Sending an email notification to you from SSP, indicating the variation and its effective date.</w:t>
       </w:r>
     </w:p>
@@ -12883,7 +14347,25 @@
           <w:szCs w:val="20"/>
           <w:lang w:val="en-US"/>
         </w:rPr>
-        <w:t xml:space="preserve"> the financing facility(ies) have been drawn down or utilized:</w:t>
+        <w:t xml:space="preserve"> the financing facility(</w:t>
+      </w:r>
+      <w:proofErr w:type="spellStart"/>
+      <w:r>
+        <w:rPr>
+          <w:sz w:val="20"/>
+          <w:szCs w:val="20"/>
+          <w:lang w:val="en-US"/>
+        </w:rPr>
+        <w:t>ies</w:t>
+      </w:r>
+      <w:proofErr w:type="spellEnd"/>
+      <w:r>
+        <w:rPr>
+          <w:sz w:val="20"/>
+          <w:szCs w:val="20"/>
+          <w:lang w:val="en-US"/>
+        </w:rPr>
+        <w:t>) have been drawn down or utilized:</w:t>
       </w:r>
     </w:p>
     <w:p>
@@ -12923,8 +14405,25 @@
           <w:szCs w:val="20"/>
           <w:lang w:val="en-US"/>
         </w:rPr>
-        <w:lastRenderedPageBreak/>
-        <w:t>SSP may review the financing facility(ies) at any time, regardless of whether any default or breach has occurred. Any such review will be conducted in a manner determined solely by SSP. The delay or omission in conducting such a review will not be construed as a waiver of SSP’s right to review, nor will it prejudice SSP’s right to recover all outstanding amounts.</w:t>
+        <w:t>SSP may review the financing facility(</w:t>
+      </w:r>
+      <w:proofErr w:type="spellStart"/>
+      <w:r>
+        <w:rPr>
+          <w:sz w:val="20"/>
+          <w:szCs w:val="20"/>
+          <w:lang w:val="en-US"/>
+        </w:rPr>
+        <w:t>ies</w:t>
+      </w:r>
+      <w:proofErr w:type="spellEnd"/>
+      <w:r>
+        <w:rPr>
+          <w:sz w:val="20"/>
+          <w:szCs w:val="20"/>
+          <w:lang w:val="en-US"/>
+        </w:rPr>
+        <w:t>) at any time, regardless of whether any default or breach has occurred. Any such review will be conducted in a manner determined solely by SSP. The delay or omission in conducting such a review will not be construed as a waiver of SSP’s right to review, nor will it prejudice SSP’s right to recover all outstanding amounts.</w:t>
       </w:r>
     </w:p>
     <w:p>
@@ -12964,7 +14463,25 @@
           <w:szCs w:val="20"/>
           <w:lang w:val="en-US"/>
         </w:rPr>
-        <w:t>SSP has the right, at any time, to withdraw or suspend the financing facility(ies) or any part thereof, even if the facility or security documentation has been completed. This may occur upon the SSP’s assessment that any event has occurred which, in the SSP’s opinion, may adversely affect your financial position, hinder the conduct of your business operations in accordance with sound financial and commercial practices, or jeopardize SSP’s security position. SSP’s decision regarding this matter will be final and conclusive.</w:t>
+        <w:t>SSP has the right, at any time, to withdraw or suspend the financing facility(</w:t>
+      </w:r>
+      <w:proofErr w:type="spellStart"/>
+      <w:r>
+        <w:rPr>
+          <w:sz w:val="20"/>
+          <w:szCs w:val="20"/>
+          <w:lang w:val="en-US"/>
+        </w:rPr>
+        <w:t>ies</w:t>
+      </w:r>
+      <w:proofErr w:type="spellEnd"/>
+      <w:r>
+        <w:rPr>
+          <w:sz w:val="20"/>
+          <w:szCs w:val="20"/>
+          <w:lang w:val="en-US"/>
+        </w:rPr>
+        <w:t>) or any part thereof, even if the facility or security documentation has been completed. This may occur upon the SSP’s assessment that any event has occurred which, in the SSP’s opinion, may adversely affect your financial position, hinder the conduct of your business operations in accordance with sound financial and commercial practices, or jeopardize SSP’s security position. SSP’s decision regarding this matter will be final and conclusive.</w:t>
       </w:r>
     </w:p>
     <w:p>
@@ -13000,7 +14517,43 @@
           <w:szCs w:val="20"/>
           <w:lang w:val="en-US"/>
         </w:rPr>
-        <w:t>Even after the completion of the financing facility documentation, SSP has the discretion to withhold or withdraw the facility(ies) or any part thereof, and to terminate or recall the facility(ies) and any operating accounts associated with the financing. This may occur immediately if SSP becomes aware that you or any security party is being investigated for, or alleged to have committed, any illegal or criminal activities. This applies if any security related to the facility is at risk of freezing, seizure, or forfeiture by the government or relevant authorities. In all cases, SSP’s decision will be final and conclusive.</w:t>
+        <w:t>Even after the completion of the financing facility documentation, SSP has the discretion to withhold or withdraw the facility(</w:t>
+      </w:r>
+      <w:proofErr w:type="spellStart"/>
+      <w:r>
+        <w:rPr>
+          <w:sz w:val="20"/>
+          <w:szCs w:val="20"/>
+          <w:lang w:val="en-US"/>
+        </w:rPr>
+        <w:t>ies</w:t>
+      </w:r>
+      <w:proofErr w:type="spellEnd"/>
+      <w:r>
+        <w:rPr>
+          <w:sz w:val="20"/>
+          <w:szCs w:val="20"/>
+          <w:lang w:val="en-US"/>
+        </w:rPr>
+        <w:t>) or any part thereof, and to terminate or recall the facility(</w:t>
+      </w:r>
+      <w:proofErr w:type="spellStart"/>
+      <w:r>
+        <w:rPr>
+          <w:sz w:val="20"/>
+          <w:szCs w:val="20"/>
+          <w:lang w:val="en-US"/>
+        </w:rPr>
+        <w:t>ies</w:t>
+      </w:r>
+      <w:proofErr w:type="spellEnd"/>
+      <w:r>
+        <w:rPr>
+          <w:sz w:val="20"/>
+          <w:szCs w:val="20"/>
+          <w:lang w:val="en-US"/>
+        </w:rPr>
+        <w:t>) and any operating accounts associated with the financing. This may occur immediately if SSP becomes aware that you or any security party is being investigated for, or alleged to have committed, any illegal or criminal activities. This applies if any security related to the facility is at risk of freezing, seizure, or forfeiture by the government or relevant authorities. In all cases, SSP’s decision will be final and conclusive.</w:t>
       </w:r>
     </w:p>
     <w:p>
@@ -13036,7 +14589,25 @@
           <w:szCs w:val="20"/>
           <w:lang w:val="en-US"/>
         </w:rPr>
-        <w:t>SSP has the right to suspend or freeze the operating account for the facility(ies) granted without providing any reason.</w:t>
+        <w:t>SSP has the right to suspend or freeze the operating account for the facility(</w:t>
+      </w:r>
+      <w:proofErr w:type="spellStart"/>
+      <w:r>
+        <w:rPr>
+          <w:sz w:val="20"/>
+          <w:szCs w:val="20"/>
+          <w:lang w:val="en-US"/>
+        </w:rPr>
+        <w:t>ies</w:t>
+      </w:r>
+      <w:proofErr w:type="spellEnd"/>
+      <w:r>
+        <w:rPr>
+          <w:sz w:val="20"/>
+          <w:szCs w:val="20"/>
+          <w:lang w:val="en-US"/>
+        </w:rPr>
+        <w:t>) granted without providing any reason.</w:t>
       </w:r>
     </w:p>
     <w:p>
@@ -13143,7 +14714,43 @@
           <w:szCs w:val="20"/>
           <w:lang w:val="en-US"/>
         </w:rPr>
-        <w:t>SSP’s obligation to continue providing the facility(ies) to you, subject to the terms and conditions herein and provided there is no default on your part, shall be contingent upon the absence of any changes in circumstances that may materially affect SSP’s or Investors' ability to provide the facility(ies) or that may result in an increase in the costs incurred by SSP or Investors in doing so.</w:t>
+        <w:t>SSP’s obligation to continue providing the facility(</w:t>
+      </w:r>
+      <w:proofErr w:type="spellStart"/>
+      <w:r>
+        <w:rPr>
+          <w:sz w:val="20"/>
+          <w:szCs w:val="20"/>
+          <w:lang w:val="en-US"/>
+        </w:rPr>
+        <w:t>ies</w:t>
+      </w:r>
+      <w:proofErr w:type="spellEnd"/>
+      <w:r>
+        <w:rPr>
+          <w:sz w:val="20"/>
+          <w:szCs w:val="20"/>
+          <w:lang w:val="en-US"/>
+        </w:rPr>
+        <w:t>) to you, subject to the terms and conditions herein and provided there is no default on your part, shall be contingent upon the absence of any changes in circumstances that may materially affect SSP’s or Investors' ability to provide the facility(</w:t>
+      </w:r>
+      <w:proofErr w:type="spellStart"/>
+      <w:r>
+        <w:rPr>
+          <w:sz w:val="20"/>
+          <w:szCs w:val="20"/>
+          <w:lang w:val="en-US"/>
+        </w:rPr>
+        <w:t>ies</w:t>
+      </w:r>
+      <w:proofErr w:type="spellEnd"/>
+      <w:r>
+        <w:rPr>
+          <w:sz w:val="20"/>
+          <w:szCs w:val="20"/>
+          <w:lang w:val="en-US"/>
+        </w:rPr>
+        <w:t>) or that may result in an increase in the costs incurred by SSP or Investors in doing so.</w:t>
       </w:r>
     </w:p>
     <w:p>
@@ -13197,7 +14804,6 @@
           <w:szCs w:val="20"/>
           <w:lang w:val="en-US"/>
         </w:rPr>
-        <w:lastRenderedPageBreak/>
         <w:t>CROSS DEFAULT</w:t>
       </w:r>
     </w:p>
@@ -13232,7 +14838,25 @@
           <w:szCs w:val="20"/>
           <w:lang w:val="en-US"/>
         </w:rPr>
-        <w:t>In the event that any indebtedness incurred by the Issuer, the Issuer’s security party, or any entity within the Issuer’s group of companies, including the Issuer’s parent company and/or subsidiaries, becomes due or is capable of being declared due prior to its stated maturity, or if any guarantee provided by the Issuer, the Issuer’s security party, or any entity within the Issuer’s group, including the Issuer’s parent company and/or subsidiaries, is not discharged at maturity or when called upon, or if the Issuer, the Issuer’s security party, or any entity within the Issuer’s group, including the Issuer’s parent company and/or subsidiaries, defaults under or breaches any agreement or instrument pertaining to such indebtedness or guarantee, then, in such circumstances, the facility(ies) and all amounts owing under such account(s) or any other facility shall immediately become due and payable.</w:t>
+        <w:t>In the event that any indebtedness incurred by the Issuer, the Issuer’s security party, or any entity within the Issuer’s group of companies, including the Issuer’s parent company and/or subsidiaries, becomes due or is capable of being declared due prior to its stated maturity, or if any guarantee provided by the Issuer, the Issuer’s security party, or any entity within the Issuer’s group, including the Issuer’s parent company and/or subsidiaries, is not discharged at maturity or when called upon, or if the Issuer, the Issuer’s security party, or any entity within the Issuer’s group, including the Issuer’s parent company and/or subsidiaries, defaults under or breaches any agreement or instrument pertaining to such indebtedness or guarantee, then, in such circumstances, the facility(</w:t>
+      </w:r>
+      <w:proofErr w:type="spellStart"/>
+      <w:r>
+        <w:rPr>
+          <w:sz w:val="20"/>
+          <w:szCs w:val="20"/>
+          <w:lang w:val="en-US"/>
+        </w:rPr>
+        <w:t>ies</w:t>
+      </w:r>
+      <w:proofErr w:type="spellEnd"/>
+      <w:r>
+        <w:rPr>
+          <w:sz w:val="20"/>
+          <w:szCs w:val="20"/>
+          <w:lang w:val="en-US"/>
+        </w:rPr>
+        <w:t>) and all amounts owing under such account(s) or any other facility shall immediately become due and payable.</w:t>
       </w:r>
     </w:p>
     <w:p>
@@ -13457,16 +15081,7 @@
           <w:szCs w:val="20"/>
           <w:lang w:val="en-US"/>
         </w:rPr>
-        <w:t xml:space="preserve">SSP’s rights under this Facility are cumulative and may be exercised as often as deemed appropriate, in addition to any rights under applicable law. These rights cannot be waived or varied except by express written agreement. Failure or delay in exercising any right does not constitute a </w:t>
-      </w:r>
-      <w:r>
-        <w:rPr>
-          <w:sz w:val="20"/>
-          <w:szCs w:val="20"/>
-          <w:lang w:val="en-US"/>
-        </w:rPr>
-        <w:lastRenderedPageBreak/>
-        <w:t>waiver, and any partial exercise of a right does not preclude further exercise of that right. No conduct or negotiation by SSP or Investors shall suspend or vary any right.</w:t>
+        <w:t>SSP’s rights under this Facility are cumulative and may be exercised as often as deemed appropriate, in addition to any rights under applicable law. These rights cannot be waived or varied except by express written agreement. Failure or delay in exercising any right does not constitute a waiver, and any partial exercise of a right does not preclude further exercise of that right. No conduct or negotiation by SSP or Investors shall suspend or vary any right.</w:t>
       </w:r>
     </w:p>
     <w:p>
@@ -13833,16 +15448,61 @@
           <w:szCs w:val="20"/>
           <w:lang w:val="en-US"/>
         </w:rPr>
-        <w:t xml:space="preserve">The granting and/or continued availability of the facility(ies) is conditional upon there being no material adverse changes, including but not limited to extraordinary circumstances, changes in law, government actions, or adverse national, financial, or economic conditions in Malaysia (or any other applicable jurisdiction), which may affect the ability of SSP or Investors to provide or maintain the facility(ies) or increase the costs involved. In the event of such changes, SSP reserves the right to </w:t>
-      </w:r>
-      <w:r>
-        <w:rPr>
-          <w:sz w:val="20"/>
-          <w:szCs w:val="20"/>
-          <w:lang w:val="en-US"/>
-        </w:rPr>
-        <w:lastRenderedPageBreak/>
-        <w:t>terminate and recall the facility(ies), and all outstanding amounts shall become immediately due and payable.</w:t>
+        <w:t>The granting and/or continued availability of the facility(</w:t>
+      </w:r>
+      <w:proofErr w:type="spellStart"/>
+      <w:r>
+        <w:rPr>
+          <w:sz w:val="20"/>
+          <w:szCs w:val="20"/>
+          <w:lang w:val="en-US"/>
+        </w:rPr>
+        <w:t>ies</w:t>
+      </w:r>
+      <w:proofErr w:type="spellEnd"/>
+      <w:r>
+        <w:rPr>
+          <w:sz w:val="20"/>
+          <w:szCs w:val="20"/>
+          <w:lang w:val="en-US"/>
+        </w:rPr>
+        <w:t>) is conditional upon there being no material adverse changes, including but not limited to extraordinary circumstances, changes in law, government actions, or adverse national, financial, or economic conditions in Malaysia (or any other applicable jurisdiction), which may affect the ability of SSP or Investors to provide or maintain the facility(</w:t>
+      </w:r>
+      <w:proofErr w:type="spellStart"/>
+      <w:r>
+        <w:rPr>
+          <w:sz w:val="20"/>
+          <w:szCs w:val="20"/>
+          <w:lang w:val="en-US"/>
+        </w:rPr>
+        <w:t>ies</w:t>
+      </w:r>
+      <w:proofErr w:type="spellEnd"/>
+      <w:r>
+        <w:rPr>
+          <w:sz w:val="20"/>
+          <w:szCs w:val="20"/>
+          <w:lang w:val="en-US"/>
+        </w:rPr>
+        <w:t>) or increase the costs involved. In the event of such changes, SSP reserves the right to terminate and recall the facility(</w:t>
+      </w:r>
+      <w:proofErr w:type="spellStart"/>
+      <w:r>
+        <w:rPr>
+          <w:sz w:val="20"/>
+          <w:szCs w:val="20"/>
+          <w:lang w:val="en-US"/>
+        </w:rPr>
+        <w:t>ies</w:t>
+      </w:r>
+      <w:proofErr w:type="spellEnd"/>
+      <w:r>
+        <w:rPr>
+          <w:sz w:val="20"/>
+          <w:szCs w:val="20"/>
+          <w:lang w:val="en-US"/>
+        </w:rPr>
+        <w:t>), and all outstanding amounts shall become immediately due and payable.</w:t>
       </w:r>
     </w:p>
     <w:p>
@@ -13917,7 +15577,79 @@
           <w:szCs w:val="20"/>
           <w:lang w:val="en-US"/>
         </w:rPr>
-        <w:t xml:space="preserve">The Issuer hereby agrees, covenants, and undertakes that the facility(ies) provided shall not be used for transactions involving goods, items, or services classified as strategic items under the Strategic Trade Act 2010. This includes, but is not limited to, the importation, exportation, transshipment, brokering, marketing, distribution, or any other transactions involving such strategic items, or any actions that contravene the Strategic Trade Act 2010. The Issuer further agrees that SSP may, at its sole discretion and without assigning any reasons, decline to disburse the facility(ies), allow further drawdowns, make payments, process the payment of the facility(ies), or accept or negotiate any trade facilities requested by the Issuer, if such transactions involve strategic items. SSP reserves the right to declare an event of default and recall or cancel the facility(ies) </w:t>
+        <w:t>The Issuer hereby agrees, covenants, and undertakes that the facility(</w:t>
+      </w:r>
+      <w:proofErr w:type="spellStart"/>
+      <w:r>
+        <w:rPr>
+          <w:sz w:val="20"/>
+          <w:szCs w:val="20"/>
+          <w:lang w:val="en-US"/>
+        </w:rPr>
+        <w:t>ies</w:t>
+      </w:r>
+      <w:proofErr w:type="spellEnd"/>
+      <w:r>
+        <w:rPr>
+          <w:sz w:val="20"/>
+          <w:szCs w:val="20"/>
+          <w:lang w:val="en-US"/>
+        </w:rPr>
+        <w:t>) provided shall not be used for transactions involving goods, items, or services classified as strategic items under the Strategic Trade Act 2010. This includes, but is not limited to, the importation, exportation, transshipment, brokering, marketing, distribution, or any other transactions involving such strategic items, or any actions that contravene the Strategic Trade Act 2010. The Issuer further agrees that SSP may, at its sole discretion and without assigning any reasons, decline to disburse the facility(</w:t>
+      </w:r>
+      <w:proofErr w:type="spellStart"/>
+      <w:r>
+        <w:rPr>
+          <w:sz w:val="20"/>
+          <w:szCs w:val="20"/>
+          <w:lang w:val="en-US"/>
+        </w:rPr>
+        <w:t>ies</w:t>
+      </w:r>
+      <w:proofErr w:type="spellEnd"/>
+      <w:r>
+        <w:rPr>
+          <w:sz w:val="20"/>
+          <w:szCs w:val="20"/>
+          <w:lang w:val="en-US"/>
+        </w:rPr>
+        <w:t>), allow further drawdowns, make payments, process the payment of the facility(</w:t>
+      </w:r>
+      <w:proofErr w:type="spellStart"/>
+      <w:r>
+        <w:rPr>
+          <w:sz w:val="20"/>
+          <w:szCs w:val="20"/>
+          <w:lang w:val="en-US"/>
+        </w:rPr>
+        <w:t>ies</w:t>
+      </w:r>
+      <w:proofErr w:type="spellEnd"/>
+      <w:r>
+        <w:rPr>
+          <w:sz w:val="20"/>
+          <w:szCs w:val="20"/>
+          <w:lang w:val="en-US"/>
+        </w:rPr>
+        <w:t>), or accept or negotiate any trade facilities requested by the Issuer, if such transactions involve strategic items. SSP reserves the right to declare an event of default and recall or cancel the facility(</w:t>
+      </w:r>
+      <w:proofErr w:type="spellStart"/>
+      <w:r>
+        <w:rPr>
+          <w:sz w:val="20"/>
+          <w:szCs w:val="20"/>
+          <w:lang w:val="en-US"/>
+        </w:rPr>
+        <w:t>ies</w:t>
+      </w:r>
+      <w:proofErr w:type="spellEnd"/>
+      <w:r>
+        <w:rPr>
+          <w:sz w:val="20"/>
+          <w:szCs w:val="20"/>
+          <w:lang w:val="en-US"/>
+        </w:rPr>
+        <w:t xml:space="preserve">) </w:t>
       </w:r>
       <w:proofErr w:type="gramStart"/>
       <w:r>
@@ -14027,7 +15759,43 @@
           <w:szCs w:val="20"/>
           <w:lang w:val="en-US"/>
         </w:rPr>
-        <w:t>The Issuer represents and warrants that, unless otherwise disclosed to SSP, the Issuer is the principal in relation to the facility(ies) and the funds held in the facility(ies) at any given time. All funds deposited into or withdrawn from the account(s) shall originate from lawful sources, in accordance with the provisions of the AMLATFAPUAA, and not from any unlawful activities.</w:t>
+        <w:t>The Issuer represents and warrants that, unless otherwise disclosed to SSP, the Issuer is the principal in relation to the facility(</w:t>
+      </w:r>
+      <w:proofErr w:type="spellStart"/>
+      <w:r>
+        <w:rPr>
+          <w:sz w:val="20"/>
+          <w:szCs w:val="20"/>
+          <w:lang w:val="en-US"/>
+        </w:rPr>
+        <w:t>ies</w:t>
+      </w:r>
+      <w:proofErr w:type="spellEnd"/>
+      <w:r>
+        <w:rPr>
+          <w:sz w:val="20"/>
+          <w:szCs w:val="20"/>
+          <w:lang w:val="en-US"/>
+        </w:rPr>
+        <w:t>) and the funds held in the facility(</w:t>
+      </w:r>
+      <w:proofErr w:type="spellStart"/>
+      <w:r>
+        <w:rPr>
+          <w:sz w:val="20"/>
+          <w:szCs w:val="20"/>
+          <w:lang w:val="en-US"/>
+        </w:rPr>
+        <w:t>ies</w:t>
+      </w:r>
+      <w:proofErr w:type="spellEnd"/>
+      <w:r>
+        <w:rPr>
+          <w:sz w:val="20"/>
+          <w:szCs w:val="20"/>
+          <w:lang w:val="en-US"/>
+        </w:rPr>
+        <w:t>) at any given time. All funds deposited into or withdrawn from the account(s) shall originate from lawful sources, in accordance with the provisions of the AMLATFAPUAA, and not from any unlawful activities.</w:t>
       </w:r>
     </w:p>
     <w:p>
@@ -14061,7 +15829,25 @@
           <w:szCs w:val="20"/>
           <w:lang w:val="en-US"/>
         </w:rPr>
-        <w:t>The Issuer covenants and undertakes not to deposit or utilise any funds in the account(s) for purposes related to money laundering or any activities that may violate laws, regulations, or directives concerning money laundering or terrorist financing, as defined under the AMLATFAPUAA or any other applicable laws or regulations.</w:t>
+        <w:t xml:space="preserve">The Issuer covenants and undertakes not to deposit or </w:t>
+      </w:r>
+      <w:proofErr w:type="spellStart"/>
+      <w:r>
+        <w:rPr>
+          <w:sz w:val="20"/>
+          <w:szCs w:val="20"/>
+          <w:lang w:val="en-US"/>
+        </w:rPr>
+        <w:t>utilise</w:t>
+      </w:r>
+      <w:proofErr w:type="spellEnd"/>
+      <w:r>
+        <w:rPr>
+          <w:sz w:val="20"/>
+          <w:szCs w:val="20"/>
+          <w:lang w:val="en-US"/>
+        </w:rPr>
+        <w:t xml:space="preserve"> any funds in the account(s) for purposes related to money laundering or any activities that may violate laws, regulations, or directives concerning money laundering or terrorist financing, as defined under the AMLATFAPUAA or any other applicable laws or regulations.</w:t>
       </w:r>
     </w:p>
     <w:p>
@@ -14095,7 +15881,25 @@
           <w:szCs w:val="20"/>
           <w:lang w:val="en-US"/>
         </w:rPr>
-        <w:t>Throughout the term of the facility(ies), the Issuer further undertakes not to:</w:t>
+        <w:t>Throughout the term of the facility(</w:t>
+      </w:r>
+      <w:proofErr w:type="spellStart"/>
+      <w:r>
+        <w:rPr>
+          <w:sz w:val="20"/>
+          <w:szCs w:val="20"/>
+          <w:lang w:val="en-US"/>
+        </w:rPr>
+        <w:t>ies</w:t>
+      </w:r>
+      <w:proofErr w:type="spellEnd"/>
+      <w:r>
+        <w:rPr>
+          <w:sz w:val="20"/>
+          <w:szCs w:val="20"/>
+          <w:lang w:val="en-US"/>
+        </w:rPr>
+        <w:t>), the Issuer further undertakes not to:</w:t>
       </w:r>
     </w:p>
     <w:p>
@@ -14145,7 +15949,6 @@
           <w:szCs w:val="20"/>
           <w:lang w:val="en-US"/>
         </w:rPr>
-        <w:lastRenderedPageBreak/>
         <w:t>Acquire, receive, possess, conceal, transfer, convert, exchange, carry, dispose of, use, remove from, or bring into Malaysia any proceeds derived from unlawful activity;</w:t>
       </w:r>
     </w:p>
@@ -14319,6 +16122,7 @@
           <w:szCs w:val="20"/>
           <w:lang w:val="en-US"/>
         </w:rPr>
+        <w:lastRenderedPageBreak/>
         <w:t>DECLARATION FOR PURPOSES OF COMPLIANCE WITH THE FOREIGN ACCOUNT TAX COMPLIANCE ACT (“FATCA”) AND THE COMMON REPORTING STANDARDS REQUIRED BY THE ORGANISATION FOR ECONOMIC CO-OPERATION AND DEVELOPMENT (“CRS”)</w:t>
       </w:r>
     </w:p>
@@ -14428,7 +16232,25 @@
           <w:szCs w:val="20"/>
           <w:lang w:val="en-US"/>
         </w:rPr>
-        <w:t xml:space="preserve">Classify the Issuer as a reportable account holder in compliance with FATCA and/or CRS, and applicable laws, regulations, agreements, or regulatory guidelines or directives. SSP may also close the Issuer’s accounts, suspend, recall, or terminate the facility(ies) granted to the Issuer, </w:t>
+        <w:t>Classify the Issuer as a reportable account holder in compliance with FATCA and/or CRS, and applicable laws, regulations, agreements, or regulatory guidelines or directives. SSP may also close the Issuer’s accounts, suspend, recall, or terminate the facility(</w:t>
+      </w:r>
+      <w:proofErr w:type="spellStart"/>
+      <w:r>
+        <w:rPr>
+          <w:sz w:val="20"/>
+          <w:szCs w:val="20"/>
+          <w:lang w:val="en-US"/>
+        </w:rPr>
+        <w:t>ies</w:t>
+      </w:r>
+      <w:proofErr w:type="spellEnd"/>
+      <w:r>
+        <w:rPr>
+          <w:sz w:val="20"/>
+          <w:szCs w:val="20"/>
+          <w:lang w:val="en-US"/>
+        </w:rPr>
+        <w:t xml:space="preserve">) granted to the Issuer, </w:t>
       </w:r>
       <w:proofErr w:type="gramStart"/>
       <w:r>
@@ -14480,7 +16302,7 @@
           <w:szCs w:val="20"/>
           <w:lang w:val="en-US"/>
         </w:rPr>
-        <w:t xml:space="preserve">The Issuer undertakes to notify SSP in writing within thirty (30) days of any changes to the information previously provided.</w:t>
+        <w:t>The Issuer undertakes to notify SSP in writing within thirty (30) days of any changes to the information previously provided.</w:t>
       </w:r>
     </w:p>
     <w:p>
@@ -14783,7 +16605,25 @@
           <w:szCs w:val="20"/>
           <w:lang w:val="en-US"/>
         </w:rPr>
-        <w:t>Determine, vary, modify, restructure, reduce, or increase the facility(ies) and/or any credit or other facilities granted to the Issuer, and may open or continue any account(s) with the Issuer;</w:t>
+        <w:t>Determine, vary, modify, restructure, reduce, or increase the facility(</w:t>
+      </w:r>
+      <w:proofErr w:type="spellStart"/>
+      <w:r>
+        <w:rPr>
+          <w:sz w:val="20"/>
+          <w:szCs w:val="20"/>
+          <w:lang w:val="en-US"/>
+        </w:rPr>
+        <w:t>ies</w:t>
+      </w:r>
+      <w:proofErr w:type="spellEnd"/>
+      <w:r>
+        <w:rPr>
+          <w:sz w:val="20"/>
+          <w:szCs w:val="20"/>
+          <w:lang w:val="en-US"/>
+        </w:rPr>
+        <w:t>) and/or any credit or other facilities granted to the Issuer, and may open or continue any account(s) with the Issuer;</w:t>
       </w:r>
     </w:p>
     <w:p>
@@ -14985,7 +16825,6 @@
           <w:szCs w:val="20"/>
           <w:lang w:val="en-US"/>
         </w:rPr>
-        <w:lastRenderedPageBreak/>
         <w:t>GUARANTEE</w:t>
       </w:r>
     </w:p>
@@ -15132,6 +16971,7 @@
           <w:szCs w:val="20"/>
           <w:lang w:val="en-US"/>
         </w:rPr>
+        <w:lastRenderedPageBreak/>
         <w:t>In the event of default by the Issuer, SSP shall have the right to immediately enforce its rights under the security documents to recover all sums owing under the security documents.</w:t>
       </w:r>
     </w:p>
@@ -15438,7 +17278,16 @@
           <w:szCs w:val="20"/>
           <w:lang w:val="en-US"/>
         </w:rPr>
-        <w:t>Notwithstanding the foregoing provisions of Clause E, the Issuer expressly agrees that if the proceeds realized by SSP from the security documents, after deducting applicable fees, costs, taxes, and other outgoings, are less than the amount due to the SSP and/or Investors, the Issuer shall, upon demand, pay the difference. The Issuer shall also be liable for all costs incurred by SSP and/or Investors, as determined by SSP (whose determination shall be conclusive and binding, save for manifest error), including interest incurred by SSP and/or Investors in relation to funds borrowed or deposits made to cover such deficiency, calculated up to the date of payment, both before and after judgment.</w:t>
+        <w:t xml:space="preserve">Notwithstanding the foregoing provisions of Clause E, the Issuer expressly agrees that if the proceeds realized by SSP from the security documents, after deducting applicable fees, costs, taxes, and other outgoings, are less than the amount due to the SSP and/or Investors, the Issuer shall, upon demand, pay the difference. The Issuer shall also be liable for all costs </w:t>
+      </w:r>
+      <w:r>
+        <w:rPr>
+          <w:sz w:val="20"/>
+          <w:szCs w:val="20"/>
+          <w:lang w:val="en-US"/>
+        </w:rPr>
+        <w:lastRenderedPageBreak/>
+        <w:t>incurred by SSP and/or Investors, as determined by SSP (whose determination shall be conclusive and binding, save for manifest error), including interest incurred by SSP and/or Investors in relation to funds borrowed or deposits made to cover such deficiency, calculated up to the date of payment, both before and after judgment.</w:t>
       </w:r>
     </w:p>
     <w:p>
@@ -15583,7 +17432,7 @@
 </file>
 
 <file path=word/endnotes.xml><?xml version="1.0" encoding="utf-8"?>
-<w:endnotes xmlns:wpc="http://schemas.microsoft.com/office/word/2010/wordprocessingCanvas" xmlns:cx="http://schemas.microsoft.com/office/drawing/2014/chartex" xmlns:cx1="http://schemas.microsoft.com/office/drawing/2015/9/8/chartex" xmlns:cx2="http://schemas.microsoft.com/office/drawing/2015/10/21/chartex" xmlns:cx3="http://schemas.microsoft.com/office/drawing/2016/5/9/chartex" xmlns:cx4="http://schemas.microsoft.com/office/drawing/2016/5/10/chartex" xmlns:cx5="http://schemas.microsoft.com/office/drawing/2016/5/11/chartex" xmlns:cx6="http://schemas.microsoft.com/office/drawing/2016/5/12/chartex" xmlns:cx7="http://schemas.microsoft.com/office/drawing/2016/5/13/chartex" xmlns:cx8="http://schemas.microsoft.com/office/drawing/2016/5/14/chartex" xmlns:mc="http://schemas.openxmlformats.org/markup-compatibility/2006" xmlns:m="http://schemas.openxmlformats.org/officeDocument/2006/math" xmlns:aink="http://schemas.microsoft.com/office/drawing/2016/ink" xmlns:am3d="http://schemas.microsoft.com/office/drawing/2017/model3d" xmlns:oel="http://schemas.microsoft.com/office/2019/extlst" xmlns:r="http://schemas.openxmlformats.org/officeDocument/2006/relationships" xmlns:wp14="http://schemas.microsoft.com/office/word/2010/wordprocessingDrawing" xmlns:wp="http://schemas.openxmlformats.org/drawingml/2006/wordprocessingDrawing" xmlns:wpg="http://schemas.microsoft.com/office/word/2010/wordprocessingGroup" xmlns:wpi="http://schemas.microsoft.com/office/word/2010/wordprocessingInk" xmlns:wps="http://schemas.microsoft.com/office/word/2010/wordprocessingShape" xmlns:o="urn:schemas-microsoft-com:office:office" xmlns:v="urn:schemas-microsoft-com:vml" xmlns:w10="urn:schemas-microsoft-com:office:word" xmlns:w="http://schemas.openxmlformats.org/wordprocessingml/2006/main" xmlns:w14="http://schemas.microsoft.com/office/word/2010/wordml" xmlns:w15="http://schemas.microsoft.com/office/word/2012/wordml" xmlns:w16cei="http://schemas.microsoft.com/office/word/2026/wordml/cei" xmlns:w16cex="http://schemas.microsoft.com/office/word/2018/wordml/cex" xmlns:w16cid="http://schemas.microsoft.com/office/word/2016/wordml/cid" xmlns:w16="http://schemas.microsoft.com/office/word/2018/wordml" xmlns:w16sdtdh="http://schemas.microsoft.com/office/word/2020/wordml/sdtdatahash" xmlns:w16sdtfl="http://schemas.microsoft.com/office/word/2024/wordml/sdtformatlock" xmlns:w16se="http://schemas.microsoft.com/office/word/2015/wordml/symex" xmlns:w16du="http://schemas.microsoft.com/office/word/2023/wordml/word16du" xmlns:wne="http://schemas.microsoft.com/office/word/2006/wordml" mc:Ignorable="w14 w15 w16se w16cid w16 w16cex w16sdtdh w16sdtfl w16du wp14">
+<w:endnotes xmlns:wpc="http://schemas.microsoft.com/office/word/2010/wordprocessingCanvas" xmlns:cx="http://schemas.microsoft.com/office/drawing/2014/chartex" xmlns:cx1="http://schemas.microsoft.com/office/drawing/2015/9/8/chartex" xmlns:cx2="http://schemas.microsoft.com/office/drawing/2015/10/21/chartex" xmlns:cx3="http://schemas.microsoft.com/office/drawing/2016/5/9/chartex" xmlns:cx4="http://schemas.microsoft.com/office/drawing/2016/5/10/chartex" xmlns:cx5="http://schemas.microsoft.com/office/drawing/2016/5/11/chartex" xmlns:cx6="http://schemas.microsoft.com/office/drawing/2016/5/12/chartex" xmlns:cx7="http://schemas.microsoft.com/office/drawing/2016/5/13/chartex" xmlns:cx8="http://schemas.microsoft.com/office/drawing/2016/5/14/chartex" xmlns:mc="http://schemas.openxmlformats.org/markup-compatibility/2006" xmlns:aink="http://schemas.microsoft.com/office/drawing/2016/ink" xmlns:am3d="http://schemas.microsoft.com/office/drawing/2017/model3d" xmlns:o="urn:schemas-microsoft-com:office:office" xmlns:oel="http://schemas.microsoft.com/office/2019/extlst" xmlns:r="http://schemas.openxmlformats.org/officeDocument/2006/relationships" xmlns:m="http://schemas.openxmlformats.org/officeDocument/2006/math" xmlns:v="urn:schemas-microsoft-com:vml" xmlns:wp14="http://schemas.microsoft.com/office/word/2010/wordprocessingDrawing" xmlns:wp="http://schemas.openxmlformats.org/drawingml/2006/wordprocessingDrawing" xmlns:w10="urn:schemas-microsoft-com:office:word" xmlns:w="http://schemas.openxmlformats.org/wordprocessingml/2006/main" xmlns:w14="http://schemas.microsoft.com/office/word/2010/wordml" xmlns:w15="http://schemas.microsoft.com/office/word/2012/wordml" xmlns:w16cei="http://schemas.microsoft.com/office/word/2026/wordml/cei" xmlns:w16cex="http://schemas.microsoft.com/office/word/2018/wordml/cex" xmlns:w16cid="http://schemas.microsoft.com/office/word/2016/wordml/cid" xmlns:w16="http://schemas.microsoft.com/office/word/2018/wordml" xmlns:w16du="http://schemas.microsoft.com/office/word/2023/wordml/word16du" xmlns:w16sdtdh="http://schemas.microsoft.com/office/word/2020/wordml/sdtdatahash" xmlns:w16sdtfl="http://schemas.microsoft.com/office/word/2024/wordml/sdtformatlock" xmlns:w16se="http://schemas.microsoft.com/office/word/2015/wordml/symex" xmlns:wpg="http://schemas.microsoft.com/office/word/2010/wordprocessingGroup" xmlns:wpi="http://schemas.microsoft.com/office/word/2010/wordprocessingInk" xmlns:wne="http://schemas.microsoft.com/office/word/2006/wordml" xmlns:wps="http://schemas.microsoft.com/office/word/2010/wordprocessingShape" mc:Ignorable="w14 w15 w16se w16cid w16 w16cex w16sdtdh w16sdtfl w16du wp14">
   <w:endnote w:type="separator" w:id="-1">
     <w:p>
       <w:pPr>
@@ -15615,7 +17464,17 @@
 </file>
 
 <file path=word/footer1.xml><?xml version="1.0" encoding="utf-8"?>
-<w:ftr xmlns:wpc="http://schemas.microsoft.com/office/word/2010/wordprocessingCanvas" xmlns:cx="http://schemas.microsoft.com/office/drawing/2014/chartex" xmlns:cx1="http://schemas.microsoft.com/office/drawing/2015/9/8/chartex" xmlns:cx2="http://schemas.microsoft.com/office/drawing/2015/10/21/chartex" xmlns:cx3="http://schemas.microsoft.com/office/drawing/2016/5/9/chartex" xmlns:cx4="http://schemas.microsoft.com/office/drawing/2016/5/10/chartex" xmlns:cx5="http://schemas.microsoft.com/office/drawing/2016/5/11/chartex" xmlns:cx6="http://schemas.microsoft.com/office/drawing/2016/5/12/chartex" xmlns:cx7="http://schemas.microsoft.com/office/drawing/2016/5/13/chartex" xmlns:cx8="http://schemas.microsoft.com/office/drawing/2016/5/14/chartex" xmlns:mc="http://schemas.openxmlformats.org/markup-compatibility/2006" xmlns:m="http://schemas.openxmlformats.org/officeDocument/2006/math" xmlns:aink="http://schemas.microsoft.com/office/drawing/2016/ink" xmlns:am3d="http://schemas.microsoft.com/office/drawing/2017/model3d" xmlns:oel="http://schemas.microsoft.com/office/2019/extlst" xmlns:r="http://schemas.openxmlformats.org/officeDocument/2006/relationships" xmlns:wp14="http://schemas.microsoft.com/office/word/2010/wordprocessingDrawing" xmlns:wp="http://schemas.openxmlformats.org/drawingml/2006/wordprocessingDrawing" xmlns:wpg="http://schemas.microsoft.com/office/word/2010/wordprocessingGroup" xmlns:wpi="http://schemas.microsoft.com/office/word/2010/wordprocessingInk" xmlns:wps="http://schemas.microsoft.com/office/word/2010/wordprocessingShape" xmlns:o="urn:schemas-microsoft-com:office:office" xmlns:v="urn:schemas-microsoft-com:vml" xmlns:w10="urn:schemas-microsoft-com:office:word" xmlns:w="http://schemas.openxmlformats.org/wordprocessingml/2006/main" xmlns:w14="http://schemas.microsoft.com/office/word/2010/wordml" xmlns:w15="http://schemas.microsoft.com/office/word/2012/wordml" xmlns:w16cei="http://schemas.microsoft.com/office/word/2026/wordml/cei" xmlns:w16cex="http://schemas.microsoft.com/office/word/2018/wordml/cex" xmlns:w16cid="http://schemas.microsoft.com/office/word/2016/wordml/cid" xmlns:w16="http://schemas.microsoft.com/office/word/2018/wordml" xmlns:w16sdtdh="http://schemas.microsoft.com/office/word/2020/wordml/sdtdatahash" xmlns:w16sdtfl="http://schemas.microsoft.com/office/word/2024/wordml/sdtformatlock" xmlns:w16se="http://schemas.microsoft.com/office/word/2015/wordml/symex" xmlns:w16du="http://schemas.microsoft.com/office/word/2023/wordml/word16du" xmlns:wne="http://schemas.microsoft.com/office/word/2006/wordml" mc:Ignorable="w14 w15 w16se w16cid w16 w16cex w16sdtdh w16sdtfl w16du wp14">
+<w:ftr xmlns:wpc="http://schemas.microsoft.com/office/word/2010/wordprocessingCanvas" xmlns:cx="http://schemas.microsoft.com/office/drawing/2014/chartex" xmlns:cx1="http://schemas.microsoft.com/office/drawing/2015/9/8/chartex" xmlns:cx2="http://schemas.microsoft.com/office/drawing/2015/10/21/chartex" xmlns:cx3="http://schemas.microsoft.com/office/drawing/2016/5/9/chartex" xmlns:cx4="http://schemas.microsoft.com/office/drawing/2016/5/10/chartex" xmlns:cx5="http://schemas.microsoft.com/office/drawing/2016/5/11/chartex" xmlns:cx6="http://schemas.microsoft.com/office/drawing/2016/5/12/chartex" xmlns:cx7="http://schemas.microsoft.com/office/drawing/2016/5/13/chartex" xmlns:cx8="http://schemas.microsoft.com/office/drawing/2016/5/14/chartex" xmlns:mc="http://schemas.openxmlformats.org/markup-compatibility/2006" xmlns:aink="http://schemas.microsoft.com/office/drawing/2016/ink" xmlns:am3d="http://schemas.microsoft.com/office/drawing/2017/model3d" xmlns:o="urn:schemas-microsoft-com:office:office" xmlns:oel="http://schemas.microsoft.com/office/2019/extlst" xmlns:r="http://schemas.openxmlformats.org/officeDocument/2006/relationships" xmlns:m="http://schemas.openxmlformats.org/officeDocument/2006/math" xmlns:v="urn:schemas-microsoft-com:vml" xmlns:wp14="http://schemas.microsoft.com/office/word/2010/wordprocessingDrawing" xmlns:wp="http://schemas.openxmlformats.org/drawingml/2006/wordprocessingDrawing" xmlns:w10="urn:schemas-microsoft-com:office:word" xmlns:w="http://schemas.openxmlformats.org/wordprocessingml/2006/main" xmlns:w14="http://schemas.microsoft.com/office/word/2010/wordml" xmlns:w15="http://schemas.microsoft.com/office/word/2012/wordml" xmlns:w16cei="http://schemas.microsoft.com/office/word/2026/wordml/cei" xmlns:w16cex="http://schemas.microsoft.com/office/word/2018/wordml/cex" xmlns:w16cid="http://schemas.microsoft.com/office/word/2016/wordml/cid" xmlns:w16="http://schemas.microsoft.com/office/word/2018/wordml" xmlns:w16du="http://schemas.microsoft.com/office/word/2023/wordml/word16du" xmlns:w16sdtdh="http://schemas.microsoft.com/office/word/2020/wordml/sdtdatahash" xmlns:w16sdtfl="http://schemas.microsoft.com/office/word/2024/wordml/sdtformatlock" xmlns:w16se="http://schemas.microsoft.com/office/word/2015/wordml/symex" xmlns:wpg="http://schemas.microsoft.com/office/word/2010/wordprocessingGroup" xmlns:wpi="http://schemas.microsoft.com/office/word/2010/wordprocessingInk" xmlns:wne="http://schemas.microsoft.com/office/word/2006/wordml" xmlns:wps="http://schemas.microsoft.com/office/word/2010/wordprocessingShape" mc:Ignorable="w14 w15 w16se w16cid w16 w16cex w16sdtdh w16sdtfl w16du wp14">
+  <w:p>
+    <w:pPr>
+      <w:pStyle w:val="Footer"/>
+    </w:pPr>
+  </w:p>
+</w:ftr>
+</file>
+
+<file path=word/footer2.xml><?xml version="1.0" encoding="utf-8"?>
+<w:ftr xmlns:wpc="http://schemas.microsoft.com/office/word/2010/wordprocessingCanvas" xmlns:cx="http://schemas.microsoft.com/office/drawing/2014/chartex" xmlns:cx1="http://schemas.microsoft.com/office/drawing/2015/9/8/chartex" xmlns:cx2="http://schemas.microsoft.com/office/drawing/2015/10/21/chartex" xmlns:cx3="http://schemas.microsoft.com/office/drawing/2016/5/9/chartex" xmlns:cx4="http://schemas.microsoft.com/office/drawing/2016/5/10/chartex" xmlns:cx5="http://schemas.microsoft.com/office/drawing/2016/5/11/chartex" xmlns:cx6="http://schemas.microsoft.com/office/drawing/2016/5/12/chartex" xmlns:cx7="http://schemas.microsoft.com/office/drawing/2016/5/13/chartex" xmlns:cx8="http://schemas.microsoft.com/office/drawing/2016/5/14/chartex" xmlns:mc="http://schemas.openxmlformats.org/markup-compatibility/2006" xmlns:aink="http://schemas.microsoft.com/office/drawing/2016/ink" xmlns:am3d="http://schemas.microsoft.com/office/drawing/2017/model3d" xmlns:o="urn:schemas-microsoft-com:office:office" xmlns:oel="http://schemas.microsoft.com/office/2019/extlst" xmlns:r="http://schemas.openxmlformats.org/officeDocument/2006/relationships" xmlns:m="http://schemas.openxmlformats.org/officeDocument/2006/math" xmlns:v="urn:schemas-microsoft-com:vml" xmlns:wp14="http://schemas.microsoft.com/office/word/2010/wordprocessingDrawing" xmlns:wp="http://schemas.openxmlformats.org/drawingml/2006/wordprocessingDrawing" xmlns:w10="urn:schemas-microsoft-com:office:word" xmlns:w="http://schemas.openxmlformats.org/wordprocessingml/2006/main" xmlns:w14="http://schemas.microsoft.com/office/word/2010/wordml" xmlns:w15="http://schemas.microsoft.com/office/word/2012/wordml" xmlns:w16cei="http://schemas.microsoft.com/office/word/2026/wordml/cei" xmlns:w16cex="http://schemas.microsoft.com/office/word/2018/wordml/cex" xmlns:w16cid="http://schemas.microsoft.com/office/word/2016/wordml/cid" xmlns:w16="http://schemas.microsoft.com/office/word/2018/wordml" xmlns:w16du="http://schemas.microsoft.com/office/word/2023/wordml/word16du" xmlns:w16sdtdh="http://schemas.microsoft.com/office/word/2020/wordml/sdtdatahash" xmlns:w16sdtfl="http://schemas.microsoft.com/office/word/2024/wordml/sdtformatlock" xmlns:w16se="http://schemas.microsoft.com/office/word/2015/wordml/symex" xmlns:wpg="http://schemas.microsoft.com/office/word/2010/wordprocessingGroup" xmlns:wpi="http://schemas.microsoft.com/office/word/2010/wordprocessingInk" xmlns:wne="http://schemas.microsoft.com/office/word/2006/wordml" xmlns:wps="http://schemas.microsoft.com/office/word/2010/wordprocessingShape" mc:Ignorable="w14 w15 w16se w16cid w16 w16cex w16sdtdh w16sdtfl w16du wp14">
   <w:sdt>
     <w:sdtPr>
       <w:id w:val="1458836867"/>
@@ -15637,6 +17496,163 @@
           <w:pStyle w:val="Footer"/>
           <w:jc w:val="center"/>
         </w:pPr>
+      </w:p>
+      <w:p>
+        <w:pPr>
+          <w:widowControl w:val="0"/>
+          <w:autoSpaceDE w:val="0"/>
+          <w:autoSpaceDN w:val="0"/>
+          <w:spacing w:before="97" w:after="0" w:line="182" w:lineRule="exact"/>
+          <w:rPr>
+            <w:rFonts w:ascii="Trebuchet MS" w:eastAsia="Tahoma" w:hAnsi="Tahoma" w:cs="Tahoma"/>
+            <w:b/>
+            <w:color w:val="000000"/>
+            <w:w w:val="95"/>
+            <w:sz w:val="16"/>
+            <w:lang w:val="en-US"/>
+            <w14:ligatures w14:val="none"/>
+          </w:rPr>
+        </w:pPr>
+        <w:r>
+          <w:rPr>
+            <w:rFonts w:ascii="Tahoma" w:eastAsia="Tahoma" w:hAnsi="Tahoma" w:cs="Tahoma"/>
+            <w:b/>
+            <w:color w:val="000000"/>
+            <w:w w:val="95"/>
+            <w:sz w:val="16"/>
+            <w:szCs w:val="16"/>
+            <w:lang w:val="en-US"/>
+            <w14:ligatures w14:val="none"/>
+          </w:rPr>
+          <w:t>S</w:t>
+        </w:r>
+        <w:r>
+          <w:rPr>
+            <w:rFonts w:ascii="Tahoma" w:eastAsia="Tahoma" w:hAnsi="Tahoma" w:cs="Tahoma"/>
+            <w:b/>
+            <w:color w:val="000000"/>
+            <w:w w:val="95"/>
+            <w:sz w:val="16"/>
+            <w:szCs w:val="16"/>
+            <w:lang w:val="en-US"/>
+            <w14:ligatures w14:val="none"/>
+          </w:rPr>
+          <w:t xml:space="preserve">HORAKA SUYULA PLATFORM SDN BHD (1433328-H) 202101033028 </w:t>
+        </w:r>
+      </w:p>
+      <w:p>
+        <w:pPr>
+          <w:widowControl w:val="0"/>
+          <w:autoSpaceDE w:val="0"/>
+          <w:autoSpaceDN w:val="0"/>
+          <w:spacing w:after="0" w:line="240" w:lineRule="auto"/>
+          <w:rPr>
+            <w:rFonts w:ascii="Tahoma" w:eastAsia="Tahoma" w:hAnsi="Tahoma" w:cs="Tahoma"/>
+            <w:bCs/>
+            <w:color w:val="000000"/>
+            <w:w w:val="95"/>
+            <w:sz w:val="16"/>
+            <w:szCs w:val="16"/>
+            <w:lang w:val="en-US"/>
+            <w14:ligatures w14:val="none"/>
+          </w:rPr>
+        </w:pPr>
+        <w:r>
+          <w:rPr>
+            <w:rFonts w:ascii="Tahoma" w:eastAsia="Tahoma" w:hAnsi="Tahoma" w:cs="Tahoma"/>
+            <w:bCs/>
+            <w:color w:val="000000"/>
+            <w:w w:val="95"/>
+            <w:sz w:val="16"/>
+            <w:szCs w:val="16"/>
+            <w:lang w:val="en-US"/>
+            <w14:ligatures w14:val="none"/>
+          </w:rPr>
+          <w:t>LEVEL 19, WISMA MONT’ KIARA, NO. 1, JALAN KIARA, MONT KIARA, 50480 KUALA LUMPUR, MALAYSIA</w:t>
+        </w:r>
+      </w:p>
+      <w:p>
+        <w:pPr>
+          <w:widowControl w:val="0"/>
+          <w:autoSpaceDE w:val="0"/>
+          <w:autoSpaceDN w:val="0"/>
+          <w:spacing w:after="0" w:line="157" w:lineRule="exact"/>
+          <w:rPr>
+            <w:rFonts w:ascii="Tahoma" w:eastAsia="Tahoma" w:hAnsi="Tahoma" w:cs="Tahoma"/>
+            <w:lang w:val="en-US"/>
+            <w14:ligatures w14:val="none"/>
+          </w:rPr>
+        </w:pPr>
+        <w:r>
+          <w:rPr>
+            <w:rFonts w:ascii="Tahoma" w:eastAsia="Tahoma" w:hAnsi="Tahoma" w:cs="Tahoma"/>
+            <w:b/>
+            <w:bCs/>
+            <w:w w:val="105"/>
+            <w:sz w:val="16"/>
+            <w:szCs w:val="16"/>
+            <w:lang w:val="en-US"/>
+            <w14:ligatures w14:val="none"/>
+          </w:rPr>
+          <w:t>T</w:t>
+        </w:r>
+        <w:r>
+          <w:rPr>
+            <w:rFonts w:ascii="Tahoma" w:eastAsia="Tahoma" w:hAnsi="Tahoma" w:cs="Tahoma"/>
+            <w:w w:val="105"/>
+            <w:sz w:val="16"/>
+            <w:szCs w:val="16"/>
+            <w:lang w:val="en-US"/>
+            <w14:ligatures w14:val="none"/>
+          </w:rPr>
+          <w:t xml:space="preserve">: +603-2708 8100 </w:t>
+        </w:r>
+        <w:r>
+          <w:rPr>
+            <w:rFonts w:ascii="Tahoma" w:eastAsia="Tahoma" w:hAnsi="Tahoma" w:cs="Tahoma"/>
+            <w:b/>
+            <w:bCs/>
+            <w:w w:val="105"/>
+            <w:sz w:val="16"/>
+            <w:szCs w:val="16"/>
+            <w:lang w:val="en-US"/>
+            <w14:ligatures w14:val="none"/>
+          </w:rPr>
+          <w:t>E</w:t>
+        </w:r>
+        <w:r>
+          <w:rPr>
+            <w:rFonts w:ascii="Tahoma" w:eastAsia="Tahoma" w:hAnsi="Tahoma" w:cs="Tahoma"/>
+            <w:w w:val="105"/>
+            <w:sz w:val="16"/>
+            <w:szCs w:val="16"/>
+            <w:lang w:val="en-US"/>
+            <w14:ligatures w14:val="none"/>
+          </w:rPr>
+          <w:t xml:space="preserve">: enquiry@cashsouk.com </w:t>
+        </w:r>
+        <w:r>
+          <w:rPr>
+            <w:rFonts w:ascii="Tahoma" w:eastAsia="Tahoma" w:hAnsi="Tahoma" w:cs="Tahoma"/>
+            <w:b/>
+            <w:bCs/>
+            <w:sz w:val="16"/>
+            <w:szCs w:val="16"/>
+            <w:lang w:val="en-US"/>
+            <w14:ligatures w14:val="none"/>
+          </w:rPr>
+          <w:t>W</w:t>
+        </w:r>
+        <w:r>
+          <w:rPr>
+            <w:rFonts w:ascii="Tahoma" w:eastAsia="Tahoma" w:hAnsi="Tahoma" w:cs="Tahoma"/>
+            <w:sz w:val="16"/>
+            <w:szCs w:val="16"/>
+            <w:lang w:val="en-US"/>
+            <w14:ligatures w14:val="none"/>
+          </w:rPr>
+          <w:t>: www.cashsouk.com</w:t>
+        </w:r>
       </w:p>
       <w:p>
         <w:pPr>
@@ -15701,8 +17717,18 @@
 </w:ftr>
 </file>
 
+<file path=word/footer3.xml><?xml version="1.0" encoding="utf-8"?>
+<w:ftr xmlns:wpc="http://schemas.microsoft.com/office/word/2010/wordprocessingCanvas" xmlns:cx="http://schemas.microsoft.com/office/drawing/2014/chartex" xmlns:cx1="http://schemas.microsoft.com/office/drawing/2015/9/8/chartex" xmlns:cx2="http://schemas.microsoft.com/office/drawing/2015/10/21/chartex" xmlns:cx3="http://schemas.microsoft.com/office/drawing/2016/5/9/chartex" xmlns:cx4="http://schemas.microsoft.com/office/drawing/2016/5/10/chartex" xmlns:cx5="http://schemas.microsoft.com/office/drawing/2016/5/11/chartex" xmlns:cx6="http://schemas.microsoft.com/office/drawing/2016/5/12/chartex" xmlns:cx7="http://schemas.microsoft.com/office/drawing/2016/5/13/chartex" xmlns:cx8="http://schemas.microsoft.com/office/drawing/2016/5/14/chartex" xmlns:mc="http://schemas.openxmlformats.org/markup-compatibility/2006" xmlns:aink="http://schemas.microsoft.com/office/drawing/2016/ink" xmlns:am3d="http://schemas.microsoft.com/office/drawing/2017/model3d" xmlns:o="urn:schemas-microsoft-com:office:office" xmlns:oel="http://schemas.microsoft.com/office/2019/extlst" xmlns:r="http://schemas.openxmlformats.org/officeDocument/2006/relationships" xmlns:m="http://schemas.openxmlformats.org/officeDocument/2006/math" xmlns:v="urn:schemas-microsoft-com:vml" xmlns:wp14="http://schemas.microsoft.com/office/word/2010/wordprocessingDrawing" xmlns:wp="http://schemas.openxmlformats.org/drawingml/2006/wordprocessingDrawing" xmlns:w10="urn:schemas-microsoft-com:office:word" xmlns:w="http://schemas.openxmlformats.org/wordprocessingml/2006/main" xmlns:w14="http://schemas.microsoft.com/office/word/2010/wordml" xmlns:w15="http://schemas.microsoft.com/office/word/2012/wordml" xmlns:w16cei="http://schemas.microsoft.com/office/word/2026/wordml/cei" xmlns:w16cex="http://schemas.microsoft.com/office/word/2018/wordml/cex" xmlns:w16cid="http://schemas.microsoft.com/office/word/2016/wordml/cid" xmlns:w16="http://schemas.microsoft.com/office/word/2018/wordml" xmlns:w16du="http://schemas.microsoft.com/office/word/2023/wordml/word16du" xmlns:w16sdtdh="http://schemas.microsoft.com/office/word/2020/wordml/sdtdatahash" xmlns:w16sdtfl="http://schemas.microsoft.com/office/word/2024/wordml/sdtformatlock" xmlns:w16se="http://schemas.microsoft.com/office/word/2015/wordml/symex" xmlns:wpg="http://schemas.microsoft.com/office/word/2010/wordprocessingGroup" xmlns:wpi="http://schemas.microsoft.com/office/word/2010/wordprocessingInk" xmlns:wne="http://schemas.microsoft.com/office/word/2006/wordml" xmlns:wps="http://schemas.microsoft.com/office/word/2010/wordprocessingShape" mc:Ignorable="w14 w15 w16se w16cid w16 w16cex w16sdtdh w16sdtfl w16du wp14">
+  <w:p>
+    <w:pPr>
+      <w:pStyle w:val="Footer"/>
+    </w:pPr>
+  </w:p>
+</w:ftr>
+</file>
+
 <file path=word/footnotes.xml><?xml version="1.0" encoding="utf-8"?>
-<w:footnotes xmlns:wpc="http://schemas.microsoft.com/office/word/2010/wordprocessingCanvas" xmlns:cx="http://schemas.microsoft.com/office/drawing/2014/chartex" xmlns:cx1="http://schemas.microsoft.com/office/drawing/2015/9/8/chartex" xmlns:cx2="http://schemas.microsoft.com/office/drawing/2015/10/21/chartex" xmlns:cx3="http://schemas.microsoft.com/office/drawing/2016/5/9/chartex" xmlns:cx4="http://schemas.microsoft.com/office/drawing/2016/5/10/chartex" xmlns:cx5="http://schemas.microsoft.com/office/drawing/2016/5/11/chartex" xmlns:cx6="http://schemas.microsoft.com/office/drawing/2016/5/12/chartex" xmlns:cx7="http://schemas.microsoft.com/office/drawing/2016/5/13/chartex" xmlns:cx8="http://schemas.microsoft.com/office/drawing/2016/5/14/chartex" xmlns:mc="http://schemas.openxmlformats.org/markup-compatibility/2006" xmlns:m="http://schemas.openxmlformats.org/officeDocument/2006/math" xmlns:aink="http://schemas.microsoft.com/office/drawing/2016/ink" xmlns:am3d="http://schemas.microsoft.com/office/drawing/2017/model3d" xmlns:oel="http://schemas.microsoft.com/office/2019/extlst" xmlns:r="http://schemas.openxmlformats.org/officeDocument/2006/relationships" xmlns:wp14="http://schemas.microsoft.com/office/word/2010/wordprocessingDrawing" xmlns:wp="http://schemas.openxmlformats.org/drawingml/2006/wordprocessingDrawing" xmlns:wpg="http://schemas.microsoft.com/office/word/2010/wordprocessingGroup" xmlns:wpi="http://schemas.microsoft.com/office/word/2010/wordprocessingInk" xmlns:wps="http://schemas.microsoft.com/office/word/2010/wordprocessingShape" xmlns:o="urn:schemas-microsoft-com:office:office" xmlns:v="urn:schemas-microsoft-com:vml" xmlns:w10="urn:schemas-microsoft-com:office:word" xmlns:w="http://schemas.openxmlformats.org/wordprocessingml/2006/main" xmlns:w14="http://schemas.microsoft.com/office/word/2010/wordml" xmlns:w15="http://schemas.microsoft.com/office/word/2012/wordml" xmlns:w16cei="http://schemas.microsoft.com/office/word/2026/wordml/cei" xmlns:w16cex="http://schemas.microsoft.com/office/word/2018/wordml/cex" xmlns:w16cid="http://schemas.microsoft.com/office/word/2016/wordml/cid" xmlns:w16="http://schemas.microsoft.com/office/word/2018/wordml" xmlns:w16sdtdh="http://schemas.microsoft.com/office/word/2020/wordml/sdtdatahash" xmlns:w16sdtfl="http://schemas.microsoft.com/office/word/2024/wordml/sdtformatlock" xmlns:w16se="http://schemas.microsoft.com/office/word/2015/wordml/symex" xmlns:w16du="http://schemas.microsoft.com/office/word/2023/wordml/word16du" xmlns:wne="http://schemas.microsoft.com/office/word/2006/wordml" mc:Ignorable="w14 w15 w16se w16cid w16 w16cex w16sdtdh w16sdtfl w16du wp14">
+<w:footnotes xmlns:wpc="http://schemas.microsoft.com/office/word/2010/wordprocessingCanvas" xmlns:cx="http://schemas.microsoft.com/office/drawing/2014/chartex" xmlns:cx1="http://schemas.microsoft.com/office/drawing/2015/9/8/chartex" xmlns:cx2="http://schemas.microsoft.com/office/drawing/2015/10/21/chartex" xmlns:cx3="http://schemas.microsoft.com/office/drawing/2016/5/9/chartex" xmlns:cx4="http://schemas.microsoft.com/office/drawing/2016/5/10/chartex" xmlns:cx5="http://schemas.microsoft.com/office/drawing/2016/5/11/chartex" xmlns:cx6="http://schemas.microsoft.com/office/drawing/2016/5/12/chartex" xmlns:cx7="http://schemas.microsoft.com/office/drawing/2016/5/13/chartex" xmlns:cx8="http://schemas.microsoft.com/office/drawing/2016/5/14/chartex" xmlns:mc="http://schemas.openxmlformats.org/markup-compatibility/2006" xmlns:aink="http://schemas.microsoft.com/office/drawing/2016/ink" xmlns:am3d="http://schemas.microsoft.com/office/drawing/2017/model3d" xmlns:o="urn:schemas-microsoft-com:office:office" xmlns:oel="http://schemas.microsoft.com/office/2019/extlst" xmlns:r="http://schemas.openxmlformats.org/officeDocument/2006/relationships" xmlns:m="http://schemas.openxmlformats.org/officeDocument/2006/math" xmlns:v="urn:schemas-microsoft-com:vml" xmlns:wp14="http://schemas.microsoft.com/office/word/2010/wordprocessingDrawing" xmlns:wp="http://schemas.openxmlformats.org/drawingml/2006/wordprocessingDrawing" xmlns:w10="urn:schemas-microsoft-com:office:word" xmlns:w="http://schemas.openxmlformats.org/wordprocessingml/2006/main" xmlns:w14="http://schemas.microsoft.com/office/word/2010/wordml" xmlns:w15="http://schemas.microsoft.com/office/word/2012/wordml" xmlns:w16cei="http://schemas.microsoft.com/office/word/2026/wordml/cei" xmlns:w16cex="http://schemas.microsoft.com/office/word/2018/wordml/cex" xmlns:w16cid="http://schemas.microsoft.com/office/word/2016/wordml/cid" xmlns:w16="http://schemas.microsoft.com/office/word/2018/wordml" xmlns:w16du="http://schemas.microsoft.com/office/word/2023/wordml/word16du" xmlns:w16sdtdh="http://schemas.microsoft.com/office/word/2020/wordml/sdtdatahash" xmlns:w16sdtfl="http://schemas.microsoft.com/office/word/2024/wordml/sdtformatlock" xmlns:w16se="http://schemas.microsoft.com/office/word/2015/wordml/symex" xmlns:wpg="http://schemas.microsoft.com/office/word/2010/wordprocessingGroup" xmlns:wpi="http://schemas.microsoft.com/office/word/2010/wordprocessingInk" xmlns:wne="http://schemas.microsoft.com/office/word/2006/wordml" xmlns:wps="http://schemas.microsoft.com/office/word/2010/wordprocessingShape" mc:Ignorable="w14 w15 w16se w16cid w16 w16cex w16sdtdh w16sdtfl w16du wp14">
   <w:footnote w:type="separator" w:id="-1">
     <w:p>
       <w:pPr>
@@ -15734,23 +17760,81 @@
 </file>
 
 <file path=word/header1.xml><?xml version="1.0" encoding="utf-8"?>
-<w:hdr xmlns:mc="http://schemas.openxmlformats.org/markup-compatibility/2006" xmlns:w="http://schemas.openxmlformats.org/wordprocessingml/2006/main" xmlns:w14="http://schemas.microsoft.com/office/word/2010/wordml" mc:Ignorable="w14 w15 w16se w16cid w16 w16cex w16sdtdh w16sdtfl w16du wp14">
+<w:hdr xmlns:wpc="http://schemas.microsoft.com/office/word/2010/wordprocessingCanvas" xmlns:cx="http://schemas.microsoft.com/office/drawing/2014/chartex" xmlns:cx1="http://schemas.microsoft.com/office/drawing/2015/9/8/chartex" xmlns:cx2="http://schemas.microsoft.com/office/drawing/2015/10/21/chartex" xmlns:cx3="http://schemas.microsoft.com/office/drawing/2016/5/9/chartex" xmlns:cx4="http://schemas.microsoft.com/office/drawing/2016/5/10/chartex" xmlns:cx5="http://schemas.microsoft.com/office/drawing/2016/5/11/chartex" xmlns:cx6="http://schemas.microsoft.com/office/drawing/2016/5/12/chartex" xmlns:cx7="http://schemas.microsoft.com/office/drawing/2016/5/13/chartex" xmlns:cx8="http://schemas.microsoft.com/office/drawing/2016/5/14/chartex" xmlns:mc="http://schemas.openxmlformats.org/markup-compatibility/2006" xmlns:aink="http://schemas.microsoft.com/office/drawing/2016/ink" xmlns:am3d="http://schemas.microsoft.com/office/drawing/2017/model3d" xmlns:o="urn:schemas-microsoft-com:office:office" xmlns:oel="http://schemas.microsoft.com/office/2019/extlst" xmlns:r="http://schemas.openxmlformats.org/officeDocument/2006/relationships" xmlns:m="http://schemas.openxmlformats.org/officeDocument/2006/math" xmlns:v="urn:schemas-microsoft-com:vml" xmlns:wp14="http://schemas.microsoft.com/office/word/2010/wordprocessingDrawing" xmlns:wp="http://schemas.openxmlformats.org/drawingml/2006/wordprocessingDrawing" xmlns:w10="urn:schemas-microsoft-com:office:word" xmlns:w="http://schemas.openxmlformats.org/wordprocessingml/2006/main" xmlns:w14="http://schemas.microsoft.com/office/word/2010/wordml" xmlns:w15="http://schemas.microsoft.com/office/word/2012/wordml" xmlns:w16cei="http://schemas.microsoft.com/office/word/2026/wordml/cei" xmlns:w16cex="http://schemas.microsoft.com/office/word/2018/wordml/cex" xmlns:w16cid="http://schemas.microsoft.com/office/word/2016/wordml/cid" xmlns:w16="http://schemas.microsoft.com/office/word/2018/wordml" xmlns:w16du="http://schemas.microsoft.com/office/word/2023/wordml/word16du" xmlns:w16sdtdh="http://schemas.microsoft.com/office/word/2020/wordml/sdtdatahash" xmlns:w16sdtfl="http://schemas.microsoft.com/office/word/2024/wordml/sdtformatlock" xmlns:w16se="http://schemas.microsoft.com/office/word/2015/wordml/symex" xmlns:wpg="http://schemas.microsoft.com/office/word/2010/wordprocessingGroup" xmlns:wpi="http://schemas.microsoft.com/office/word/2010/wordprocessingInk" xmlns:wne="http://schemas.microsoft.com/office/word/2006/wordml" xmlns:wps="http://schemas.microsoft.com/office/word/2010/wordprocessingShape" mc:Ignorable="w14 w15 w16se w16cid w16 w16cex w16sdtdh w16sdtfl w16du wp14">
+  <w:p>
+    <w:pPr>
+      <w:pStyle w:val="Header"/>
+    </w:pPr>
+  </w:p>
+</w:hdr>
+</file>
+
+<file path=word/header2.xml><?xml version="1.0" encoding="utf-8"?>
+<w:hdr xmlns:wpc="http://schemas.microsoft.com/office/word/2010/wordprocessingCanvas" xmlns:cx="http://schemas.microsoft.com/office/drawing/2014/chartex" xmlns:cx1="http://schemas.microsoft.com/office/drawing/2015/9/8/chartex" xmlns:cx2="http://schemas.microsoft.com/office/drawing/2015/10/21/chartex" xmlns:cx3="http://schemas.microsoft.com/office/drawing/2016/5/9/chartex" xmlns:cx4="http://schemas.microsoft.com/office/drawing/2016/5/10/chartex" xmlns:cx5="http://schemas.microsoft.com/office/drawing/2016/5/11/chartex" xmlns:cx6="http://schemas.microsoft.com/office/drawing/2016/5/12/chartex" xmlns:cx7="http://schemas.microsoft.com/office/drawing/2016/5/13/chartex" xmlns:cx8="http://schemas.microsoft.com/office/drawing/2016/5/14/chartex" xmlns:mc="http://schemas.openxmlformats.org/markup-compatibility/2006" xmlns:aink="http://schemas.microsoft.com/office/drawing/2016/ink" xmlns:am3d="http://schemas.microsoft.com/office/drawing/2017/model3d" xmlns:o="urn:schemas-microsoft-com:office:office" xmlns:oel="http://schemas.microsoft.com/office/2019/extlst" xmlns:r="http://schemas.openxmlformats.org/officeDocument/2006/relationships" xmlns:m="http://schemas.openxmlformats.org/officeDocument/2006/math" xmlns:v="urn:schemas-microsoft-com:vml" xmlns:wp14="http://schemas.microsoft.com/office/word/2010/wordprocessingDrawing" xmlns:wp="http://schemas.openxmlformats.org/drawingml/2006/wordprocessingDrawing" xmlns:w10="urn:schemas-microsoft-com:office:word" xmlns:w="http://schemas.openxmlformats.org/wordprocessingml/2006/main" xmlns:w14="http://schemas.microsoft.com/office/word/2010/wordml" xmlns:w15="http://schemas.microsoft.com/office/word/2012/wordml" xmlns:w16cei="http://schemas.microsoft.com/office/word/2026/wordml/cei" xmlns:w16cex="http://schemas.microsoft.com/office/word/2018/wordml/cex" xmlns:w16cid="http://schemas.microsoft.com/office/word/2016/wordml/cid" xmlns:w16="http://schemas.microsoft.com/office/word/2018/wordml" xmlns:w16du="http://schemas.microsoft.com/office/word/2023/wordml/word16du" xmlns:w16sdtdh="http://schemas.microsoft.com/office/word/2020/wordml/sdtdatahash" xmlns:w16sdtfl="http://schemas.microsoft.com/office/word/2024/wordml/sdtformatlock" xmlns:w16se="http://schemas.microsoft.com/office/word/2015/wordml/symex" xmlns:wpg="http://schemas.microsoft.com/office/word/2010/wordprocessingGroup" xmlns:wpi="http://schemas.microsoft.com/office/word/2010/wordprocessingInk" xmlns:wne="http://schemas.microsoft.com/office/word/2006/wordml" xmlns:wps="http://schemas.microsoft.com/office/word/2010/wordprocessingShape" mc:Ignorable="w14 w15 w16se w16cid w16 w16cex w16sdtdh w16sdtfl w16du wp14">
   <w:p>
     <w:pPr>
       <w:pStyle w:val="Header"/>
       <w:jc w:val="center"/>
     </w:pPr>
     <w:r>
-      <w:t xml:space="preserve">{letterhead_note}</w:t>
-    </w:r>
-    <w:r>
       <w:rPr>
-        <w:highlight w:val="yellow"/>
+        <w:noProof/>
       </w:rPr>
-      <w:t/>
-    </w:r>
-    <w:r>
-      <w:t/>
+      <w:drawing>
+        <wp:anchor distT="0" distB="0" distL="114300" distR="114300" simplePos="0" relativeHeight="251658240" behindDoc="0" locked="0" layoutInCell="1" allowOverlap="1" wp14:anchorId="043661CD" wp14:editId="4E627041">
+          <wp:simplePos x="0" y="0"/>
+          <wp:positionH relativeFrom="margin">
+            <wp:align>left</wp:align>
+          </wp:positionH>
+          <wp:positionV relativeFrom="paragraph">
+            <wp:posOffset>6985</wp:posOffset>
+          </wp:positionV>
+          <wp:extent cx="2167343" cy="812753"/>
+          <wp:effectExtent l="0" t="0" r="0" b="0"/>
+          <wp:wrapNone/>
+          <wp:docPr id="1312371315" name="Picture 3"/>
+          <wp:cNvGraphicFramePr>
+            <a:graphicFrameLocks xmlns:a="http://schemas.openxmlformats.org/drawingml/2006/main" noChangeAspect="1"/>
+          </wp:cNvGraphicFramePr>
+          <a:graphic xmlns:a="http://schemas.openxmlformats.org/drawingml/2006/main">
+            <a:graphicData uri="http://schemas.openxmlformats.org/drawingml/2006/picture">
+              <pic:pic xmlns:pic="http://schemas.openxmlformats.org/drawingml/2006/picture">
+                <pic:nvPicPr>
+                  <pic:cNvPr id="1312371315" name="Picture 3"/>
+                  <pic:cNvPicPr/>
+                </pic:nvPicPr>
+                <pic:blipFill>
+                  <a:blip r:embed="rId1">
+                    <a:extLst>
+                      <a:ext uri="{28A0092B-C50C-407E-A947-70E740481C1C}">
+                        <a14:useLocalDpi xmlns:a14="http://schemas.microsoft.com/office/drawing/2010/main" val="0"/>
+                      </a:ext>
+                    </a:extLst>
+                  </a:blip>
+                  <a:stretch>
+                    <a:fillRect/>
+                  </a:stretch>
+                </pic:blipFill>
+                <pic:spPr>
+                  <a:xfrm>
+                    <a:off x="0" y="0"/>
+                    <a:ext cx="2167343" cy="812753"/>
+                  </a:xfrm>
+                  <a:prstGeom prst="rect">
+                    <a:avLst/>
+                  </a:prstGeom>
+                </pic:spPr>
+              </pic:pic>
+            </a:graphicData>
+          </a:graphic>
+          <wp14:sizeRelH relativeFrom="page">
+            <wp14:pctWidth>0</wp14:pctWidth>
+          </wp14:sizeRelH>
+          <wp14:sizeRelV relativeFrom="page">
+            <wp14:pctHeight>0</wp14:pctHeight>
+          </wp14:sizeRelV>
+        </wp:anchor>
+      </w:drawing>
     </w:r>
   </w:p>
   <w:p>
@@ -15817,8 +17901,18 @@
 </w:hdr>
 </file>
 
+<file path=word/header3.xml><?xml version="1.0" encoding="utf-8"?>
+<w:hdr xmlns:wpc="http://schemas.microsoft.com/office/word/2010/wordprocessingCanvas" xmlns:cx="http://schemas.microsoft.com/office/drawing/2014/chartex" xmlns:cx1="http://schemas.microsoft.com/office/drawing/2015/9/8/chartex" xmlns:cx2="http://schemas.microsoft.com/office/drawing/2015/10/21/chartex" xmlns:cx3="http://schemas.microsoft.com/office/drawing/2016/5/9/chartex" xmlns:cx4="http://schemas.microsoft.com/office/drawing/2016/5/10/chartex" xmlns:cx5="http://schemas.microsoft.com/office/drawing/2016/5/11/chartex" xmlns:cx6="http://schemas.microsoft.com/office/drawing/2016/5/12/chartex" xmlns:cx7="http://schemas.microsoft.com/office/drawing/2016/5/13/chartex" xmlns:cx8="http://schemas.microsoft.com/office/drawing/2016/5/14/chartex" xmlns:mc="http://schemas.openxmlformats.org/markup-compatibility/2006" xmlns:aink="http://schemas.microsoft.com/office/drawing/2016/ink" xmlns:am3d="http://schemas.microsoft.com/office/drawing/2017/model3d" xmlns:o="urn:schemas-microsoft-com:office:office" xmlns:oel="http://schemas.microsoft.com/office/2019/extlst" xmlns:r="http://schemas.openxmlformats.org/officeDocument/2006/relationships" xmlns:m="http://schemas.openxmlformats.org/officeDocument/2006/math" xmlns:v="urn:schemas-microsoft-com:vml" xmlns:wp14="http://schemas.microsoft.com/office/word/2010/wordprocessingDrawing" xmlns:wp="http://schemas.openxmlformats.org/drawingml/2006/wordprocessingDrawing" xmlns:w10="urn:schemas-microsoft-com:office:word" xmlns:w="http://schemas.openxmlformats.org/wordprocessingml/2006/main" xmlns:w14="http://schemas.microsoft.com/office/word/2010/wordml" xmlns:w15="http://schemas.microsoft.com/office/word/2012/wordml" xmlns:w16cei="http://schemas.microsoft.com/office/word/2026/wordml/cei" xmlns:w16cex="http://schemas.microsoft.com/office/word/2018/wordml/cex" xmlns:w16cid="http://schemas.microsoft.com/office/word/2016/wordml/cid" xmlns:w16="http://schemas.microsoft.com/office/word/2018/wordml" xmlns:w16du="http://schemas.microsoft.com/office/word/2023/wordml/word16du" xmlns:w16sdtdh="http://schemas.microsoft.com/office/word/2020/wordml/sdtdatahash" xmlns:w16sdtfl="http://schemas.microsoft.com/office/word/2024/wordml/sdtformatlock" xmlns:w16se="http://schemas.microsoft.com/office/word/2015/wordml/symex" xmlns:wpg="http://schemas.microsoft.com/office/word/2010/wordprocessingGroup" xmlns:wpi="http://schemas.microsoft.com/office/word/2010/wordprocessingInk" xmlns:wne="http://schemas.microsoft.com/office/word/2006/wordml" xmlns:wps="http://schemas.microsoft.com/office/word/2010/wordprocessingShape" mc:Ignorable="w14 w15 w16se w16cid w16 w16cex w16sdtdh w16sdtfl w16du wp14">
+  <w:p>
+    <w:pPr>
+      <w:pStyle w:val="Header"/>
+    </w:pPr>
+  </w:p>
+</w:hdr>
+</file>
+
 <file path=word/numbering.xml><?xml version="1.0" encoding="utf-8"?>
-<w:numbering xmlns:wpc="http://schemas.microsoft.com/office/word/2010/wordprocessingCanvas" xmlns:cx="http://schemas.microsoft.com/office/drawing/2014/chartex" xmlns:cx1="http://schemas.microsoft.com/office/drawing/2015/9/8/chartex" xmlns:cx2="http://schemas.microsoft.com/office/drawing/2015/10/21/chartex" xmlns:cx3="http://schemas.microsoft.com/office/drawing/2016/5/9/chartex" xmlns:cx4="http://schemas.microsoft.com/office/drawing/2016/5/10/chartex" xmlns:cx5="http://schemas.microsoft.com/office/drawing/2016/5/11/chartex" xmlns:cx6="http://schemas.microsoft.com/office/drawing/2016/5/12/chartex" xmlns:cx7="http://schemas.microsoft.com/office/drawing/2016/5/13/chartex" xmlns:cx8="http://schemas.microsoft.com/office/drawing/2016/5/14/chartex" xmlns:mc="http://schemas.openxmlformats.org/markup-compatibility/2006" xmlns:m="http://schemas.openxmlformats.org/officeDocument/2006/math" xmlns:aink="http://schemas.microsoft.com/office/drawing/2016/ink" xmlns:am3d="http://schemas.microsoft.com/office/drawing/2017/model3d" xmlns:oel="http://schemas.microsoft.com/office/2019/extlst" xmlns:r="http://schemas.openxmlformats.org/officeDocument/2006/relationships" xmlns:wp14="http://schemas.microsoft.com/office/word/2010/wordprocessingDrawing" xmlns:wp="http://schemas.openxmlformats.org/drawingml/2006/wordprocessingDrawing" xmlns:wpg="http://schemas.microsoft.com/office/word/2010/wordprocessingGroup" xmlns:wpi="http://schemas.microsoft.com/office/word/2010/wordprocessingInk" xmlns:wps="http://schemas.microsoft.com/office/word/2010/wordprocessingShape" xmlns:o="urn:schemas-microsoft-com:office:office" xmlns:v="urn:schemas-microsoft-com:vml" xmlns:w10="urn:schemas-microsoft-com:office:word" xmlns:w="http://schemas.openxmlformats.org/wordprocessingml/2006/main" xmlns:w14="http://schemas.microsoft.com/office/word/2010/wordml" xmlns:w15="http://schemas.microsoft.com/office/word/2012/wordml" xmlns:w16cei="http://schemas.microsoft.com/office/word/2026/wordml/cei" xmlns:w16cex="http://schemas.microsoft.com/office/word/2018/wordml/cex" xmlns:w16cid="http://schemas.microsoft.com/office/word/2016/wordml/cid" xmlns:w16="http://schemas.microsoft.com/office/word/2018/wordml" xmlns:w16sdtdh="http://schemas.microsoft.com/office/word/2020/wordml/sdtdatahash" xmlns:w16sdtfl="http://schemas.microsoft.com/office/word/2024/wordml/sdtformatlock" xmlns:w16se="http://schemas.microsoft.com/office/word/2015/wordml/symex" xmlns:w16du="http://schemas.microsoft.com/office/word/2023/wordml/word16du" xmlns:wne="http://schemas.microsoft.com/office/word/2006/wordml" mc:Ignorable="w14 w15 w16se w16cid w16 w16cex w16sdtdh w16sdtfl w16du wp14">
+<w:numbering xmlns:wpc="http://schemas.microsoft.com/office/word/2010/wordprocessingCanvas" xmlns:cx="http://schemas.microsoft.com/office/drawing/2014/chartex" xmlns:cx1="http://schemas.microsoft.com/office/drawing/2015/9/8/chartex" xmlns:cx2="http://schemas.microsoft.com/office/drawing/2015/10/21/chartex" xmlns:cx3="http://schemas.microsoft.com/office/drawing/2016/5/9/chartex" xmlns:cx4="http://schemas.microsoft.com/office/drawing/2016/5/10/chartex" xmlns:cx5="http://schemas.microsoft.com/office/drawing/2016/5/11/chartex" xmlns:cx6="http://schemas.microsoft.com/office/drawing/2016/5/12/chartex" xmlns:cx7="http://schemas.microsoft.com/office/drawing/2016/5/13/chartex" xmlns:cx8="http://schemas.microsoft.com/office/drawing/2016/5/14/chartex" xmlns:mc="http://schemas.openxmlformats.org/markup-compatibility/2006" xmlns:aink="http://schemas.microsoft.com/office/drawing/2016/ink" xmlns:am3d="http://schemas.microsoft.com/office/drawing/2017/model3d" xmlns:o="urn:schemas-microsoft-com:office:office" xmlns:oel="http://schemas.microsoft.com/office/2019/extlst" xmlns:r="http://schemas.openxmlformats.org/officeDocument/2006/relationships" xmlns:m="http://schemas.openxmlformats.org/officeDocument/2006/math" xmlns:v="urn:schemas-microsoft-com:vml" xmlns:wp14="http://schemas.microsoft.com/office/word/2010/wordprocessingDrawing" xmlns:wp="http://schemas.openxmlformats.org/drawingml/2006/wordprocessingDrawing" xmlns:w10="urn:schemas-microsoft-com:office:word" xmlns:w="http://schemas.openxmlformats.org/wordprocessingml/2006/main" xmlns:w14="http://schemas.microsoft.com/office/word/2010/wordml" xmlns:w15="http://schemas.microsoft.com/office/word/2012/wordml" xmlns:w16cei="http://schemas.microsoft.com/office/word/2026/wordml/cei" xmlns:w16cex="http://schemas.microsoft.com/office/word/2018/wordml/cex" xmlns:w16cid="http://schemas.microsoft.com/office/word/2016/wordml/cid" xmlns:w16="http://schemas.microsoft.com/office/word/2018/wordml" xmlns:w16du="http://schemas.microsoft.com/office/word/2023/wordml/word16du" xmlns:w16sdtdh="http://schemas.microsoft.com/office/word/2020/wordml/sdtdatahash" xmlns:w16sdtfl="http://schemas.microsoft.com/office/word/2024/wordml/sdtformatlock" xmlns:w16se="http://schemas.microsoft.com/office/word/2015/wordml/symex" xmlns:wpg="http://schemas.microsoft.com/office/word/2010/wordprocessingGroup" xmlns:wpi="http://schemas.microsoft.com/office/word/2010/wordprocessingInk" xmlns:wne="http://schemas.microsoft.com/office/word/2006/wordml" xmlns:wps="http://schemas.microsoft.com/office/word/2010/wordprocessingShape" mc:Ignorable="w14 w15 w16se w16cid w16 w16cex w16sdtdh w16sdtfl w16du wp14">
   <w:abstractNum w:abstractNumId="0" w15:restartNumberingAfterBreak="0">
     <w:nsid w:val="01EE439B"/>
     <w:multiLevelType w:val="hybridMultilevel"/>
@@ -21605,7 +23699,7 @@
 </file>
 
 <file path=word/styles.xml><?xml version="1.0" encoding="utf-8"?>
-<w:styles xmlns:mc="http://schemas.openxmlformats.org/markup-compatibility/2006" xmlns:r="http://schemas.openxmlformats.org/officeDocument/2006/relationships" xmlns:w="http://schemas.openxmlformats.org/wordprocessingml/2006/main" xmlns:w14="http://schemas.microsoft.com/office/word/2010/wordml" xmlns:w15="http://schemas.microsoft.com/office/word/2012/wordml" xmlns:w16cex="http://schemas.microsoft.com/office/word/2018/wordml/cex" xmlns:w16cid="http://schemas.microsoft.com/office/word/2016/wordml/cid" xmlns:w16="http://schemas.microsoft.com/office/word/2018/wordml" xmlns:w16sdtdh="http://schemas.microsoft.com/office/word/2020/wordml/sdtdatahash" xmlns:w16sdtfl="http://schemas.microsoft.com/office/word/2024/wordml/sdtformatlock" xmlns:w16se="http://schemas.microsoft.com/office/word/2015/wordml/symex" xmlns:w16du="http://schemas.microsoft.com/office/word/2023/wordml/word16du" mc:Ignorable="w14 w15 w16se w16cid w16 w16cex w16sdtdh w16sdtfl w16du">
+<w:styles xmlns:mc="http://schemas.openxmlformats.org/markup-compatibility/2006" xmlns:r="http://schemas.openxmlformats.org/officeDocument/2006/relationships" xmlns:w="http://schemas.openxmlformats.org/wordprocessingml/2006/main" xmlns:w14="http://schemas.microsoft.com/office/word/2010/wordml" xmlns:w15="http://schemas.microsoft.com/office/word/2012/wordml" xmlns:w16cex="http://schemas.microsoft.com/office/word/2018/wordml/cex" xmlns:w16cid="http://schemas.microsoft.com/office/word/2016/wordml/cid" xmlns:w16="http://schemas.microsoft.com/office/word/2018/wordml" xmlns:w16du="http://schemas.microsoft.com/office/word/2023/wordml/word16du" xmlns:w16sdtdh="http://schemas.microsoft.com/office/word/2020/wordml/sdtdatahash" xmlns:w16sdtfl="http://schemas.microsoft.com/office/word/2024/wordml/sdtformatlock" xmlns:w16se="http://schemas.microsoft.com/office/word/2015/wordml/symex" mc:Ignorable="w14 w15 w16se w16cid w16 w16cex w16sdtdh w16sdtfl w16du">
   <w:docDefaults>
     <w:rPrDefault>
       <w:rPr>
@@ -23042,10 +25136,22 @@
 </file>
 
 <file path=customXml/item1.xml><?xml version="1.0" encoding="utf-8"?>
+<p:properties xmlns:p="http://schemas.microsoft.com/office/2006/metadata/properties" xmlns:xsi="http://www.w3.org/2001/XMLSchema-instance" xmlns:pc="http://schemas.microsoft.com/office/infopath/2007/PartnerControls">
+  <documentManagement>
+    <_Flow_SignoffStatus xmlns="a0846abc-da76-433d-b89e-11ed84fbaeb3" xsi:nil="true"/>
+    <lcf76f155ced4ddcb4097134ff3c332f xmlns="a0846abc-da76-433d-b89e-11ed84fbaeb3">
+      <Terms xmlns="http://schemas.microsoft.com/office/infopath/2007/PartnerControls"/>
+    </lcf76f155ced4ddcb4097134ff3c332f>
+    <TaxCatchAll xmlns="4b0b2adc-e4a8-4832-bb38-e3a7e820179b" xsi:nil="true"/>
+  </documentManagement>
+</p:properties>
+</file>
+
+<file path=customXml/item2.xml><?xml version="1.0" encoding="utf-8"?>
 <b:Sources xmlns:b="http://schemas.openxmlformats.org/officeDocument/2006/bibliography" xmlns="http://schemas.openxmlformats.org/officeDocument/2006/bibliography" SelectedStyle="\APASixthEditionOfficeOnline.xsl" StyleName="APA" Version="6"/>
 </file>
 
-<file path=customXml/item2.xml><?xml version="1.0" encoding="utf-8"?>
+<file path=customXml/item3.xml><?xml version="1.0" encoding="utf-8"?>
 <?mso-contentType ?>
 <FormTemplates xmlns="http://schemas.microsoft.com/sharepoint/v3/contenttype/forms">
   <Display>DocumentLibraryForm</Display>
@@ -23054,7 +25160,7 @@
 </FormTemplates>
 </file>
 
-<file path=customXml/item3.xml><?xml version="1.0" encoding="utf-8"?>
+<file path=customXml/item4.xml><?xml version="1.0" encoding="utf-8"?>
 <ct:contentTypeSchema xmlns:ct="http://schemas.microsoft.com/office/2006/metadata/contentType" xmlns:ma="http://schemas.microsoft.com/office/2006/metadata/properties/metaAttributes" ct:_="" ma:_="" ma:contentTypeName="Document" ma:contentTypeID="0x010100095F958C9057D64E8725F7631168A218" ma:contentTypeVersion="24" ma:contentTypeDescription="Create a new document." ma:contentTypeScope="" ma:versionID="0181d0ef269031616f304220f34fcec3">
   <xsd:schema xmlns:xsd="http://www.w3.org/2001/XMLSchema" xmlns:xs="http://www.w3.org/2001/XMLSchema" xmlns:p="http://schemas.microsoft.com/office/2006/metadata/properties" xmlns:ns2="a0846abc-da76-433d-b89e-11ed84fbaeb3" xmlns:ns3="4b0b2adc-e4a8-4832-bb38-e3a7e820179b" targetNamespace="http://schemas.microsoft.com/office/2006/metadata/properties" ma:root="true" ma:fieldsID="8fea1687251d818162f479617e9b8afa" ns2:_="" ns3:_="">
     <xsd:import namespace="a0846abc-da76-433d-b89e-11ed84fbaeb3"/>
@@ -23321,19 +25427,18 @@
 </ct:contentTypeSchema>
 </file>
 
-<file path=customXml/item4.xml><?xml version="1.0" encoding="utf-8"?>
-<p:properties xmlns:p="http://schemas.microsoft.com/office/2006/metadata/properties" xmlns:xsi="http://www.w3.org/2001/XMLSchema-instance" xmlns:pc="http://schemas.microsoft.com/office/infopath/2007/PartnerControls">
-  <documentManagement>
-    <_Flow_SignoffStatus xmlns="a0846abc-da76-433d-b89e-11ed84fbaeb3" xsi:nil="true"/>
-    <lcf76f155ced4ddcb4097134ff3c332f xmlns="a0846abc-da76-433d-b89e-11ed84fbaeb3">
-      <Terms xmlns="http://schemas.microsoft.com/office/infopath/2007/PartnerControls"/>
-    </lcf76f155ced4ddcb4097134ff3c332f>
-    <TaxCatchAll xmlns="4b0b2adc-e4a8-4832-bb38-e3a7e820179b" xsi:nil="true"/>
-  </documentManagement>
-</p:properties>
+<file path=customXml/itemProps1.xml><?xml version="1.0" encoding="utf-8"?>
+<ds:datastoreItem xmlns:ds="http://schemas.openxmlformats.org/officeDocument/2006/customXml" ds:itemID="{06AF3FC3-CD02-49E6-93A5-73EE653BBDCC}">
+  <ds:schemaRefs>
+    <ds:schemaRef ds:uri="http://schemas.microsoft.com/office/2006/metadata/properties"/>
+    <ds:schemaRef ds:uri="http://schemas.microsoft.com/office/infopath/2007/PartnerControls"/>
+    <ds:schemaRef ds:uri="a0846abc-da76-433d-b89e-11ed84fbaeb3"/>
+    <ds:schemaRef ds:uri="4b0b2adc-e4a8-4832-bb38-e3a7e820179b"/>
+  </ds:schemaRefs>
+</ds:datastoreItem>
 </file>
 
-<file path=customXml/itemProps1.xml><?xml version="1.0" encoding="utf-8"?>
+<file path=customXml/itemProps2.xml><?xml version="1.0" encoding="utf-8"?>
 <ds:datastoreItem xmlns:ds="http://schemas.openxmlformats.org/officeDocument/2006/customXml" ds:itemID="{31A8F991-F2C3-4A98-93A0-9F15F02E83A7}">
   <ds:schemaRefs>
     <ds:schemaRef ds:uri="http://schemas.openxmlformats.org/officeDocument/2006/bibliography"/>
@@ -23341,7 +25446,7 @@
 </ds:datastoreItem>
 </file>
 
-<file path=customXml/itemProps2.xml><?xml version="1.0" encoding="utf-8"?>
+<file path=customXml/itemProps3.xml><?xml version="1.0" encoding="utf-8"?>
 <ds:datastoreItem xmlns:ds="http://schemas.openxmlformats.org/officeDocument/2006/customXml" ds:itemID="{B3B23335-743F-4ECA-B591-0D88F7E33FD2}">
   <ds:schemaRefs>
     <ds:schemaRef ds:uri="http://schemas.microsoft.com/sharepoint/v3/contenttype/forms"/>
@@ -23349,7 +25454,7 @@
 </ds:datastoreItem>
 </file>
 
-<file path=customXml/itemProps3.xml><?xml version="1.0" encoding="utf-8"?>
+<file path=customXml/itemProps4.xml><?xml version="1.0" encoding="utf-8"?>
 <ds:datastoreItem xmlns:ds="http://schemas.openxmlformats.org/officeDocument/2006/customXml" ds:itemID="{F20D8333-D2CC-42A6-B516-87CB1D2A20AC}">
   <ds:schemaRefs>
     <ds:schemaRef ds:uri="http://schemas.microsoft.com/office/2006/metadata/contentType"/>
@@ -23366,15 +25471,4 @@
     <ds:schemaRef ds:uri="http://schemas.microsoft.com/internal/obd"/>
   </ds:schemaRefs>
 </ds:datastoreItem>
-</file>
-
-<file path=customXml/itemProps4.xml><?xml version="1.0" encoding="utf-8"?>
-<ds:datastoreItem xmlns:ds="http://schemas.openxmlformats.org/officeDocument/2006/customXml" ds:itemID="{06AF3FC3-CD02-49E6-93A5-73EE653BBDCC}">
-  <ds:schemaRefs>
-    <ds:schemaRef ds:uri="http://schemas.microsoft.com/office/2006/metadata/properties"/>
-    <ds:schemaRef ds:uri="http://schemas.microsoft.com/office/infopath/2007/PartnerControls"/>
-    <ds:schemaRef ds:uri="a0846abc-da76-433d-b89e-11ed84fbaeb3"/>
-    <ds:schemaRef ds:uri="4b0b2adc-e4a8-4832-bb38-e3a7e820179b"/>
-  </ds:schemaRefs>
-</ds:datastoreItem>
 </file>
</xml_diff>

<commit_message>
chore: move LO page number to bottom right corner
</commit_message>
<xml_diff>
--- a/apps/api/src/modules/applications/templates/arf-contract-facility-loo.docx
+++ b/apps/api/src/modules/applications/templates/arf-contract-facility-loo.docx
@@ -10145,7 +10145,6 @@
           <w:sz w:val="20"/>
           <w:szCs w:val="20"/>
         </w:rPr>
-        <w:lastRenderedPageBreak/>
         <w:t>Payment of Taxes and Outgoings: Ensure the timely payment of all taxes, rates, and other outgoings related to your assets, including penalties. In the event of non-payment, P2P Operator may, at its discretion, pay the amounts on your behalf and submit the receipts to you for reimbursement.</w:t>
       </w:r>
     </w:p>
@@ -10180,6 +10179,7 @@
           <w:sz w:val="20"/>
           <w:szCs w:val="20"/>
         </w:rPr>
+        <w:lastRenderedPageBreak/>
         <w:t>Access to Premises: Permit SSP or its authorized agents, upon reasonable notice, to enter your premises to inspect, make inventories, and record your operations, and if requested, to arrange for the valuation and/or auditing of your assets at your expense by a valuer or auditor appointed by SSP.</w:t>
       </w:r>
     </w:p>
@@ -10416,7 +10416,6 @@
           <w:sz w:val="20"/>
           <w:szCs w:val="20"/>
         </w:rPr>
-        <w:lastRenderedPageBreak/>
         <w:t xml:space="preserve">Ranking of Liabilities: Ensure that your liabilities under this Letter of Offer and the related legal and/or security documents will </w:t>
       </w:r>
       <w:proofErr w:type="gramStart"/>
@@ -10766,7 +10765,6 @@
           <w:sz w:val="20"/>
           <w:szCs w:val="20"/>
         </w:rPr>
-        <w:lastRenderedPageBreak/>
         <w:t>Financial Assistance to Related Entities: Lend money or provide financing to your holding company, related corporations, or any other entities, except for normal trade guarantees or temporary financing in the ordinary course of business.</w:t>
       </w:r>
     </w:p>
@@ -10827,6 +10825,7 @@
           <w:sz w:val="20"/>
           <w:szCs w:val="20"/>
         </w:rPr>
+        <w:lastRenderedPageBreak/>
         <w:t xml:space="preserve">Change of Business Nature: Change the nature of your current business or dispose of a substantial part of your assets or </w:t>
       </w:r>
       <w:proofErr w:type="gramStart"/>
@@ -11204,6 +11203,7 @@
           <w:sz w:val="20"/>
           <w:szCs w:val="20"/>
         </w:rPr>
+        <w:lastRenderedPageBreak/>
         <w:t>Incapacity or Insolvency: You, your guarantor, or any security party dies, becomes insane, is adjudicated bankrupt, is wound up, or any step is taken to wind up, liquidate, or dissolve you, your guarantor, or any Security Party.</w:t>
       </w:r>
     </w:p>
@@ -11396,7 +11396,6 @@
           <w:sz w:val="20"/>
           <w:szCs w:val="20"/>
         </w:rPr>
-        <w:lastRenderedPageBreak/>
         <w:t xml:space="preserve">Security in Jeopardy: SSP reasonably believes that the security held in its </w:t>
       </w:r>
       <w:proofErr w:type="spellStart"/>
@@ -11701,15 +11700,7 @@
           <w:sz w:val="20"/>
           <w:szCs w:val="20"/>
         </w:rPr>
-        <w:t xml:space="preserve">Failure to Satisfy Judgment: You or your guarantor or any security party fails to satisfy any judgment rendered against them by a court of competent jurisdiction, and no appeal is made within the prescribed time or such appeal is dismissed. In the case of a judgment obtained in default of </w:t>
-      </w:r>
-      <w:r>
-        <w:rPr>
-          <w:sz w:val="20"/>
-          <w:szCs w:val="20"/>
-        </w:rPr>
-        <w:lastRenderedPageBreak/>
-        <w:t>appearance, no application to set aside such judgment is made within thirty (30) days of the date of becoming aware of the judgment.</w:t>
+        <w:t>Failure to Satisfy Judgment: You or your guarantor or any security party fails to satisfy any judgment rendered against them by a court of competent jurisdiction, and no appeal is made within the prescribed time or such appeal is dismissed. In the case of a judgment obtained in default of appearance, no application to set aside such judgment is made within thirty (30) days of the date of becoming aware of the judgment.</w:t>
       </w:r>
     </w:p>
     <w:p>
@@ -11805,6 +11796,7 @@
           <w:sz w:val="20"/>
           <w:szCs w:val="20"/>
         </w:rPr>
+        <w:lastRenderedPageBreak/>
         <w:t>Appointment of Insolvency Professional: A manager, trustee, nominee, supervisor, judicial manager, custodian, liquidator (provisional or otherwise), receiver, or similar person is appointed in respect of all or part of your business or assets or that of your guarantor or any Security Party.</w:t>
       </w:r>
     </w:p>
@@ -12067,100 +12059,108 @@
           <w:szCs w:val="20"/>
           <w:lang w:val="en-US"/>
         </w:rPr>
+        <w:t>COSTS, EXPENSES, AND FEES</w:t>
+      </w:r>
+    </w:p>
+    <w:p>
+      <w:pPr>
+        <w:pStyle w:val="NoSpacing"/>
+        <w:spacing w:line="360" w:lineRule="auto"/>
+        <w:jc w:val="both"/>
+        <w:rPr>
+          <w:sz w:val="20"/>
+          <w:szCs w:val="20"/>
+          <w:lang w:val="en-US"/>
+        </w:rPr>
+      </w:pPr>
+    </w:p>
+    <w:p>
+      <w:pPr>
+        <w:pStyle w:val="NoSpacing"/>
+        <w:spacing w:line="360" w:lineRule="auto"/>
+        <w:jc w:val="both"/>
+        <w:rPr>
+          <w:sz w:val="20"/>
+          <w:szCs w:val="20"/>
+          <w:lang w:val="en-US"/>
+        </w:rPr>
+      </w:pPr>
+      <w:r>
+        <w:rPr>
+          <w:sz w:val="20"/>
+          <w:szCs w:val="20"/>
+          <w:lang w:val="en-US"/>
+        </w:rPr>
+        <w:t>You shall be responsible for and bear all costs and expenses incurred by SSP, including but not limited to legal fees (on a solicitor and client basis), stamp duty, incidental fees, valuation fees (if applicable), and any other charges arising in connection with the preparation of all documentation, the perfection of SSP’s security, and the discharge of such security.</w:t>
+      </w:r>
+    </w:p>
+    <w:p>
+      <w:pPr>
+        <w:pStyle w:val="NoSpacing"/>
+        <w:spacing w:line="360" w:lineRule="auto"/>
+        <w:jc w:val="both"/>
+        <w:rPr>
+          <w:sz w:val="20"/>
+          <w:szCs w:val="20"/>
+          <w:lang w:val="en-US"/>
+        </w:rPr>
+      </w:pPr>
+    </w:p>
+    <w:p>
+      <w:pPr>
+        <w:pStyle w:val="NoSpacing"/>
+        <w:spacing w:line="360" w:lineRule="auto"/>
+        <w:jc w:val="both"/>
+        <w:rPr>
+          <w:sz w:val="20"/>
+          <w:szCs w:val="20"/>
+          <w:lang w:val="en-US"/>
+        </w:rPr>
+      </w:pPr>
+      <w:proofErr w:type="gramStart"/>
+      <w:r>
+        <w:rPr>
+          <w:sz w:val="20"/>
+          <w:szCs w:val="20"/>
+          <w:lang w:val="en-US"/>
+        </w:rPr>
+        <w:t>In the event that</w:t>
+      </w:r>
+      <w:proofErr w:type="gramEnd"/>
+      <w:r>
+        <w:rPr>
+          <w:sz w:val="20"/>
+          <w:szCs w:val="20"/>
+          <w:lang w:val="en-US"/>
+        </w:rPr>
+        <w:t>, after accepting this Letter of Offer, you fail for any reason whatsoever to proceed with the facility(</w:t>
+      </w:r>
+      <w:proofErr w:type="spellStart"/>
+      <w:r>
+        <w:rPr>
+          <w:sz w:val="20"/>
+          <w:szCs w:val="20"/>
+          <w:lang w:val="en-US"/>
+        </w:rPr>
+        <w:t>ies</w:t>
+      </w:r>
+      <w:proofErr w:type="spellEnd"/>
+      <w:r>
+        <w:rPr>
+          <w:sz w:val="20"/>
+          <w:szCs w:val="20"/>
+          <w:lang w:val="en-US"/>
+        </w:rPr>
+        <w:t xml:space="preserve">), you shall bear all costs and expenses incurred by SSP, including any fees charged by solicitors </w:t>
+      </w:r>
+      <w:r>
+        <w:rPr>
+          <w:sz w:val="20"/>
+          <w:szCs w:val="20"/>
+          <w:lang w:val="en-US"/>
+        </w:rPr>
         <w:lastRenderedPageBreak/>
-        <w:t>COSTS, EXPENSES, AND FEES</w:t>
-      </w:r>
-    </w:p>
-    <w:p>
-      <w:pPr>
-        <w:pStyle w:val="NoSpacing"/>
-        <w:spacing w:line="360" w:lineRule="auto"/>
-        <w:jc w:val="both"/>
-        <w:rPr>
-          <w:sz w:val="20"/>
-          <w:szCs w:val="20"/>
-          <w:lang w:val="en-US"/>
-        </w:rPr>
-      </w:pPr>
-    </w:p>
-    <w:p>
-      <w:pPr>
-        <w:pStyle w:val="NoSpacing"/>
-        <w:spacing w:line="360" w:lineRule="auto"/>
-        <w:jc w:val="both"/>
-        <w:rPr>
-          <w:sz w:val="20"/>
-          <w:szCs w:val="20"/>
-          <w:lang w:val="en-US"/>
-        </w:rPr>
-      </w:pPr>
-      <w:r>
-        <w:rPr>
-          <w:sz w:val="20"/>
-          <w:szCs w:val="20"/>
-          <w:lang w:val="en-US"/>
-        </w:rPr>
-        <w:t>You shall be responsible for and bear all costs and expenses incurred by SSP, including but not limited to legal fees (on a solicitor and client basis), stamp duty, incidental fees, valuation fees (if applicable), and any other charges arising in connection with the preparation of all documentation, the perfection of SSP’s security, and the discharge of such security.</w:t>
-      </w:r>
-    </w:p>
-    <w:p>
-      <w:pPr>
-        <w:pStyle w:val="NoSpacing"/>
-        <w:spacing w:line="360" w:lineRule="auto"/>
-        <w:jc w:val="both"/>
-        <w:rPr>
-          <w:sz w:val="20"/>
-          <w:szCs w:val="20"/>
-          <w:lang w:val="en-US"/>
-        </w:rPr>
-      </w:pPr>
-    </w:p>
-    <w:p>
-      <w:pPr>
-        <w:pStyle w:val="NoSpacing"/>
-        <w:spacing w:line="360" w:lineRule="auto"/>
-        <w:jc w:val="both"/>
-        <w:rPr>
-          <w:sz w:val="20"/>
-          <w:szCs w:val="20"/>
-          <w:lang w:val="en-US"/>
-        </w:rPr>
-      </w:pPr>
-      <w:proofErr w:type="gramStart"/>
-      <w:r>
-        <w:rPr>
-          <w:sz w:val="20"/>
-          <w:szCs w:val="20"/>
-          <w:lang w:val="en-US"/>
-        </w:rPr>
-        <w:t>In the event that</w:t>
-      </w:r>
-      <w:proofErr w:type="gramEnd"/>
-      <w:r>
-        <w:rPr>
-          <w:sz w:val="20"/>
-          <w:szCs w:val="20"/>
-          <w:lang w:val="en-US"/>
-        </w:rPr>
-        <w:t>, after accepting this Letter of Offer, you fail for any reason whatsoever to proceed with the facility(</w:t>
-      </w:r>
-      <w:proofErr w:type="spellStart"/>
-      <w:r>
-        <w:rPr>
-          <w:sz w:val="20"/>
-          <w:szCs w:val="20"/>
-          <w:lang w:val="en-US"/>
-        </w:rPr>
-        <w:t>ies</w:t>
-      </w:r>
-      <w:proofErr w:type="spellEnd"/>
-      <w:r>
-        <w:rPr>
-          <w:sz w:val="20"/>
-          <w:szCs w:val="20"/>
-          <w:lang w:val="en-US"/>
-        </w:rPr>
-        <w:t>), you shall bear all costs and expenses incurred by SSP, including any fees charged by solicitors instructed by SSP. You shall also be liable to pay all fees and expenses, including SSP’s legal fees, if any sums owed by you are required to be recovered through legal proceedings or by SSP’s solicitors.</w:t>
+        <w:t>instructed by SSP. You shall also be liable to pay all fees and expenses, including SSP’s legal fees, if any sums owed by you are required to be recovered through legal proceedings or by SSP’s solicitors.</w:t>
       </w:r>
     </w:p>
     <w:p>
@@ -12525,7 +12525,6 @@
           <w:szCs w:val="20"/>
           <w:lang w:val="en-US"/>
         </w:rPr>
-        <w:lastRenderedPageBreak/>
         <w:t>At your election, by notice to SSP, SSP and/or Investors' obligation to fund any further utilization shall terminate, and the facility(</w:t>
       </w:r>
       <w:proofErr w:type="spellStart"/>
@@ -13244,6 +13243,7 @@
           <w:szCs w:val="20"/>
           <w:lang w:val="en-US"/>
         </w:rPr>
+        <w:lastRenderedPageBreak/>
         <w:t>Any taxes, levies, duties, or government charges, whether currently in force or imposed hereafter by any applicable law or regulation in connection with this facility(</w:t>
       </w:r>
       <w:proofErr w:type="spellStart"/>
@@ -13535,7 +13535,16 @@
           <w:szCs w:val="20"/>
           <w:lang w:val="en-US"/>
         </w:rPr>
-        <w:t>), your business, and your account(s) with SSP  (including any future accounts), to SSP’s subsidiaries, any company that is or may in the future become a related company to SSP, any Investor or the Investor’s head offices, representative and branch offices, and/or any related or associated company of the Investors in any jurisdiction, agents, auditors, legal counsels, insurers, professional advisors, or representatives, the Central Credit Unit, or any other banking or regulatory authorities. This disclosure may also include any co-debtor, joint account holder, guarantor, charger, surety, security party, any party making a claim under a third-party payment instrument or trade document, or any other person who has undertaken liability for the facility(</w:t>
+        <w:t xml:space="preserve">), your business, and your account(s) with SSP  (including any future accounts), to SSP’s subsidiaries, any company that is or may in the future become a related company to SSP, any Investor or the Investor’s head offices, representative and branch offices, and/or any related or associated company of the Investors in any jurisdiction, agents, auditors, legal counsels, insurers, professional advisors, or representatives, the Central Credit Unit, or any other banking or regulatory authorities. This disclosure may also include any co-debtor, joint account holder, guarantor, charger, surety, security party, any party making a claim under a third-party payment instrument or trade document, or any other person who has </w:t>
+      </w:r>
+      <w:r>
+        <w:rPr>
+          <w:sz w:val="20"/>
+          <w:szCs w:val="20"/>
+          <w:lang w:val="en-US"/>
+        </w:rPr>
+        <w:lastRenderedPageBreak/>
+        <w:t>undertaken liability for the facility(</w:t>
       </w:r>
       <w:proofErr w:type="spellStart"/>
       <w:r>
@@ -13760,7 +13769,6 @@
           <w:szCs w:val="20"/>
           <w:lang w:val="en-US"/>
         </w:rPr>
-        <w:lastRenderedPageBreak/>
         <w:t>VARIATION</w:t>
       </w:r>
     </w:p>
@@ -14252,7 +14260,6 @@
           <w:szCs w:val="20"/>
           <w:lang w:val="en-US"/>
         </w:rPr>
-        <w:lastRenderedPageBreak/>
         <w:t>Sending an email notification to you from SSP, indicating the variation and its effective date.</w:t>
       </w:r>
     </w:p>
@@ -14481,7 +14488,16 @@
           <w:szCs w:val="20"/>
           <w:lang w:val="en-US"/>
         </w:rPr>
-        <w:t>) or any part thereof, even if the facility or security documentation has been completed. This may occur upon the SSP’s assessment that any event has occurred which, in the SSP’s opinion, may adversely affect your financial position, hinder the conduct of your business operations in accordance with sound financial and commercial practices, or jeopardize SSP’s security position. SSP’s decision regarding this matter will be final and conclusive.</w:t>
+        <w:t xml:space="preserve">) or any part thereof, even if the facility or security documentation has been completed. This may occur upon the SSP’s assessment that any event has occurred which, in the SSP’s opinion, may </w:t>
+      </w:r>
+      <w:r>
+        <w:rPr>
+          <w:sz w:val="20"/>
+          <w:szCs w:val="20"/>
+          <w:lang w:val="en-US"/>
+        </w:rPr>
+        <w:lastRenderedPageBreak/>
+        <w:t>adversely affect your financial position, hinder the conduct of your business operations in accordance with sound financial and commercial practices, or jeopardize SSP’s security position. SSP’s decision regarding this matter will be final and conclusive.</w:t>
       </w:r>
     </w:p>
     <w:p>
@@ -14838,7 +14854,16 @@
           <w:szCs w:val="20"/>
           <w:lang w:val="en-US"/>
         </w:rPr>
-        <w:t>In the event that any indebtedness incurred by the Issuer, the Issuer’s security party, or any entity within the Issuer’s group of companies, including the Issuer’s parent company and/or subsidiaries, becomes due or is capable of being declared due prior to its stated maturity, or if any guarantee provided by the Issuer, the Issuer’s security party, or any entity within the Issuer’s group, including the Issuer’s parent company and/or subsidiaries, is not discharged at maturity or when called upon, or if the Issuer, the Issuer’s security party, or any entity within the Issuer’s group, including the Issuer’s parent company and/or subsidiaries, defaults under or breaches any agreement or instrument pertaining to such indebtedness or guarantee, then, in such circumstances, the facility(</w:t>
+        <w:t xml:space="preserve">In the event that any indebtedness incurred by the Issuer, the Issuer’s security party, or any entity within the Issuer’s group of companies, including the Issuer’s parent company and/or subsidiaries, becomes due or is capable of being declared due prior to its stated maturity, or if any guarantee provided by the Issuer, the Issuer’s security party, or any entity within the Issuer’s group, including </w:t>
+      </w:r>
+      <w:r>
+        <w:rPr>
+          <w:sz w:val="20"/>
+          <w:szCs w:val="20"/>
+          <w:lang w:val="en-US"/>
+        </w:rPr>
+        <w:lastRenderedPageBreak/>
+        <w:t>the Issuer’s parent company and/or subsidiaries, is not discharged at maturity or when called upon, or if the Issuer, the Issuer’s security party, or any entity within the Issuer’s group, including the Issuer’s parent company and/or subsidiaries, defaults under or breaches any agreement or instrument pertaining to such indebtedness or guarantee, then, in such circumstances, the facility(</w:t>
       </w:r>
       <w:proofErr w:type="spellStart"/>
       <w:r>
@@ -15157,6 +15182,7 @@
           <w:szCs w:val="20"/>
           <w:lang w:val="en-US"/>
         </w:rPr>
+        <w:lastRenderedPageBreak/>
         <w:t>Any notice or communication may be given in writing and delivered personally, sent by post to the address provided herein, transmitted electronically, through our website, or by any other means designated by SSP from time to time. Proof of posting or dispatch shall be deemed proof of receipt as follows:</w:t>
       </w:r>
     </w:p>
@@ -15543,6 +15569,7 @@
           <w:szCs w:val="20"/>
           <w:lang w:val="en-US"/>
         </w:rPr>
+        <w:lastRenderedPageBreak/>
         <w:t>STRATEGIC TRADE ACT 2010</w:t>
       </w:r>
     </w:p>
@@ -15974,6 +16001,7 @@
           <w:szCs w:val="20"/>
           <w:lang w:val="en-US"/>
         </w:rPr>
+        <w:lastRenderedPageBreak/>
         <w:t>Conceal, disguise, or obstruct the identification of the true nature, origin, location, movement, disposition, ownership, or rights pertaining to proceeds of unlawful activity.</w:t>
       </w:r>
     </w:p>
@@ -16122,7 +16150,6 @@
           <w:szCs w:val="20"/>
           <w:lang w:val="en-US"/>
         </w:rPr>
-        <w:lastRenderedPageBreak/>
         <w:t>DECLARATION FOR PURPOSES OF COMPLIANCE WITH THE FOREIGN ACCOUNT TAX COMPLIANCE ACT (“FATCA”) AND THE COMMON REPORTING STANDARDS REQUIRED BY THE ORGANISATION FOR ECONOMIC CO-OPERATION AND DEVELOPMENT (“CRS”)</w:t>
       </w:r>
     </w:p>
@@ -16971,7 +16998,6 @@
           <w:szCs w:val="20"/>
           <w:lang w:val="en-US"/>
         </w:rPr>
-        <w:lastRenderedPageBreak/>
         <w:t>In the event of default by the Issuer, SSP shall have the right to immediately enforce its rights under the security documents to recover all sums owing under the security documents.</w:t>
       </w:r>
     </w:p>
@@ -17206,6 +17232,7 @@
           <w:szCs w:val="20"/>
           <w:lang w:val="en-US"/>
         </w:rPr>
+        <w:lastRenderedPageBreak/>
         <w:t xml:space="preserve">PROVIDED ALWAYS that in the event SSP deems the proceeds insufficient to satisfy all amounts due, SSP may, in accordance with Shariah principles, apply such proceeds towards the outstanding principal amount in priority to the profit or return. Any such application shall not prejudice the Issuer’s entitlement to receive the full amount that would otherwise have been payable had the primary order of application been followed, or such lesser amount as the proceeds may be sufficient to satisfy. </w:t>
       </w:r>
     </w:p>
@@ -17278,16 +17305,7 @@
           <w:szCs w:val="20"/>
           <w:lang w:val="en-US"/>
         </w:rPr>
-        <w:t xml:space="preserve">Notwithstanding the foregoing provisions of Clause E, the Issuer expressly agrees that if the proceeds realized by SSP from the security documents, after deducting applicable fees, costs, taxes, and other outgoings, are less than the amount due to the SSP and/or Investors, the Issuer shall, upon demand, pay the difference. The Issuer shall also be liable for all costs </w:t>
-      </w:r>
-      <w:r>
-        <w:rPr>
-          <w:sz w:val="20"/>
-          <w:szCs w:val="20"/>
-          <w:lang w:val="en-US"/>
-        </w:rPr>
-        <w:lastRenderedPageBreak/>
-        <w:t>incurred by SSP and/or Investors, as determined by SSP (whose determination shall be conclusive and binding, save for manifest error), including interest incurred by SSP and/or Investors in relation to funds borrowed or deposits made to cover such deficiency, calculated up to the date of payment, both before and after judgment.</w:t>
+        <w:t>Notwithstanding the foregoing provisions of Clause E, the Issuer expressly agrees that if the proceeds realized by SSP from the security documents, after deducting applicable fees, costs, taxes, and other outgoings, are less than the amount due to the SSP and/or Investors, the Issuer shall, upon demand, pay the difference. The Issuer shall also be liable for all costs incurred by SSP and/or Investors, as determined by SSP (whose determination shall be conclusive and binding, save for manifest error), including interest incurred by SSP and/or Investors in relation to funds borrowed or deposits made to cover such deficiency, calculated up to the date of payment, both before and after judgment.</w:t>
       </w:r>
     </w:p>
     <w:p>
@@ -17669,6 +17687,20 @@
             <w:szCs w:val="18"/>
           </w:rPr>
         </w:pPr>
+        <w:r>
+          <w:rPr>
+            <w:sz w:val="18"/>
+            <w:szCs w:val="18"/>
+          </w:rPr>
+          <w:tab/>
+        </w:r>
+        <w:r>
+          <w:rPr>
+            <w:sz w:val="18"/>
+            <w:szCs w:val="18"/>
+          </w:rPr>
+          <w:tab/>
+        </w:r>
         <w:r>
           <w:rPr>
             <w:sz w:val="18"/>
@@ -25136,6 +25168,10 @@
 </file>
 
 <file path=customXml/item1.xml><?xml version="1.0" encoding="utf-8"?>
+<b:Sources xmlns:b="http://schemas.openxmlformats.org/officeDocument/2006/bibliography" xmlns="http://schemas.openxmlformats.org/officeDocument/2006/bibliography" SelectedStyle="\APASixthEditionOfficeOnline.xsl" StyleName="APA" Version="6"/>
+</file>
+
+<file path=customXml/item2.xml><?xml version="1.0" encoding="utf-8"?>
 <p:properties xmlns:p="http://schemas.microsoft.com/office/2006/metadata/properties" xmlns:xsi="http://www.w3.org/2001/XMLSchema-instance" xmlns:pc="http://schemas.microsoft.com/office/infopath/2007/PartnerControls">
   <documentManagement>
     <_Flow_SignoffStatus xmlns="a0846abc-da76-433d-b89e-11ed84fbaeb3" xsi:nil="true"/>
@@ -25147,20 +25183,7 @@
 </p:properties>
 </file>
 
-<file path=customXml/item2.xml><?xml version="1.0" encoding="utf-8"?>
-<b:Sources xmlns:b="http://schemas.openxmlformats.org/officeDocument/2006/bibliography" xmlns="http://schemas.openxmlformats.org/officeDocument/2006/bibliography" SelectedStyle="\APASixthEditionOfficeOnline.xsl" StyleName="APA" Version="6"/>
-</file>
-
 <file path=customXml/item3.xml><?xml version="1.0" encoding="utf-8"?>
-<?mso-contentType ?>
-<FormTemplates xmlns="http://schemas.microsoft.com/sharepoint/v3/contenttype/forms">
-  <Display>DocumentLibraryForm</Display>
-  <Edit>DocumentLibraryForm</Edit>
-  <New>DocumentLibraryForm</New>
-</FormTemplates>
-</file>
-
-<file path=customXml/item4.xml><?xml version="1.0" encoding="utf-8"?>
 <ct:contentTypeSchema xmlns:ct="http://schemas.microsoft.com/office/2006/metadata/contentType" xmlns:ma="http://schemas.microsoft.com/office/2006/metadata/properties/metaAttributes" ct:_="" ma:_="" ma:contentTypeName="Document" ma:contentTypeID="0x010100095F958C9057D64E8725F7631168A218" ma:contentTypeVersion="24" ma:contentTypeDescription="Create a new document." ma:contentTypeScope="" ma:versionID="0181d0ef269031616f304220f34fcec3">
   <xsd:schema xmlns:xsd="http://www.w3.org/2001/XMLSchema" xmlns:xs="http://www.w3.org/2001/XMLSchema" xmlns:p="http://schemas.microsoft.com/office/2006/metadata/properties" xmlns:ns2="a0846abc-da76-433d-b89e-11ed84fbaeb3" xmlns:ns3="4b0b2adc-e4a8-4832-bb38-e3a7e820179b" targetNamespace="http://schemas.microsoft.com/office/2006/metadata/properties" ma:root="true" ma:fieldsID="8fea1687251d818162f479617e9b8afa" ns2:_="" ns3:_="">
     <xsd:import namespace="a0846abc-da76-433d-b89e-11ed84fbaeb3"/>
@@ -25427,7 +25450,24 @@
 </ct:contentTypeSchema>
 </file>
 
+<file path=customXml/item4.xml><?xml version="1.0" encoding="utf-8"?>
+<?mso-contentType ?>
+<FormTemplates xmlns="http://schemas.microsoft.com/sharepoint/v3/contenttype/forms">
+  <Display>DocumentLibraryForm</Display>
+  <Edit>DocumentLibraryForm</Edit>
+  <New>DocumentLibraryForm</New>
+</FormTemplates>
+</file>
+
 <file path=customXml/itemProps1.xml><?xml version="1.0" encoding="utf-8"?>
+<ds:datastoreItem xmlns:ds="http://schemas.openxmlformats.org/officeDocument/2006/customXml" ds:itemID="{31A8F991-F2C3-4A98-93A0-9F15F02E83A7}">
+  <ds:schemaRefs>
+    <ds:schemaRef ds:uri="http://schemas.openxmlformats.org/officeDocument/2006/bibliography"/>
+  </ds:schemaRefs>
+</ds:datastoreItem>
+</file>
+
+<file path=customXml/itemProps2.xml><?xml version="1.0" encoding="utf-8"?>
 <ds:datastoreItem xmlns:ds="http://schemas.openxmlformats.org/officeDocument/2006/customXml" ds:itemID="{06AF3FC3-CD02-49E6-93A5-73EE653BBDCC}">
   <ds:schemaRefs>
     <ds:schemaRef ds:uri="http://schemas.microsoft.com/office/2006/metadata/properties"/>
@@ -25438,23 +25478,7 @@
 </ds:datastoreItem>
 </file>
 
-<file path=customXml/itemProps2.xml><?xml version="1.0" encoding="utf-8"?>
-<ds:datastoreItem xmlns:ds="http://schemas.openxmlformats.org/officeDocument/2006/customXml" ds:itemID="{31A8F991-F2C3-4A98-93A0-9F15F02E83A7}">
-  <ds:schemaRefs>
-    <ds:schemaRef ds:uri="http://schemas.openxmlformats.org/officeDocument/2006/bibliography"/>
-  </ds:schemaRefs>
-</ds:datastoreItem>
-</file>
-
 <file path=customXml/itemProps3.xml><?xml version="1.0" encoding="utf-8"?>
-<ds:datastoreItem xmlns:ds="http://schemas.openxmlformats.org/officeDocument/2006/customXml" ds:itemID="{B3B23335-743F-4ECA-B591-0D88F7E33FD2}">
-  <ds:schemaRefs>
-    <ds:schemaRef ds:uri="http://schemas.microsoft.com/sharepoint/v3/contenttype/forms"/>
-  </ds:schemaRefs>
-</ds:datastoreItem>
-</file>
-
-<file path=customXml/itemProps4.xml><?xml version="1.0" encoding="utf-8"?>
 <ds:datastoreItem xmlns:ds="http://schemas.openxmlformats.org/officeDocument/2006/customXml" ds:itemID="{F20D8333-D2CC-42A6-B516-87CB1D2A20AC}">
   <ds:schemaRefs>
     <ds:schemaRef ds:uri="http://schemas.microsoft.com/office/2006/metadata/contentType"/>
@@ -25471,4 +25495,12 @@
     <ds:schemaRef ds:uri="http://schemas.microsoft.com/internal/obd"/>
   </ds:schemaRefs>
 </ds:datastoreItem>
+</file>
+
+<file path=customXml/itemProps4.xml><?xml version="1.0" encoding="utf-8"?>
+<ds:datastoreItem xmlns:ds="http://schemas.openxmlformats.org/officeDocument/2006/customXml" ds:itemID="{B3B23335-743F-4ECA-B591-0D88F7E33FD2}">
+  <ds:schemaRefs>
+    <ds:schemaRef ds:uri="http://schemas.microsoft.com/sharepoint/v3/contenttype/forms"/>
+  </ds:schemaRefs>
+</ds:datastoreItem>
 </file>
</xml_diff>